<commit_message>
update sprint backlog y sprint review
</commit_message>
<xml_diff>
--- a/INCREMENTO3/Documentos/Tercer incremento Scrum++.docx
+++ b/INCREMENTO3/Documentos/Tercer incremento Scrum++.docx
@@ -214,8 +214,13 @@
         <w:ind w:firstLine="0"/>
         <w:jc w:val="center"/>
       </w:pPr>
-      <w:r>
-        <w:t>Addán Ignacio Sáez Rodríguez</w:t>
+      <w:proofErr w:type="spellStart"/>
+      <w:r>
+        <w:t>Addán</w:t>
+      </w:r>
+      <w:proofErr w:type="spellEnd"/>
+      <w:r>
+        <w:t xml:space="preserve"> Ignacio Sáez Rodríguez</w:t>
       </w:r>
     </w:p>
     <w:p>
@@ -235,8 +240,13 @@
         <w:jc w:val="center"/>
       </w:pPr>
       <w:r>
-        <w:t>Catalina Vidal Gallardo</w:t>
-      </w:r>
+        <w:t xml:space="preserve">Catalina Vidal </w:t>
+      </w:r>
+      <w:proofErr w:type="spellStart"/>
+      <w:r>
+        <w:t>Gallardo</w:t>
+      </w:r>
+      <w:proofErr w:type="spellEnd"/>
     </w:p>
     <w:p>
       <w:pPr>
@@ -281,7 +291,15 @@
         <w:jc w:val="center"/>
       </w:pPr>
       <w:r>
-        <w:t>Paulo Luis Francisco Quinsacara Jofré</w:t>
+        <w:t xml:space="preserve">Paulo Luis Francisco </w:t>
+      </w:r>
+      <w:proofErr w:type="spellStart"/>
+      <w:r>
+        <w:t>Quinsacara</w:t>
+      </w:r>
+      <w:proofErr w:type="spellEnd"/>
+      <w:r>
+        <w:t xml:space="preserve"> Jofré</w:t>
       </w:r>
     </w:p>
     <w:p>
@@ -10382,7 +10400,15 @@
     <w:p/>
     <w:p>
       <w:r>
-        <w:t>La propuesta de solución para el sistema de gestión de RRHH de EUGCOM se basa en una Arquitectura Cliente-Servidor en Capas, la cual será implementada con un enfoque de Microservicios para el backend. Este modelo arquitectónico se elige por su robustez, su capacidad de escalabilidad independiente de los módulos, su facilidad de mantenimiento y su flexibilidad para integrar futuras funcionalidades, respondiendo directamente a la complejidad y variedad de los requisitos detallados en el documento.</w:t>
+        <w:t xml:space="preserve">La propuesta de solución para el sistema de gestión de RRHH de EUGCOM se basa en una Arquitectura Cliente-Servidor en Capas, la cual será implementada con un enfoque de Microservicios para el </w:t>
+      </w:r>
+      <w:proofErr w:type="spellStart"/>
+      <w:r>
+        <w:t>backend</w:t>
+      </w:r>
+      <w:proofErr w:type="spellEnd"/>
+      <w:r>
+        <w:t>. Este modelo arquitectónico se elige por su robustez, su capacidad de escalabilidad independiente de los módulos, su facilidad de mantenimiento y su flexibilidad para integrar futuras funcionalidades, respondiendo directamente a la complejidad y variedad de los requisitos detallados en el documento.</w:t>
       </w:r>
     </w:p>
     <w:p/>
@@ -10391,10 +10417,23 @@
         <w:t>La persistencia de datos se gestionará mediante una base de datos utilizando el gestor de base de datos MySQL</w:t>
       </w:r>
       <w:r>
-        <w:t>/MariaDB</w:t>
-      </w:r>
-      <w:r>
-        <w:t>, que almacenará toda la información crítica del sistema. El backend se desarrollará principalmente en PHP</w:t>
+        <w:t>/</w:t>
+      </w:r>
+      <w:proofErr w:type="spellStart"/>
+      <w:r>
+        <w:t>MariaDB</w:t>
+      </w:r>
+      <w:proofErr w:type="spellEnd"/>
+      <w:r>
+        <w:t xml:space="preserve">, que almacenará toda la información crítica del sistema. El </w:t>
+      </w:r>
+      <w:proofErr w:type="spellStart"/>
+      <w:r>
+        <w:t>backend</w:t>
+      </w:r>
+      <w:proofErr w:type="spellEnd"/>
+      <w:r>
+        <w:t xml:space="preserve"> se desarrollará principalmente en PHP</w:t>
       </w:r>
       <w:r>
         <w:t xml:space="preserve"> versión 7.4</w:t>
@@ -10412,7 +10451,15 @@
     <w:p/>
     <w:p>
       <w:r>
-        <w:t xml:space="preserve">La interfaz gráfica de usuario (Frontend) será una aplicación web interactiva, desarrollada con JavaScript, HTML y CSS. JavaScript se encargará de la lógica de presentación y de las interacciones dinámicas. HTML estructurará el contenido de la página, y CSS se utilizará para el diseño y estilo visual. Se integrará la librería Bootstrap para asegurar un diseño responsivo, </w:t>
+        <w:t>La interfaz gráfica de usuario (</w:t>
+      </w:r>
+      <w:proofErr w:type="spellStart"/>
+      <w:r>
+        <w:t>Frontend</w:t>
+      </w:r>
+      <w:proofErr w:type="spellEnd"/>
+      <w:r>
+        <w:t xml:space="preserve">) será una aplicación web interactiva, desarrollada con JavaScript, HTML y CSS. JavaScript se encargará de la lógica de presentación y de las interacciones dinámicas. HTML estructurará el contenido de la página, y CSS se utilizará para el diseño y estilo visual. Se integrará la librería Bootstrap para asegurar un diseño responsivo, </w:t>
       </w:r>
       <w:r>
         <w:lastRenderedPageBreak/>
@@ -11053,7 +11100,15 @@
         <w:t xml:space="preserve">En la tabla 3.1 se ha </w:t>
       </w:r>
       <w:r>
-        <w:t>establecido y mantenido un Product Backlog que contiene los requerimientos priorizados del sistema</w:t>
+        <w:t xml:space="preserve">establecido y mantenido un </w:t>
+      </w:r>
+      <w:proofErr w:type="spellStart"/>
+      <w:r>
+        <w:t>Product</w:t>
+      </w:r>
+      <w:proofErr w:type="spellEnd"/>
+      <w:r>
+        <w:t xml:space="preserve"> Backlog que contiene los requerimientos priorizados del sistema</w:t>
       </w:r>
       <w:r>
         <w:t>, u</w:t>
@@ -11067,12 +11122,14 @@
       <w:r>
         <w:t xml:space="preserve">. Este backlog es fundamental para la planificación de los </w:t>
       </w:r>
+      <w:proofErr w:type="spellStart"/>
       <w:r>
         <w:t>Sprint</w:t>
       </w:r>
       <w:r>
         <w:t>s</w:t>
       </w:r>
+      <w:proofErr w:type="spellEnd"/>
       <w:r>
         <w:t>.</w:t>
       </w:r>
@@ -11117,6 +11174,7 @@
       <w:r>
         <w:t xml:space="preserve"> </w:t>
       </w:r>
+      <w:proofErr w:type="spellStart"/>
       <w:r>
         <w:rPr>
           <w:u w:val="single"/>
@@ -11129,6 +11187,7 @@
         </w:rPr>
         <w:t>roduct</w:t>
       </w:r>
+      <w:proofErr w:type="spellEnd"/>
       <w:r>
         <w:t xml:space="preserve"> backlog</w:t>
       </w:r>
@@ -12053,6 +12112,51 @@
       <w:bookmarkEnd w:id="50"/>
       <w:bookmarkEnd w:id="51"/>
     </w:p>
+    <w:p>
+      <w:pPr>
+        <w:pStyle w:val="Sinespaciado"/>
+      </w:pPr>
+      <w:r>
+        <w:rPr>
+          <w:noProof/>
+        </w:rPr>
+        <w:drawing>
+          <wp:inline distT="0" distB="0" distL="0" distR="0" wp14:anchorId="53DBA01E" wp14:editId="019F70A7">
+            <wp:extent cx="5970478" cy="1514246"/>
+            <wp:effectExtent l="0" t="0" r="0" b="0"/>
+            <wp:docPr id="1561265243" name="Imagen 1" descr="Interfaz de usuario gráfica, Tabla&#10;&#10;El contenido generado por IA puede ser incorrecto."/>
+            <wp:cNvGraphicFramePr>
+              <a:graphicFrameLocks xmlns:a="http://schemas.openxmlformats.org/drawingml/2006/main" noChangeAspect="1"/>
+            </wp:cNvGraphicFramePr>
+            <a:graphic xmlns:a="http://schemas.openxmlformats.org/drawingml/2006/main">
+              <a:graphicData uri="http://schemas.openxmlformats.org/drawingml/2006/picture">
+                <pic:pic xmlns:pic="http://schemas.openxmlformats.org/drawingml/2006/picture">
+                  <pic:nvPicPr>
+                    <pic:cNvPr id="1561265243" name="Imagen 1" descr="Interfaz de usuario gráfica, Tabla&#10;&#10;El contenido generado por IA puede ser incorrecto."/>
+                    <pic:cNvPicPr/>
+                  </pic:nvPicPr>
+                  <pic:blipFill>
+                    <a:blip r:embed="rId13"/>
+                    <a:stretch>
+                      <a:fillRect/>
+                    </a:stretch>
+                  </pic:blipFill>
+                  <pic:spPr>
+                    <a:xfrm>
+                      <a:off x="0" y="0"/>
+                      <a:ext cx="5983556" cy="1517563"/>
+                    </a:xfrm>
+                    <a:prstGeom prst="rect">
+                      <a:avLst/>
+                    </a:prstGeom>
+                  </pic:spPr>
+                </pic:pic>
+              </a:graphicData>
+            </a:graphic>
+          </wp:inline>
+        </w:drawing>
+      </w:r>
+    </w:p>
     <w:p/>
     <w:p/>
     <w:p>
@@ -12076,6 +12180,7 @@
     <w:p/>
     <w:p>
       <w:r>
+        <w:lastRenderedPageBreak/>
         <w:t>La vista externa presenta los</w:t>
       </w:r>
       <w:r>
@@ -12094,7 +12199,6 @@
     <w:p/>
     <w:p>
       <w:r>
-        <w:lastRenderedPageBreak/>
         <w:t xml:space="preserve">En la </w:t>
       </w:r>
       <w:r>
@@ -12171,7 +12275,7 @@
                     <pic:cNvPicPr preferRelativeResize="0"/>
                   </pic:nvPicPr>
                   <pic:blipFill>
-                    <a:blip r:embed="rId13"/>
+                    <a:blip r:embed="rId14"/>
                     <a:srcRect/>
                     <a:stretch>
                       <a:fillRect/>
@@ -12215,7 +12319,6 @@
     </w:p>
     <w:p>
       <w:r>
-        <w:lastRenderedPageBreak/>
         <w:t xml:space="preserve">En la </w:t>
       </w:r>
       <w:r>
@@ -12293,7 +12396,7 @@
                     <pic:cNvPicPr/>
                   </pic:nvPicPr>
                   <pic:blipFill>
-                    <a:blip r:embed="rId14"/>
+                    <a:blip r:embed="rId15"/>
                     <a:stretch>
                       <a:fillRect/>
                     </a:stretch>
@@ -12330,7 +12433,6 @@
     <w:p/>
     <w:p>
       <w:r>
-        <w:lastRenderedPageBreak/>
         <w:t xml:space="preserve">En la </w:t>
       </w:r>
       <w:r>
@@ -12407,7 +12509,7 @@
                     <pic:cNvPicPr preferRelativeResize="0"/>
                   </pic:nvPicPr>
                   <pic:blipFill>
-                    <a:blip r:embed="rId15"/>
+                    <a:blip r:embed="rId16"/>
                     <a:srcRect/>
                     <a:stretch>
                       <a:fillRect/>
@@ -12445,7 +12547,6 @@
     <w:p/>
     <w:p>
       <w:r>
-        <w:lastRenderedPageBreak/>
         <w:t xml:space="preserve">En la </w:t>
       </w:r>
       <w:r>
@@ -12517,7 +12618,7 @@
                     <pic:cNvPicPr preferRelativeResize="0"/>
                   </pic:nvPicPr>
                   <pic:blipFill>
-                    <a:blip r:embed="rId16"/>
+                    <a:blip r:embed="rId17"/>
                     <a:srcRect/>
                     <a:stretch>
                       <a:fillRect/>
@@ -12728,7 +12829,7 @@
                     <pic:cNvPicPr/>
                   </pic:nvPicPr>
                   <pic:blipFill>
-                    <a:blip r:embed="rId17"/>
+                    <a:blip r:embed="rId18"/>
                     <a:stretch>
                       <a:fillRect/>
                     </a:stretch>
@@ -12884,7 +12985,7 @@
                     <pic:cNvPicPr/>
                   </pic:nvPicPr>
                   <pic:blipFill>
-                    <a:blip r:embed="rId18"/>
+                    <a:blip r:embed="rId19"/>
                     <a:stretch>
                       <a:fillRect/>
                     </a:stretch>
@@ -12938,7 +13039,15 @@
         <w:t xml:space="preserve"> y sincronización de</w:t>
       </w:r>
       <w:r>
-        <w:t>l diseño del sistema web EugCom.</w:t>
+        <w:t xml:space="preserve">l diseño del sistema web </w:t>
+      </w:r>
+      <w:proofErr w:type="spellStart"/>
+      <w:r>
+        <w:t>EugCom</w:t>
+      </w:r>
+      <w:proofErr w:type="spellEnd"/>
+      <w:r>
+        <w:t>.</w:t>
       </w:r>
     </w:p>
     <w:p/>
@@ -12982,7 +13091,95 @@
         <w:t xml:space="preserve">En la figura 5.3 </w:t>
       </w:r>
       <w:r>
-        <w:t>se observa el diagrama de secuencia de caso de uso N°5.6, Imprimiendo informe de asistencia, muestra al Usuario que, tras iniciar sesión (1), navega al dashboard y solicita el menú del header (2–3); la vista V_header se carga y, desde la pestaña de informe de asistencia (5–6), el usuario pide el reporte a C_informe_de_asistencia, el cual consulta a C_mySQL (7–8) y recibe las marcas (9–10) para cargar la interfaz con datos (11). Luego el sistema muestra la interfaz del informe (12) y el actor elige las marcas a incluir (13), confirma (14) y presiona Imprimir (15). La capa de control solicita la impresión (16), se muestra la vista previa (17) y finalmente el sistema realiza la impresión (18). Intervienen vistas (V_dashboard, V_header, V_informe_de_asistencia), controladores (C_header, C_informe_de_asistencia, C_mySQL) y la entidad marcas, con mensajes síncronos que orquestan carga de UI, consulta a BD, selección de parámetros y salida a impresión.</w:t>
+        <w:t xml:space="preserve">se observa el diagrama de secuencia de caso de uso N°5.6, Imprimiendo informe de asistencia, muestra al Usuario que, tras iniciar sesión (1), navega al </w:t>
+      </w:r>
+      <w:proofErr w:type="spellStart"/>
+      <w:r>
+        <w:t>dashboard</w:t>
+      </w:r>
+      <w:proofErr w:type="spellEnd"/>
+      <w:r>
+        <w:t xml:space="preserve"> y solicita el menú del </w:t>
+      </w:r>
+      <w:proofErr w:type="spellStart"/>
+      <w:r>
+        <w:t>header</w:t>
+      </w:r>
+      <w:proofErr w:type="spellEnd"/>
+      <w:r>
+        <w:t xml:space="preserve"> (2–3); la vista </w:t>
+      </w:r>
+      <w:proofErr w:type="spellStart"/>
+      <w:r>
+        <w:t>V_header</w:t>
+      </w:r>
+      <w:proofErr w:type="spellEnd"/>
+      <w:r>
+        <w:t xml:space="preserve"> se carga y, desde la pestaña de informe de asistencia (5–6), el usuario pide el reporte a </w:t>
+      </w:r>
+      <w:proofErr w:type="spellStart"/>
+      <w:r>
+        <w:t>C_informe_de_asistencia</w:t>
+      </w:r>
+      <w:proofErr w:type="spellEnd"/>
+      <w:r>
+        <w:t xml:space="preserve">, el cual consulta a </w:t>
+      </w:r>
+      <w:proofErr w:type="spellStart"/>
+      <w:r>
+        <w:t>C_mySQL</w:t>
+      </w:r>
+      <w:proofErr w:type="spellEnd"/>
+      <w:r>
+        <w:t xml:space="preserve"> (7–8) y recibe las marcas (9–10) para cargar la interfaz con datos (11). Luego el sistema muestra la interfaz del informe (12) y el actor elige las marcas a incluir (13), confirma (14) y presiona Imprimir (15). La capa de control solicita la impresión (16), se muestra la vista previa (17) y finalmente el sistema realiza la impresión (18). Intervienen vistas (</w:t>
+      </w:r>
+      <w:proofErr w:type="spellStart"/>
+      <w:r>
+        <w:t>V_dashboard</w:t>
+      </w:r>
+      <w:proofErr w:type="spellEnd"/>
+      <w:r>
+        <w:t xml:space="preserve">, </w:t>
+      </w:r>
+      <w:proofErr w:type="spellStart"/>
+      <w:r>
+        <w:t>V_header</w:t>
+      </w:r>
+      <w:proofErr w:type="spellEnd"/>
+      <w:r>
+        <w:t xml:space="preserve">, </w:t>
+      </w:r>
+      <w:proofErr w:type="spellStart"/>
+      <w:r>
+        <w:t>V_informe_de_asistencia</w:t>
+      </w:r>
+      <w:proofErr w:type="spellEnd"/>
+      <w:r>
+        <w:t>), controladores (</w:t>
+      </w:r>
+      <w:proofErr w:type="spellStart"/>
+      <w:r>
+        <w:t>C_header</w:t>
+      </w:r>
+      <w:proofErr w:type="spellEnd"/>
+      <w:r>
+        <w:t xml:space="preserve">, </w:t>
+      </w:r>
+      <w:proofErr w:type="spellStart"/>
+      <w:r>
+        <w:t>C_informe_de_asistencia</w:t>
+      </w:r>
+      <w:proofErr w:type="spellEnd"/>
+      <w:r>
+        <w:t xml:space="preserve">, </w:t>
+      </w:r>
+      <w:proofErr w:type="spellStart"/>
+      <w:r>
+        <w:t>C_mySQL</w:t>
+      </w:r>
+      <w:proofErr w:type="spellEnd"/>
+      <w:r>
+        <w:t>) y la entidad marcas, con mensajes síncronos que orquestan carga de UI, consulta a BD, selección de parámetros y salida a impresión.</w:t>
       </w:r>
     </w:p>
     <w:p>
@@ -13020,8 +13217,13 @@
       <w:r>
         <w:t xml:space="preserve"> Caso de uso </w:t>
       </w:r>
-      <w:r>
-        <w:t>uso N°5.6, Imprimiendo informe de asistencia</w:t>
+      <w:proofErr w:type="spellStart"/>
+      <w:r>
+        <w:t>uso</w:t>
+      </w:r>
+      <w:proofErr w:type="spellEnd"/>
+      <w:r>
+        <w:t xml:space="preserve"> N°5.6, Imprimiendo informe de asistencia</w:t>
       </w:r>
     </w:p>
     <w:p/>
@@ -13049,7 +13251,7 @@
                     <pic:cNvPicPr/>
                   </pic:nvPicPr>
                   <pic:blipFill>
-                    <a:blip r:embed="rId19"/>
+                    <a:blip r:embed="rId20"/>
                     <a:stretch>
                       <a:fillRect/>
                     </a:stretch>
@@ -13101,7 +13303,47 @@
         <w:t>e</w:t>
       </w:r>
       <w:r>
-        <w:t>l diagrama de secuencia 5.7 muestra cómo el Usuario (administrador/RR.HH.) inicia sesión y, desde V_DashBoard, solicita el menú del V_Header para acceder a la sección “informe de asistencia”. Al entrar, la vista V_informe_de_asistencia pide al controlador C_informe_de_asistencia cargar la interfaz; este, a su vez, solicita a C_MySQL los registros de marcas del día, que son consultados en la entidad marcas y devueltos al controlador. Con los datos recibidos, el sistema carga la interfaz del informe, el usuario presiona el botón para generar/cargar el informe diario, el controlador genera el informe con las asistencias diarias, y la vista devuelve el informe obtenido para que el usuario lo visualice en pantalla.</w:t>
+        <w:t xml:space="preserve">l diagrama de secuencia 5.7 muestra cómo el Usuario (administrador/RR.HH.) inicia sesión y, desde </w:t>
+      </w:r>
+      <w:proofErr w:type="spellStart"/>
+      <w:r>
+        <w:t>V_DashBoard</w:t>
+      </w:r>
+      <w:proofErr w:type="spellEnd"/>
+      <w:r>
+        <w:t xml:space="preserve">, solicita el menú del </w:t>
+      </w:r>
+      <w:proofErr w:type="spellStart"/>
+      <w:r>
+        <w:t>V_Header</w:t>
+      </w:r>
+      <w:proofErr w:type="spellEnd"/>
+      <w:r>
+        <w:t xml:space="preserve"> para acceder a la sección “informe de asistencia”. Al entrar, la vista </w:t>
+      </w:r>
+      <w:proofErr w:type="spellStart"/>
+      <w:r>
+        <w:t>V_informe_de_asistencia</w:t>
+      </w:r>
+      <w:proofErr w:type="spellEnd"/>
+      <w:r>
+        <w:t xml:space="preserve"> pide al controlador </w:t>
+      </w:r>
+      <w:proofErr w:type="spellStart"/>
+      <w:r>
+        <w:t>C_informe_de_asistencia</w:t>
+      </w:r>
+      <w:proofErr w:type="spellEnd"/>
+      <w:r>
+        <w:t xml:space="preserve"> cargar la interfaz; este, a su vez, solicita a </w:t>
+      </w:r>
+      <w:proofErr w:type="spellStart"/>
+      <w:r>
+        <w:t>C_MySQL</w:t>
+      </w:r>
+      <w:proofErr w:type="spellEnd"/>
+      <w:r>
+        <w:t xml:space="preserve"> los registros de marcas del día, que son consultados en la entidad marcas y devueltos al controlador. Con los datos recibidos, el sistema carga la interfaz del informe, el usuario presiona el botón para generar/cargar el informe diario, el controlador genera el informe con las asistencias diarias, y la vista devuelve el informe obtenido para que el usuario lo visualice en pantalla.</w:t>
       </w:r>
     </w:p>
     <w:p/>
@@ -13168,7 +13410,7 @@
                     <pic:cNvPicPr/>
                   </pic:nvPicPr>
                   <pic:blipFill>
-                    <a:blip r:embed="rId20"/>
+                    <a:blip r:embed="rId21"/>
                     <a:stretch>
                       <a:fillRect/>
                     </a:stretch>
@@ -13215,7 +13457,47 @@
         <w:t>En la figura 5.5 e</w:t>
       </w:r>
       <w:r>
-        <w:t>l diagrama de secuencia muestra al Administrador que, tras iniciar sesión y entrar al dashboard, despliega el menú del V_header para acceder a V_permisos. Esta vista solicita al controlador C_permisos la carga de la interfaz, y el controlador consulta a C_mySQL los datos de permisos en la entidad permisos; la BD devuelve la información, el controlador la carga en la vista y el sistema muestra la vista previa. El actor selecciona el permiso del empleado a imprimir, el sistema destaca/registra la selección, y al presionar “Imprimir” se envía la solicitud de impresión y conversión a PDF; el controlador genera el comprobante del permiso y la interfaz muestra la impresión.</w:t>
+        <w:t xml:space="preserve">l diagrama de secuencia muestra al Administrador que, tras iniciar sesión y entrar al </w:t>
+      </w:r>
+      <w:proofErr w:type="spellStart"/>
+      <w:r>
+        <w:t>dashboard</w:t>
+      </w:r>
+      <w:proofErr w:type="spellEnd"/>
+      <w:r>
+        <w:t xml:space="preserve">, despliega el menú del </w:t>
+      </w:r>
+      <w:proofErr w:type="spellStart"/>
+      <w:r>
+        <w:t>V_header</w:t>
+      </w:r>
+      <w:proofErr w:type="spellEnd"/>
+      <w:r>
+        <w:t xml:space="preserve"> para acceder a </w:t>
+      </w:r>
+      <w:proofErr w:type="spellStart"/>
+      <w:r>
+        <w:t>V_permisos</w:t>
+      </w:r>
+      <w:proofErr w:type="spellEnd"/>
+      <w:r>
+        <w:t xml:space="preserve">. Esta vista solicita al controlador </w:t>
+      </w:r>
+      <w:proofErr w:type="spellStart"/>
+      <w:r>
+        <w:t>C_permisos</w:t>
+      </w:r>
+      <w:proofErr w:type="spellEnd"/>
+      <w:r>
+        <w:t xml:space="preserve"> la carga de la interfaz, y el controlador consulta a </w:t>
+      </w:r>
+      <w:proofErr w:type="spellStart"/>
+      <w:r>
+        <w:t>C_mySQL</w:t>
+      </w:r>
+      <w:proofErr w:type="spellEnd"/>
+      <w:r>
+        <w:t xml:space="preserve"> los datos de permisos en la entidad permisos; la BD devuelve la información, el controlador la carga en la vista y el sistema muestra la vista previa. El actor selecciona el permiso del empleado a imprimir, el sistema destaca/registra la selección, y al presionar “Imprimir” se envía la solicitud de impresión y conversión a PDF; el controlador genera el comprobante del permiso y la interfaz muestra la impresión.</w:t>
       </w:r>
     </w:p>
     <w:p/>
@@ -13281,7 +13563,7 @@
                     <pic:cNvPicPr/>
                   </pic:nvPicPr>
                   <pic:blipFill>
-                    <a:blip r:embed="rId21"/>
+                    <a:blip r:embed="rId22"/>
                     <a:stretch>
                       <a:fillRect/>
                     </a:stretch>
@@ -13321,7 +13603,63 @@
     <w:p>
       <w:r>
         <w:lastRenderedPageBreak/>
-        <w:t>El Usuario inicia sesión y, desde el dashboard, despliega el menú del V_header para ir a V_permisos. La vista pide a C_permisos cargar la interfaz; el controlador consulta a C_mySQL los permisos en la entidad permisos, recibe los datos y los muestra. El usuario selecciona uno o varios permisos, confirma la selección y presiona el botón eliminar. Entonces C_permisos envía la solicitud de borrado a la base de datos; C_mySQL ejecuta los cambios y devuelve el resultado. Con la confirmación, el controlador recarga la lista y la vista muestra la información actualizada sin los permisos eliminados.</w:t>
+        <w:t xml:space="preserve">El Usuario inicia sesión y, desde el </w:t>
+      </w:r>
+      <w:proofErr w:type="spellStart"/>
+      <w:r>
+        <w:t>dashboard</w:t>
+      </w:r>
+      <w:proofErr w:type="spellEnd"/>
+      <w:r>
+        <w:t xml:space="preserve">, despliega el menú del </w:t>
+      </w:r>
+      <w:proofErr w:type="spellStart"/>
+      <w:r>
+        <w:t>V_header</w:t>
+      </w:r>
+      <w:proofErr w:type="spellEnd"/>
+      <w:r>
+        <w:t xml:space="preserve"> para ir a </w:t>
+      </w:r>
+      <w:proofErr w:type="spellStart"/>
+      <w:r>
+        <w:t>V_permisos</w:t>
+      </w:r>
+      <w:proofErr w:type="spellEnd"/>
+      <w:r>
+        <w:t xml:space="preserve">. La vista pide a </w:t>
+      </w:r>
+      <w:proofErr w:type="spellStart"/>
+      <w:r>
+        <w:t>C_permisos</w:t>
+      </w:r>
+      <w:proofErr w:type="spellEnd"/>
+      <w:r>
+        <w:t xml:space="preserve"> cargar la interfaz; el controlador consulta a </w:t>
+      </w:r>
+      <w:proofErr w:type="spellStart"/>
+      <w:r>
+        <w:t>C_mySQL</w:t>
+      </w:r>
+      <w:proofErr w:type="spellEnd"/>
+      <w:r>
+        <w:t xml:space="preserve"> los permisos en la entidad permisos, recibe los datos y los muestra. El usuario selecciona uno o varios permisos, confirma la selección y presiona el botón eliminar. Entonces </w:t>
+      </w:r>
+      <w:proofErr w:type="spellStart"/>
+      <w:r>
+        <w:t>C_permisos</w:t>
+      </w:r>
+      <w:proofErr w:type="spellEnd"/>
+      <w:r>
+        <w:t xml:space="preserve"> envía la solicitud de borrado a la base de datos; </w:t>
+      </w:r>
+      <w:proofErr w:type="spellStart"/>
+      <w:r>
+        <w:t>C_mySQL</w:t>
+      </w:r>
+      <w:proofErr w:type="spellEnd"/>
+      <w:r>
+        <w:t xml:space="preserve"> ejecuta los cambios y devuelve el resultado. Con la confirmación, el controlador recarga la lista y la vista muestra la información actualizada sin los permisos eliminados.</w:t>
       </w:r>
     </w:p>
     <w:p>
@@ -13391,7 +13729,7 @@
                     <pic:cNvPicPr/>
                   </pic:nvPicPr>
                   <pic:blipFill>
-                    <a:blip r:embed="rId22"/>
+                    <a:blip r:embed="rId23"/>
                     <a:stretch>
                       <a:fillRect/>
                     </a:stretch>
@@ -13506,7 +13844,35 @@
         <w:rPr>
           <w:rFonts w:eastAsia="Times New Roman" w:cs="Times New Roman"/>
         </w:rPr>
-        <w:t xml:space="preserve"> la arquitectura del sistema dividiéndolo en dos bloques: el Front-end y el Back-end.</w:t>
+        <w:t xml:space="preserve"> la arquitectura del sistema dividiéndolo en dos bloques: el Front-</w:t>
+      </w:r>
+      <w:proofErr w:type="spellStart"/>
+      <w:r>
+        <w:rPr>
+          <w:rFonts w:eastAsia="Times New Roman" w:cs="Times New Roman"/>
+        </w:rPr>
+        <w:t>end</w:t>
+      </w:r>
+      <w:proofErr w:type="spellEnd"/>
+      <w:r>
+        <w:rPr>
+          <w:rFonts w:eastAsia="Times New Roman" w:cs="Times New Roman"/>
+        </w:rPr>
+        <w:t xml:space="preserve"> y el Back-</w:t>
+      </w:r>
+      <w:proofErr w:type="spellStart"/>
+      <w:r>
+        <w:rPr>
+          <w:rFonts w:eastAsia="Times New Roman" w:cs="Times New Roman"/>
+        </w:rPr>
+        <w:t>end</w:t>
+      </w:r>
+      <w:proofErr w:type="spellEnd"/>
+      <w:r>
+        <w:rPr>
+          <w:rFonts w:eastAsia="Times New Roman" w:cs="Times New Roman"/>
+        </w:rPr>
+        <w:t>.</w:t>
       </w:r>
     </w:p>
     <w:p/>
@@ -13515,7 +13881,35 @@
         <w:rPr>
           <w:rFonts w:eastAsia="Times New Roman" w:cs="Times New Roman"/>
         </w:rPr>
-        <w:t>Primero se encuentra el Front-end, que es la vista del usuario y la interfaz gráfica, construidos principalmente por CSS y JavaScript, apoyados por librerías como Bootstrap, jQuery, Chart.js y DataTables para mejorar la presentación y experiencia de usuario.</w:t>
+        <w:t>Primero se encuentra el Front-</w:t>
+      </w:r>
+      <w:proofErr w:type="spellStart"/>
+      <w:r>
+        <w:rPr>
+          <w:rFonts w:eastAsia="Times New Roman" w:cs="Times New Roman"/>
+        </w:rPr>
+        <w:t>end</w:t>
+      </w:r>
+      <w:proofErr w:type="spellEnd"/>
+      <w:r>
+        <w:rPr>
+          <w:rFonts w:eastAsia="Times New Roman" w:cs="Times New Roman"/>
+        </w:rPr>
+        <w:t xml:space="preserve">, que es la vista del usuario y la interfaz gráfica, construidos principalmente por CSS y JavaScript, apoyados por librerías como Bootstrap, jQuery, Chart.js y </w:t>
+      </w:r>
+      <w:proofErr w:type="spellStart"/>
+      <w:r>
+        <w:rPr>
+          <w:rFonts w:eastAsia="Times New Roman" w:cs="Times New Roman"/>
+        </w:rPr>
+        <w:t>DataTables</w:t>
+      </w:r>
+      <w:proofErr w:type="spellEnd"/>
+      <w:r>
+        <w:rPr>
+          <w:rFonts w:eastAsia="Times New Roman" w:cs="Times New Roman"/>
+        </w:rPr>
+        <w:t xml:space="preserve"> para mejorar la presentación y experiencia de usuario.</w:t>
       </w:r>
     </w:p>
     <w:p/>
@@ -13524,7 +13918,35 @@
         <w:rPr>
           <w:rFonts w:eastAsia="Times New Roman" w:cs="Times New Roman"/>
         </w:rPr>
-        <w:t>El Back-end, desarrollado en PHP, se encarga de gestionar la lógica del sistema, procesar los formularios, conectarse a la base de datos MySQL/MariaDB y manejar la autenticación de los usuarios mediante sesiones.</w:t>
+        <w:t>El Back-</w:t>
+      </w:r>
+      <w:proofErr w:type="spellStart"/>
+      <w:r>
+        <w:rPr>
+          <w:rFonts w:eastAsia="Times New Roman" w:cs="Times New Roman"/>
+        </w:rPr>
+        <w:t>end</w:t>
+      </w:r>
+      <w:proofErr w:type="spellEnd"/>
+      <w:r>
+        <w:rPr>
+          <w:rFonts w:eastAsia="Times New Roman" w:cs="Times New Roman"/>
+        </w:rPr>
+        <w:t>, desarrollado en PHP, se encarga de gestionar la lógica del sistema, procesar los formularios, conectarse a la base de datos MySQL/</w:t>
+      </w:r>
+      <w:proofErr w:type="spellStart"/>
+      <w:r>
+        <w:rPr>
+          <w:rFonts w:eastAsia="Times New Roman" w:cs="Times New Roman"/>
+        </w:rPr>
+        <w:t>MariaDB</w:t>
+      </w:r>
+      <w:proofErr w:type="spellEnd"/>
+      <w:r>
+        <w:rPr>
+          <w:rFonts w:eastAsia="Times New Roman" w:cs="Times New Roman"/>
+        </w:rPr>
+        <w:t xml:space="preserve"> y manejar la autenticación de los usuarios mediante sesiones.</w:t>
       </w:r>
     </w:p>
     <w:p/>
@@ -13535,36 +13957,42 @@
         </w:rPr>
         <w:t xml:space="preserve">Está estructurado en archivos PHP organizados en la carpeta </w:t>
       </w:r>
+      <w:proofErr w:type="spellStart"/>
       <w:r>
         <w:rPr>
           <w:rFonts w:eastAsia="Consolas" w:cs="Times New Roman"/>
         </w:rPr>
         <w:t>src</w:t>
       </w:r>
+      <w:proofErr w:type="spellEnd"/>
       <w:r>
         <w:rPr>
           <w:rFonts w:eastAsia="Times New Roman" w:cs="Times New Roman"/>
         </w:rPr>
         <w:t>, donde se encuentran módulos como el panel de control (</w:t>
       </w:r>
+      <w:proofErr w:type="spellStart"/>
       <w:r>
         <w:rPr>
           <w:rFonts w:ascii="Consolas" w:eastAsia="Consolas" w:hAnsi="Consolas" w:cs="Consolas"/>
         </w:rPr>
         <w:t>dashboard.php</w:t>
       </w:r>
+      <w:proofErr w:type="spellEnd"/>
       <w:r>
         <w:rPr>
           <w:rFonts w:eastAsia="Times New Roman" w:cs="Times New Roman"/>
         </w:rPr>
         <w:t>), el manejo de tipos de contrato, y scripts para registrar o modificar información. Además, un archivo central de conexión (</w:t>
       </w:r>
+      <w:proofErr w:type="spellStart"/>
       <w:r>
         <w:rPr>
           <w:rFonts w:ascii="Consolas" w:eastAsia="Consolas" w:hAnsi="Consolas" w:cs="Consolas"/>
         </w:rPr>
         <w:t>conexion.php</w:t>
       </w:r>
+      <w:proofErr w:type="spellEnd"/>
       <w:r>
         <w:rPr>
           <w:rFonts w:eastAsia="Times New Roman" w:cs="Times New Roman"/>
@@ -13580,17 +14008,33 @@
         </w:rPr>
         <w:t xml:space="preserve">También se incluye un archivo </w:t>
       </w:r>
+      <w:proofErr w:type="spellStart"/>
       <w:r>
         <w:rPr>
           <w:rFonts w:eastAsia="Consolas" w:cs="Times New Roman"/>
         </w:rPr>
         <w:t>biometrico.sql</w:t>
       </w:r>
+      <w:proofErr w:type="spellEnd"/>
       <w:r>
         <w:rPr>
           <w:rFonts w:eastAsia="Times New Roman" w:cs="Times New Roman"/>
         </w:rPr>
-        <w:t xml:space="preserve"> que contiene la estructura de la base de datos necesaria para la operación del sistema, junto con un instalador de MariaDB. En conjunto, estos </w:t>
+        <w:t xml:space="preserve"> que contiene la estructura de la base de datos necesaria para la operación del sistema, junto con un instalador de </w:t>
+      </w:r>
+      <w:proofErr w:type="spellStart"/>
+      <w:r>
+        <w:rPr>
+          <w:rFonts w:eastAsia="Times New Roman" w:cs="Times New Roman"/>
+        </w:rPr>
+        <w:t>MariaDB</w:t>
+      </w:r>
+      <w:proofErr w:type="spellEnd"/>
+      <w:r>
+        <w:rPr>
+          <w:rFonts w:eastAsia="Times New Roman" w:cs="Times New Roman"/>
+        </w:rPr>
+        <w:t xml:space="preserve">. En conjunto, estos </w:t>
       </w:r>
       <w:r>
         <w:rPr>
@@ -13658,13 +14102,18 @@
         <w:t xml:space="preserve">Diagrama de componentes </w:t>
       </w:r>
       <w:r>
-        <w:t>de EugCom</w:t>
+        <w:t xml:space="preserve">de </w:t>
+      </w:r>
+      <w:proofErr w:type="spellStart"/>
+      <w:r>
+        <w:t>EugCom</w:t>
       </w:r>
       <w:bookmarkEnd w:id="95"/>
       <w:bookmarkEnd w:id="96"/>
       <w:bookmarkEnd w:id="97"/>
       <w:bookmarkEnd w:id="98"/>
       <w:bookmarkEnd w:id="99"/>
+      <w:proofErr w:type="spellEnd"/>
     </w:p>
     <w:p>
       <w:pPr>
@@ -13690,7 +14139,7 @@
                     <pic:cNvPicPr/>
                   </pic:nvPicPr>
                   <pic:blipFill>
-                    <a:blip r:embed="rId23" cstate="print">
+                    <a:blip r:embed="rId24" cstate="print">
                       <a:extLst>
                         <a:ext uri="{28A0092B-C50C-407E-A947-70E740481C1C}">
                           <a14:useLocalDpi xmlns:a14="http://schemas.microsoft.com/office/drawing/2010/main" val="0"/>
@@ -13833,13 +14282,18 @@
         </w:r>
       </w:fldSimple>
       <w:r>
-        <w:t xml:space="preserve"> Diagrama de despliegue de EugCOM</w:t>
+        <w:t xml:space="preserve"> Diagrama de despliegue de </w:t>
+      </w:r>
+      <w:proofErr w:type="spellStart"/>
+      <w:r>
+        <w:t>EugCOM</w:t>
       </w:r>
       <w:bookmarkEnd w:id="102"/>
       <w:bookmarkEnd w:id="103"/>
       <w:bookmarkEnd w:id="104"/>
       <w:bookmarkEnd w:id="105"/>
       <w:bookmarkEnd w:id="106"/>
+      <w:proofErr w:type="spellEnd"/>
     </w:p>
     <w:p>
       <w:pPr>
@@ -13865,7 +14319,7 @@
                     <pic:cNvPicPr/>
                   </pic:nvPicPr>
                   <pic:blipFill>
-                    <a:blip r:embed="rId24">
+                    <a:blip r:embed="rId25">
                       <a:extLst>
                         <a:ext uri="{28A0092B-C50C-407E-A947-70E740481C1C}">
                           <a14:useLocalDpi xmlns:a14="http://schemas.microsoft.com/office/drawing/2010/main" val="0"/>
@@ -13961,8 +14415,13 @@
         <w:t>) paso a paso para instalar correctamente el sistema</w:t>
       </w:r>
       <w:r>
-        <w:t xml:space="preserve"> web EugCOM</w:t>
-      </w:r>
+        <w:t xml:space="preserve"> web </w:t>
+      </w:r>
+      <w:proofErr w:type="spellStart"/>
+      <w:r>
+        <w:t>EugCOM</w:t>
+      </w:r>
+      <w:proofErr w:type="spellEnd"/>
       <w:r>
         <w:t>.</w:t>
       </w:r>
@@ -14115,7 +14574,11 @@
         <w:t>MySQL</w:t>
       </w:r>
       <w:r>
-        <w:t>/ Mari</w:t>
+        <w:t xml:space="preserve">/ </w:t>
+      </w:r>
+      <w:proofErr w:type="spellStart"/>
+      <w:r>
+        <w:t>Mari</w:t>
       </w:r>
       <w:r>
         <w:t>a</w:t>
@@ -14123,6 +14586,7 @@
       <w:r>
         <w:t>DB</w:t>
       </w:r>
+      <w:proofErr w:type="spellEnd"/>
     </w:p>
     <w:p>
       <w:pPr>
@@ -14288,9 +14752,11 @@
           <w:numId w:val="49"/>
         </w:numPr>
       </w:pPr>
+      <w:proofErr w:type="spellStart"/>
       <w:r>
         <w:t>phpMyAdmin</w:t>
       </w:r>
+      <w:proofErr w:type="spellEnd"/>
     </w:p>
     <w:p>
       <w:pPr>
@@ -14320,7 +14786,15 @@
         </w:numPr>
       </w:pPr>
       <w:r>
-        <w:t>Haz clic en “Start” para:</w:t>
+        <w:t>Haz clic en “</w:t>
+      </w:r>
+      <w:proofErr w:type="spellStart"/>
+      <w:r>
+        <w:t>Start</w:t>
+      </w:r>
+      <w:proofErr w:type="spellEnd"/>
+      <w:r>
+        <w:t>” para:</w:t>
       </w:r>
     </w:p>
     <w:p>
@@ -14394,7 +14868,23 @@
         <w:t>(</w:t>
       </w:r>
       <w:r>
-        <w:t>C:\xampp\htdocs\</w:t>
+        <w:t>C:\</w:t>
+      </w:r>
+      <w:proofErr w:type="spellStart"/>
+      <w:r>
+        <w:t>xampp</w:t>
+      </w:r>
+      <w:proofErr w:type="spellEnd"/>
+      <w:r>
+        <w:t>\</w:t>
+      </w:r>
+      <w:proofErr w:type="spellStart"/>
+      <w:r>
+        <w:t>htdocs</w:t>
+      </w:r>
+      <w:proofErr w:type="spellEnd"/>
+      <w:r>
+        <w:t>\</w:t>
       </w:r>
       <w:r>
         <w:t>)</w:t>
@@ -14437,7 +14927,7 @@
       <w:r>
         <w:t>“</w:t>
       </w:r>
-      <w:hyperlink r:id="rId25" w:history="1">
+      <w:hyperlink r:id="rId26" w:history="1">
         <w:r>
           <w:rPr>
             <w:rStyle w:val="Hipervnculo"/>
@@ -14515,8 +15005,13 @@
         </w:numPr>
       </w:pPr>
       <w:r>
-        <w:t>Configurar el archivo de conexión a la base de datos (config.php</w:t>
-      </w:r>
+        <w:t>Configurar el archivo de conexión a la base de datos (</w:t>
+      </w:r>
+      <w:proofErr w:type="spellStart"/>
+      <w:r>
+        <w:t>config.php</w:t>
+      </w:r>
+      <w:proofErr w:type="spellEnd"/>
       <w:r>
         <w:t>)</w:t>
       </w:r>
@@ -14584,7 +15079,7 @@
       <w:r>
         <w:t xml:space="preserve"> </w:t>
       </w:r>
-      <w:hyperlink r:id="rId26" w:history="1">
+      <w:hyperlink r:id="rId27" w:history="1">
         <w:r>
           <w:rPr>
             <w:rStyle w:val="Hipervnculo"/>
@@ -14780,9 +15275,11 @@
             <w:r>
               <w:t>“</w:t>
             </w:r>
+            <w:proofErr w:type="spellStart"/>
             <w:r>
               <w:t>config.php</w:t>
             </w:r>
+            <w:proofErr w:type="spellEnd"/>
             <w:r>
               <w:t>”</w:t>
             </w:r>
@@ -14828,7 +15325,15 @@
               <w:jc w:val="left"/>
             </w:pPr>
             <w:r>
-              <w:t>Verificar que estén dentro de htdocs/</w:t>
+              <w:t xml:space="preserve">Verificar que estén dentro de </w:t>
+            </w:r>
+            <w:proofErr w:type="spellStart"/>
+            <w:r>
+              <w:t>htdocs</w:t>
+            </w:r>
+            <w:proofErr w:type="spellEnd"/>
+            <w:r>
+              <w:t>/</w:t>
             </w:r>
           </w:p>
         </w:tc>
@@ -14981,7 +15486,31 @@
     <w:p/>
     <w:p>
       <w:r>
-        <w:t>En la figura 6.1 El árbol de navegación muestra cómo se organiza la aplicación tras el inicio de sesión: desde el Dashboard se despliega el menú (header), que agrupa las principales pestañas o módulos. Allí el usuario puede gestionar Turnos (listar, crear y asignar), Empleados (ingresar y visualizar), y las Tablas Maestras de RR.HH. (permisos, centros de costo, departamentos, motivos, tipos de contrato y vacaciones). También incluye vistas operativas para Vacaciones (crear y ver), Informe de asistencia (consultar por empleado), Permisos (ingresar y ver aprobados), Pulsos de empleados y Reportes/Informes. Cada nodo azul representa una interfaz (pantalla) y cada nodo morado una funcionalidad dentro de esa pantalla; la ruta típica es: iniciar sesión → dashboard → menú → módulo (pantalla) → acción específica, y finalmente la opción Salir para cerrar sesión.</w:t>
+        <w:t xml:space="preserve">En la figura 6.1 El árbol de navegación muestra cómo se organiza la aplicación tras el inicio de sesión: desde el </w:t>
+      </w:r>
+      <w:proofErr w:type="spellStart"/>
+      <w:r>
+        <w:t>Dashboard</w:t>
+      </w:r>
+      <w:proofErr w:type="spellEnd"/>
+      <w:r>
+        <w:t xml:space="preserve"> se despliega el menú (</w:t>
+      </w:r>
+      <w:proofErr w:type="spellStart"/>
+      <w:r>
+        <w:t>header</w:t>
+      </w:r>
+      <w:proofErr w:type="spellEnd"/>
+      <w:r>
+        <w:t xml:space="preserve">), que agrupa las principales pestañas o módulos. Allí el usuario puede gestionar Turnos (listar, crear y asignar), Empleados (ingresar y visualizar), y las Tablas Maestras de RR.HH. (permisos, centros de costo, departamentos, motivos, tipos de contrato y vacaciones). También incluye vistas operativas para Vacaciones (crear y ver), Informe de asistencia (consultar por empleado), Permisos (ingresar y ver aprobados), Pulsos de empleados y Reportes/Informes. Cada nodo azul representa una interfaz (pantalla) y cada nodo morado una funcionalidad dentro de esa pantalla; la ruta típica es: iniciar sesión → </w:t>
+      </w:r>
+      <w:proofErr w:type="spellStart"/>
+      <w:r>
+        <w:t>dashboard</w:t>
+      </w:r>
+      <w:proofErr w:type="spellEnd"/>
+      <w:r>
+        <w:t xml:space="preserve"> → menú → módulo (pantalla) → acción específica, y finalmente la opción Salir para cerrar sesión.</w:t>
       </w:r>
     </w:p>
     <w:p/>
@@ -15025,7 +15554,15 @@
         <w:t xml:space="preserve"> </w:t>
       </w:r>
       <w:r>
-        <w:t>“Árbol de navegación EugCOM”</w:t>
+        <w:t xml:space="preserve">“Árbol de navegación </w:t>
+      </w:r>
+      <w:proofErr w:type="spellStart"/>
+      <w:r>
+        <w:t>EugCOM</w:t>
+      </w:r>
+      <w:proofErr w:type="spellEnd"/>
+      <w:r>
+        <w:t>”</w:t>
       </w:r>
       <w:bookmarkEnd w:id="124"/>
       <w:bookmarkEnd w:id="125"/>
@@ -15056,7 +15593,7 @@
                     <pic:cNvPicPr/>
                   </pic:nvPicPr>
                   <pic:blipFill>
-                    <a:blip r:embed="rId27"/>
+                    <a:blip r:embed="rId28"/>
                     <a:stretch>
                       <a:fillRect/>
                     </a:stretch>
@@ -15191,7 +15728,7 @@
                     <pic:cNvPicPr/>
                   </pic:nvPicPr>
                   <pic:blipFill>
-                    <a:blip r:embed="rId28"/>
+                    <a:blip r:embed="rId29"/>
                     <a:stretch>
                       <a:fillRect/>
                     </a:stretch>
@@ -15357,7 +15894,7 @@
                     <pic:cNvPicPr preferRelativeResize="0"/>
                   </pic:nvPicPr>
                   <pic:blipFill>
-                    <a:blip r:embed="rId13"/>
+                    <a:blip r:embed="rId14"/>
                     <a:srcRect/>
                     <a:stretch>
                       <a:fillRect/>
@@ -15510,7 +16047,7 @@
                     <pic:cNvPicPr/>
                   </pic:nvPicPr>
                   <pic:blipFill>
-                    <a:blip r:embed="rId14"/>
+                    <a:blip r:embed="rId15"/>
                     <a:stretch>
                       <a:fillRect/>
                     </a:stretch>
@@ -15664,7 +16201,7 @@
                     <pic:cNvPicPr preferRelativeResize="0"/>
                   </pic:nvPicPr>
                   <pic:blipFill>
-                    <a:blip r:embed="rId15"/>
+                    <a:blip r:embed="rId16"/>
                     <a:srcRect/>
                     <a:stretch>
                       <a:fillRect/>
@@ -15809,7 +16346,7 @@
                     <pic:cNvPicPr preferRelativeResize="0"/>
                   </pic:nvPicPr>
                   <pic:blipFill>
-                    <a:blip r:embed="rId16"/>
+                    <a:blip r:embed="rId17"/>
                     <a:srcRect/>
                     <a:stretch>
                       <a:fillRect/>
@@ -15877,9 +16414,14 @@
       </w:pPr>
       <w:bookmarkStart w:id="144" w:name="_Toc211882616"/>
       <w:r>
-        <w:t>Backlog Review</w:t>
+        <w:t xml:space="preserve">Backlog </w:t>
+      </w:r>
+      <w:proofErr w:type="spellStart"/>
+      <w:r>
+        <w:t>Review</w:t>
       </w:r>
       <w:bookmarkEnd w:id="144"/>
+      <w:proofErr w:type="spellEnd"/>
     </w:p>
     <w:p>
       <w:pPr>
@@ -15894,7 +16436,15 @@
         <w:t>8</w:t>
       </w:r>
       <w:r>
-        <w:t xml:space="preserve">.1 se aprecia el sprint backlog review con las respectivas horas efectivas del proyecto </w:t>
+        <w:t xml:space="preserve">.1 se aprecia el sprint backlog </w:t>
+      </w:r>
+      <w:proofErr w:type="spellStart"/>
+      <w:r>
+        <w:t>review</w:t>
+      </w:r>
+      <w:proofErr w:type="spellEnd"/>
+      <w:r>
+        <w:t xml:space="preserve"> con las respectivas horas efectivas del proyecto </w:t>
       </w:r>
       <w:r>
         <w:t>y tareas</w:t>
@@ -15955,13 +16505,64 @@
         </w:r>
       </w:fldSimple>
       <w:r>
-        <w:t xml:space="preserve"> Sprint Backlog Review</w:t>
+        <w:t xml:space="preserve"> Sprint Backlog </w:t>
+      </w:r>
+      <w:proofErr w:type="spellStart"/>
+      <w:r>
+        <w:t>Review</w:t>
       </w:r>
       <w:bookmarkEnd w:id="145"/>
       <w:bookmarkEnd w:id="146"/>
       <w:bookmarkEnd w:id="147"/>
       <w:bookmarkEnd w:id="148"/>
       <w:bookmarkEnd w:id="149"/>
+      <w:proofErr w:type="spellEnd"/>
+    </w:p>
+    <w:p/>
+    <w:p>
+      <w:pPr>
+        <w:pStyle w:val="Sinespaciado"/>
+      </w:pPr>
+      <w:r>
+        <w:rPr>
+          <w:noProof/>
+        </w:rPr>
+        <w:drawing>
+          <wp:inline distT="0" distB="0" distL="0" distR="0" wp14:anchorId="4CC6E0B8" wp14:editId="2F7A47B5">
+            <wp:extent cx="5971540" cy="1477925"/>
+            <wp:effectExtent l="0" t="0" r="0" b="8255"/>
+            <wp:docPr id="81427559" name="Imagen 1" descr="Interfaz de usuario gráfica, Aplicación&#10;&#10;El contenido generado por IA puede ser incorrecto."/>
+            <wp:cNvGraphicFramePr>
+              <a:graphicFrameLocks xmlns:a="http://schemas.openxmlformats.org/drawingml/2006/main" noChangeAspect="1"/>
+            </wp:cNvGraphicFramePr>
+            <a:graphic xmlns:a="http://schemas.openxmlformats.org/drawingml/2006/main">
+              <a:graphicData uri="http://schemas.openxmlformats.org/drawingml/2006/picture">
+                <pic:pic xmlns:pic="http://schemas.openxmlformats.org/drawingml/2006/picture">
+                  <pic:nvPicPr>
+                    <pic:cNvPr id="81427559" name="Imagen 1" descr="Interfaz de usuario gráfica, Aplicación&#10;&#10;El contenido generado por IA puede ser incorrecto."/>
+                    <pic:cNvPicPr/>
+                  </pic:nvPicPr>
+                  <pic:blipFill>
+                    <a:blip r:embed="rId30"/>
+                    <a:stretch>
+                      <a:fillRect/>
+                    </a:stretch>
+                  </pic:blipFill>
+                  <pic:spPr>
+                    <a:xfrm>
+                      <a:off x="0" y="0"/>
+                      <a:ext cx="5972672" cy="1478205"/>
+                    </a:xfrm>
+                    <a:prstGeom prst="rect">
+                      <a:avLst/>
+                    </a:prstGeom>
+                  </pic:spPr>
+                </pic:pic>
+              </a:graphicData>
+            </a:graphic>
+          </wp:inline>
+        </w:drawing>
+      </w:r>
     </w:p>
     <w:p>
       <w:pPr>
@@ -16152,8 +16753,21 @@
         <w:t xml:space="preserve"> </w:t>
       </w:r>
       <w:bookmarkStart w:id="157" w:name="_Toc211882619"/>
-      <w:r>
-        <w:t>Burn down chart</w:t>
+      <w:proofErr w:type="spellStart"/>
+      <w:r>
+        <w:t>Burn</w:t>
+      </w:r>
+      <w:proofErr w:type="spellEnd"/>
+      <w:r>
+        <w:t xml:space="preserve"> </w:t>
+      </w:r>
+      <w:proofErr w:type="spellStart"/>
+      <w:r>
+        <w:t>down</w:t>
+      </w:r>
+      <w:proofErr w:type="spellEnd"/>
+      <w:r>
+        <w:t xml:space="preserve"> chart</w:t>
       </w:r>
       <w:bookmarkEnd w:id="157"/>
     </w:p>
@@ -16228,8 +16842,13 @@
       <w:r>
         <w:t xml:space="preserve"> </w:t>
       </w:r>
-      <w:r>
-        <w:t xml:space="preserve">Burn-Down </w:t>
+      <w:proofErr w:type="spellStart"/>
+      <w:r>
+        <w:t>Burn</w:t>
+      </w:r>
+      <w:proofErr w:type="spellEnd"/>
+      <w:r>
+        <w:t xml:space="preserve">-Down </w:t>
       </w:r>
       <w:r>
         <w:t>del esfuerzo del equipo</w:t>
@@ -16280,8 +16899,14 @@
         <w:pStyle w:val="Ttulo3"/>
       </w:pPr>
       <w:bookmarkStart w:id="163" w:name="_Toc211882620"/>
-      <w:r>
-        <w:t xml:space="preserve">Burn </w:t>
+      <w:proofErr w:type="spellStart"/>
+      <w:r>
+        <w:lastRenderedPageBreak/>
+        <w:t>Burn</w:t>
+      </w:r>
+      <w:proofErr w:type="spellEnd"/>
+      <w:r>
+        <w:t xml:space="preserve"> </w:t>
       </w:r>
       <w:r>
         <w:t>U</w:t>
@@ -16306,7 +16931,15 @@
         <w:t>á</w:t>
       </w:r>
       <w:r>
-        <w:t xml:space="preserve">fico Burn Up </w:t>
+        <w:t xml:space="preserve">fico </w:t>
+      </w:r>
+      <w:proofErr w:type="spellStart"/>
+      <w:r>
+        <w:t>Burn</w:t>
+      </w:r>
+      <w:proofErr w:type="spellEnd"/>
+      <w:r>
+        <w:t xml:space="preserve"> Up </w:t>
       </w:r>
       <w:r>
         <w:t xml:space="preserve">que representa el trabajo acumulado </w:t>
@@ -16333,7 +16966,6 @@
       <w:bookmarkStart w:id="167" w:name="_Toc201199747"/>
       <w:bookmarkStart w:id="168" w:name="_Toc211609267"/>
       <w:r>
-        <w:lastRenderedPageBreak/>
         <w:t xml:space="preserve">Figura </w:t>
       </w:r>
       <w:fldSimple w:instr=" STYLEREF 1 \s ">
@@ -16367,9 +16999,11 @@
       <w:r>
         <w:t xml:space="preserve">fica </w:t>
       </w:r>
+      <w:proofErr w:type="spellStart"/>
       <w:r>
         <w:t>Burn</w:t>
       </w:r>
+      <w:proofErr w:type="spellEnd"/>
       <w:r>
         <w:t>-Up del esfuerzo del equipo</w:t>
       </w:r>
@@ -16555,7 +17189,15 @@
     <w:p/>
     <w:p>
       <w:r>
-        <w:t>La retrospectiva del proyecto se llevó a cabo como una instancia fundamental para la inspección y adaptación continua de los procesos y el desempeño del Equipo Scrum. Esta sesión se enfocó en analizar el trabajo realizado durante los sprints anteriores con el objetivo de identificar tanto los logros alcanzados como las áreas de oportunidad que permitan optimizar la eficiencia y calidad en los futuros ciclos de desarrollo.</w:t>
+        <w:t xml:space="preserve">La retrospectiva del proyecto se llevó a cabo como una instancia fundamental para la inspección y adaptación continua de los procesos y el desempeño del Equipo Scrum. Esta sesión se enfocó en analizar el trabajo realizado durante los </w:t>
+      </w:r>
+      <w:proofErr w:type="spellStart"/>
+      <w:r>
+        <w:t>sprints</w:t>
+      </w:r>
+      <w:proofErr w:type="spellEnd"/>
+      <w:r>
+        <w:t xml:space="preserve"> anteriores con el objetivo de identificar tanto los logros alcanzados como las áreas de oportunidad que permitan optimizar la eficiencia y calidad en los futuros ciclos de desarrollo.</w:t>
       </w:r>
     </w:p>
     <w:p>
@@ -16588,7 +17230,15 @@
         <w:t xml:space="preserve">representan </w:t>
       </w:r>
       <w:r>
-        <w:t>los hallazgos y discusiones de la retrospectiva, se ha formulado el siguiente plan de mejora, el cual detalla las acciones específicas que el Equipo Scrum se compromete a implementar en los próximos sprints. Estas acciones están diseñadas para abordar las áreas identificadas y potenciar la productividad y cohesión del equipo</w:t>
+        <w:t xml:space="preserve">los hallazgos y discusiones de la retrospectiva, se ha formulado el siguiente plan de mejora, el cual detalla las acciones específicas que el Equipo Scrum se compromete a implementar en los próximos </w:t>
+      </w:r>
+      <w:proofErr w:type="spellStart"/>
+      <w:r>
+        <w:t>sprints</w:t>
+      </w:r>
+      <w:proofErr w:type="spellEnd"/>
+      <w:r>
+        <w:t>. Estas acciones están diseñadas para abordar las áreas identificadas y potenciar la productividad y cohesión del equipo</w:t>
       </w:r>
     </w:p>
     <w:p>
@@ -16656,7 +17306,7 @@
                     <pic:cNvPicPr/>
                   </pic:nvPicPr>
                   <pic:blipFill>
-                    <a:blip r:embed="rId29"/>
+                    <a:blip r:embed="rId31"/>
                     <a:stretch>
                       <a:fillRect/>
                     </a:stretch>
@@ -16730,9 +17380,11 @@
       <w:r>
         <w:t>“</w:t>
       </w:r>
+      <w:proofErr w:type="spellStart"/>
       <w:r>
         <w:t>TicTac</w:t>
       </w:r>
+      <w:proofErr w:type="spellEnd"/>
       <w:r>
         <w:t>”</w:t>
       </w:r>
@@ -16747,7 +17399,31 @@
     </w:p>
     <w:p>
       <w:r>
-        <w:t xml:space="preserve">Para usar el sistema se necesita XAMPP, activando Apache como servidor local web y MySQL para la base de datos. Funciona con archivos principales: index.php, que es la vista de inicio de sesión; header.php, que es el menú principal con el menú desplegable que combina la vista del inicio de sesión para lograr cargar la lógica del sistema, donde permite realizar los microservicios a través de dicho menú; y connection.php, que gestiona la conexión a la base de datos. </w:t>
+        <w:t xml:space="preserve">Para usar el sistema se necesita XAMPP, activando Apache como servidor local web y MySQL para la base de datos. Funciona con archivos principales: </w:t>
+      </w:r>
+      <w:proofErr w:type="spellStart"/>
+      <w:r>
+        <w:t>index.php</w:t>
+      </w:r>
+      <w:proofErr w:type="spellEnd"/>
+      <w:r>
+        <w:t xml:space="preserve">, que es la vista de inicio de sesión; </w:t>
+      </w:r>
+      <w:proofErr w:type="spellStart"/>
+      <w:r>
+        <w:t>header.php</w:t>
+      </w:r>
+      <w:proofErr w:type="spellEnd"/>
+      <w:r>
+        <w:t xml:space="preserve">, que es el menú principal con el menú desplegable que combina la vista del inicio de sesión para lograr cargar la lógica del sistema, donde permite realizar los microservicios a través de dicho menú; y </w:t>
+      </w:r>
+      <w:proofErr w:type="spellStart"/>
+      <w:r>
+        <w:t>connection.php</w:t>
+      </w:r>
+      <w:proofErr w:type="spellEnd"/>
+      <w:r>
+        <w:t xml:space="preserve">, que gestiona la conexión a la base de datos. </w:t>
       </w:r>
     </w:p>
     <w:p>
@@ -16757,7 +17433,31 @@
     </w:p>
     <w:p>
       <w:r>
-        <w:t xml:space="preserve">El usuario accede a un formulario de inicio de sesión donde introduce su nombre de usuario, ID y contraseña. Esta interfaz, desarrollada en HTML y optimizada con Bootstrap, envía los datos al mismo archivo mediante el método POST. PHP procesa la solicitud, validando si existe una sesión activa; de no ser así, verifica que se hayan introducido los datos. A continuación, incluye connection.php, que establece la conexión a la base de datos mediante la biblioteca nativa MySQLi de PHP, utilizando la función mysqli_connect(). </w:t>
+        <w:t xml:space="preserve">El usuario accede a un formulario de inicio de sesión donde introduce su nombre de usuario, ID y contraseña. Esta interfaz, desarrollada en HTML y optimizada con Bootstrap, envía los datos al mismo archivo mediante el método POST. PHP procesa la solicitud, validando si existe una sesión activa; de no ser así, verifica que se hayan introducido los datos. A continuación, incluye </w:t>
+      </w:r>
+      <w:proofErr w:type="spellStart"/>
+      <w:r>
+        <w:t>connection.php</w:t>
+      </w:r>
+      <w:proofErr w:type="spellEnd"/>
+      <w:r>
+        <w:t xml:space="preserve">, que establece la conexión a la base de datos mediante la biblioteca nativa </w:t>
+      </w:r>
+      <w:proofErr w:type="spellStart"/>
+      <w:r>
+        <w:t>MySQLi</w:t>
+      </w:r>
+      <w:proofErr w:type="spellEnd"/>
+      <w:r>
+        <w:t xml:space="preserve"> de PHP, utilizando la función </w:t>
+      </w:r>
+      <w:proofErr w:type="spellStart"/>
+      <w:r>
+        <w:t>mysqli_connect</w:t>
+      </w:r>
+      <w:proofErr w:type="spellEnd"/>
+      <w:r>
+        <w:t xml:space="preserve">(). </w:t>
       </w:r>
     </w:p>
     <w:p>
@@ -16781,7 +17481,31 @@
     </w:p>
     <w:p>
       <w:r>
-        <w:t xml:space="preserve">La conexión a MySQL se realiza mediante mysqli_connect() y mysqli_query(), utilizando mysqli_real_escape_string() para depurar los datos, aunque sin usar cifrado de contraseña ni consultas preparadas, lo que representa una mejora de seguridad. </w:t>
+        <w:t xml:space="preserve">La conexión a MySQL se realiza mediante </w:t>
+      </w:r>
+      <w:proofErr w:type="spellStart"/>
+      <w:r>
+        <w:t>mysqli_connect</w:t>
+      </w:r>
+      <w:proofErr w:type="spellEnd"/>
+      <w:r>
+        <w:t xml:space="preserve">() y </w:t>
+      </w:r>
+      <w:proofErr w:type="spellStart"/>
+      <w:r>
+        <w:t>mysqli_query</w:t>
+      </w:r>
+      <w:proofErr w:type="spellEnd"/>
+      <w:r>
+        <w:t xml:space="preserve">(), utilizando </w:t>
+      </w:r>
+      <w:proofErr w:type="spellStart"/>
+      <w:r>
+        <w:t>mysqli_real_escape_string</w:t>
+      </w:r>
+      <w:proofErr w:type="spellEnd"/>
+      <w:r>
+        <w:t xml:space="preserve">() para depurar los datos, aunque sin usar cifrado de contraseña ni consultas preparadas, lo que representa una mejora de seguridad. </w:t>
       </w:r>
     </w:p>
     <w:p/>
@@ -16806,14 +17530,32 @@
     </w:p>
     <w:p/>
     <w:p>
-      <w:r>
-        <w:t xml:space="preserve">Frontend: Se utiliza HTML para la estructura, CSS para el diseño y JavaScript con jQuery para interacciones dinámicas en el lado del cliente. Bootstrap se emplea para optimizar la interfaz de usuario. </w:t>
+      <w:proofErr w:type="spellStart"/>
+      <w:r>
+        <w:t>Frontend</w:t>
+      </w:r>
+      <w:proofErr w:type="spellEnd"/>
+      <w:r>
+        <w:t xml:space="preserve">: Se utiliza HTML para la estructura, CSS para el diseño y JavaScript con jQuery para interacciones dinámicas en el lado del cliente. Bootstrap se emplea para optimizar la interfaz de usuario. </w:t>
       </w:r>
     </w:p>
     <w:p/>
     <w:p>
-      <w:r>
-        <w:t xml:space="preserve">Backend: PHP 7.4 gestiona la lógica del servidor y las interacciones con la base de datos. Base de Datos: MySQL/MariaDB almacena los datos de usuario y la información del sistema. </w:t>
+      <w:proofErr w:type="spellStart"/>
+      <w:r>
+        <w:t>Backend</w:t>
+      </w:r>
+      <w:proofErr w:type="spellEnd"/>
+      <w:r>
+        <w:t>: PHP 7.4 gestiona la lógica del servidor y las interacciones con la base de datos. Base de Datos: MySQL/</w:t>
+      </w:r>
+      <w:proofErr w:type="spellStart"/>
+      <w:r>
+        <w:t>MariaDB</w:t>
+      </w:r>
+      <w:proofErr w:type="spellEnd"/>
+      <w:r>
+        <w:t xml:space="preserve"> almacena los datos de usuario y la información del sistema. </w:t>
       </w:r>
     </w:p>
     <w:p/>
@@ -16829,9 +17571,14 @@
         <w:pStyle w:val="Ttulo2"/>
       </w:pPr>
       <w:bookmarkStart w:id="188" w:name="_Toc211882627"/>
+      <w:proofErr w:type="spellStart"/>
       <w:r>
         <w:lastRenderedPageBreak/>
-        <w:t>Pdf diagrama de clases</w:t>
+        <w:t>Pdf</w:t>
+      </w:r>
+      <w:proofErr w:type="spellEnd"/>
+      <w:r>
+        <w:t xml:space="preserve"> diagrama de clases</w:t>
       </w:r>
       <w:r>
         <w:t xml:space="preserve"> y modelado datos</w:t>
@@ -16865,17 +17612,17 @@
             <o:lock v:ext="edit" aspectratio="t"/>
           </v:shapetype>
           <v:shape id="_x0000_i1025" type="#_x0000_t75" style="width:79.55pt;height:50.25pt" o:ole="">
-            <v:imagedata r:id="rId30" o:title=""/>
+            <v:imagedata r:id="rId32" o:title=""/>
           </v:shape>
-          <o:OLEObject Type="Embed" ProgID="Package" ShapeID="_x0000_i1025" DrawAspect="Icon" ObjectID="_1822569354" r:id="rId31"/>
+          <o:OLEObject Type="Embed" ProgID="Package" ShapeID="_x0000_i1025" DrawAspect="Icon" ObjectID="_1822756717" r:id="rId33"/>
         </w:object>
       </w:r>
       <w:r>
         <w:object w:dxaOrig="1530" w:dyaOrig="995" w14:anchorId="7318620E">
           <v:shape id="_x0000_i1026" type="#_x0000_t75" style="width:79.55pt;height:50.25pt" o:ole="">
-            <v:imagedata r:id="rId32" o:title=""/>
+            <v:imagedata r:id="rId34" o:title=""/>
           </v:shape>
-          <o:OLEObject Type="Embed" ProgID="Package" ShapeID="_x0000_i1026" DrawAspect="Icon" ObjectID="_1822569355" r:id="rId33"/>
+          <o:OLEObject Type="Embed" ProgID="Package" ShapeID="_x0000_i1026" DrawAspect="Icon" ObjectID="_1822756718" r:id="rId35"/>
         </w:object>
       </w:r>
     </w:p>
@@ -16891,8 +17638,13 @@
         <w:pStyle w:val="Ttulo2"/>
       </w:pPr>
       <w:bookmarkStart w:id="189" w:name="_Toc211882628"/>
-      <w:r>
-        <w:t xml:space="preserve">Pdf vista </w:t>
+      <w:proofErr w:type="spellStart"/>
+      <w:r>
+        <w:t>Pdf</w:t>
+      </w:r>
+      <w:proofErr w:type="spellEnd"/>
+      <w:r>
+        <w:t xml:space="preserve"> vista </w:t>
       </w:r>
       <w:r>
         <w:t>de proceso</w:t>
@@ -16903,9 +17655,9 @@
       <w:r>
         <w:object w:dxaOrig="1530" w:dyaOrig="995" w14:anchorId="0F22C1AE">
           <v:shape id="_x0000_i1027" type="#_x0000_t75" style="width:79.55pt;height:50.25pt" o:ole="">
-            <v:imagedata r:id="rId34" o:title=""/>
+            <v:imagedata r:id="rId36" o:title=""/>
           </v:shape>
-          <o:OLEObject Type="Embed" ProgID="Package" ShapeID="_x0000_i1027" DrawAspect="Icon" ObjectID="_1822569356" r:id="rId35"/>
+          <o:OLEObject Type="Embed" ProgID="Package" ShapeID="_x0000_i1027" DrawAspect="Icon" ObjectID="_1822756719" r:id="rId37"/>
         </w:object>
       </w:r>
     </w:p>
@@ -16914,8 +17666,13 @@
         <w:pStyle w:val="Ttulo2"/>
       </w:pPr>
       <w:bookmarkStart w:id="190" w:name="_Toc211882629"/>
-      <w:r>
-        <w:t>Pdf vista componentes</w:t>
+      <w:proofErr w:type="spellStart"/>
+      <w:r>
+        <w:t>Pdf</w:t>
+      </w:r>
+      <w:proofErr w:type="spellEnd"/>
+      <w:r>
+        <w:t xml:space="preserve"> vista componentes</w:t>
       </w:r>
       <w:bookmarkEnd w:id="190"/>
     </w:p>
@@ -16923,9 +17680,9 @@
       <w:r>
         <w:object w:dxaOrig="1530" w:dyaOrig="995" w14:anchorId="3BF7DF28">
           <v:shape id="_x0000_i1028" type="#_x0000_t75" style="width:79.55pt;height:50.25pt" o:ole="">
-            <v:imagedata r:id="rId36" o:title=""/>
+            <v:imagedata r:id="rId38" o:title=""/>
           </v:shape>
-          <o:OLEObject Type="Embed" ProgID="Package" ShapeID="_x0000_i1028" DrawAspect="Icon" ObjectID="_1822569357" r:id="rId37"/>
+          <o:OLEObject Type="Embed" ProgID="Package" ShapeID="_x0000_i1028" DrawAspect="Icon" ObjectID="_1822756720" r:id="rId39"/>
         </w:object>
       </w:r>
     </w:p>
@@ -16934,8 +17691,13 @@
         <w:pStyle w:val="Ttulo2"/>
       </w:pPr>
       <w:bookmarkStart w:id="191" w:name="_Toc211882630"/>
-      <w:r>
-        <w:t xml:space="preserve">Pdf vista </w:t>
+      <w:proofErr w:type="spellStart"/>
+      <w:r>
+        <w:t>Pdf</w:t>
+      </w:r>
+      <w:proofErr w:type="spellEnd"/>
+      <w:r>
+        <w:t xml:space="preserve"> vista </w:t>
       </w:r>
       <w:r>
         <w:t>despliegue</w:t>
@@ -16946,9 +17708,9 @@
       <w:r>
         <w:object w:dxaOrig="1530" w:dyaOrig="995" w14:anchorId="4B2FF5B7">
           <v:shape id="_x0000_i1029" type="#_x0000_t75" style="width:79.55pt;height:50.25pt" o:ole="">
-            <v:imagedata r:id="rId38" o:title=""/>
+            <v:imagedata r:id="rId40" o:title=""/>
           </v:shape>
-          <o:OLEObject Type="Embed" ProgID="Package" ShapeID="_x0000_i1029" DrawAspect="Icon" ObjectID="_1822569358" r:id="rId39"/>
+          <o:OLEObject Type="Embed" ProgID="Package" ShapeID="_x0000_i1029" DrawAspect="Icon" ObjectID="_1822756721" r:id="rId41"/>
         </w:object>
       </w:r>
     </w:p>
@@ -17025,20 +17787,43 @@
       <w:r>
         <w:t xml:space="preserve">hash, </w:t>
       </w:r>
-      <w:r>
-        <w:t>usuarios_id_usuarios, biometroc</w:t>
-      </w:r>
-      <w:r>
-        <w:t>o_id_biometrico, latitud, longitud</w:t>
-      </w:r>
+      <w:proofErr w:type="spellStart"/>
+      <w:r>
+        <w:t>usuarios_id_usuarios</w:t>
+      </w:r>
+      <w:proofErr w:type="spellEnd"/>
       <w:r>
         <w:t xml:space="preserve">, </w:t>
       </w:r>
+      <w:proofErr w:type="spellStart"/>
+      <w:r>
+        <w:t>biometroc</w:t>
+      </w:r>
+      <w:r>
+        <w:t>o_id_biometrico</w:t>
+      </w:r>
+      <w:proofErr w:type="spellEnd"/>
+      <w:r>
+        <w:t>, latitud, longitud</w:t>
+      </w:r>
+      <w:r>
+        <w:t xml:space="preserve">, </w:t>
+      </w:r>
+      <w:proofErr w:type="spellStart"/>
       <w:r>
         <w:t>tipoMarca</w:t>
       </w:r>
-      <w:r>
-        <w:t>, correo_enviado. descarga.</w:t>
+      <w:proofErr w:type="spellEnd"/>
+      <w:r>
+        <w:t xml:space="preserve">, </w:t>
+      </w:r>
+      <w:proofErr w:type="spellStart"/>
+      <w:r>
+        <w:t>correo_enviado</w:t>
+      </w:r>
+      <w:proofErr w:type="spellEnd"/>
+      <w:r>
+        <w:t>. descarga.</w:t>
       </w:r>
       <w:r>
         <w:t xml:space="preserve"> </w:t>
@@ -17056,8 +17841,45 @@
       <w:r>
         <w:t xml:space="preserve"> </w:t>
       </w:r>
-      <w:r>
-        <w:t>filtrar_marcasFechas(), filtrar_informe(), guardar_marca(), imprimirMarcaAsistencia(), exportarMarcaAsistencia(). Estos sugieren funcionalidades para filtrar, reportar, guardar, imprimir y exportar datos de asistencia.</w:t>
+      <w:proofErr w:type="spellStart"/>
+      <w:r>
+        <w:t>filtrar_marcasFechas</w:t>
+      </w:r>
+      <w:proofErr w:type="spellEnd"/>
+      <w:r>
+        <w:t xml:space="preserve">(), </w:t>
+      </w:r>
+      <w:proofErr w:type="spellStart"/>
+      <w:r>
+        <w:t>filtrar_informe</w:t>
+      </w:r>
+      <w:proofErr w:type="spellEnd"/>
+      <w:r>
+        <w:t xml:space="preserve">(), </w:t>
+      </w:r>
+      <w:proofErr w:type="spellStart"/>
+      <w:r>
+        <w:t>guardar_marca</w:t>
+      </w:r>
+      <w:proofErr w:type="spellEnd"/>
+      <w:r>
+        <w:t xml:space="preserve">(), </w:t>
+      </w:r>
+      <w:proofErr w:type="spellStart"/>
+      <w:r>
+        <w:t>imprimirMarcaAsistencia</w:t>
+      </w:r>
+      <w:proofErr w:type="spellEnd"/>
+      <w:r>
+        <w:t xml:space="preserve">(), </w:t>
+      </w:r>
+      <w:proofErr w:type="spellStart"/>
+      <w:r>
+        <w:t>exportarMarcaAsistencia</w:t>
+      </w:r>
+      <w:proofErr w:type="spellEnd"/>
+      <w:r>
+        <w:t>(). Estos sugieren funcionalidades para filtrar, reportar, guardar, imprimir y exportar datos de asistencia.</w:t>
       </w:r>
     </w:p>
     <w:p>
@@ -17093,7 +17915,15 @@
         <w:t>Atributos:</w:t>
       </w:r>
       <w:r>
-        <w:t xml:space="preserve"> id_biometrico (clave primaria), marca, modelo,</w:t>
+        <w:t xml:space="preserve"> </w:t>
+      </w:r>
+      <w:proofErr w:type="spellStart"/>
+      <w:r>
+        <w:t>id_biometrico</w:t>
+      </w:r>
+      <w:proofErr w:type="spellEnd"/>
+      <w:r>
+        <w:t xml:space="preserve"> (clave primaria), marca, modelo,</w:t>
       </w:r>
       <w:r>
         <w:t xml:space="preserve"> ubicación, </w:t>
@@ -17102,7 +17932,15 @@
         <w:t>status</w:t>
       </w:r>
       <w:r>
-        <w:t>, tipo, id_sucursal.</w:t>
+        <w:t xml:space="preserve">, tipo, </w:t>
+      </w:r>
+      <w:proofErr w:type="spellStart"/>
+      <w:r>
+        <w:t>id_sucursal</w:t>
+      </w:r>
+      <w:proofErr w:type="spellEnd"/>
+      <w:r>
+        <w:t>.</w:t>
       </w:r>
     </w:p>
     <w:p>
@@ -17144,7 +17982,39 @@
         <w:t>Atributos:</w:t>
       </w:r>
       <w:r>
-        <w:t xml:space="preserve"> id_departamentos (clave primaria), id_empresa (clave foránea), descripcion, status, fechaCreacion. </w:t>
+        <w:t xml:space="preserve"> </w:t>
+      </w:r>
+      <w:proofErr w:type="spellStart"/>
+      <w:r>
+        <w:t>id_departamentos</w:t>
+      </w:r>
+      <w:proofErr w:type="spellEnd"/>
+      <w:r>
+        <w:t xml:space="preserve"> (clave primaria), </w:t>
+      </w:r>
+      <w:proofErr w:type="spellStart"/>
+      <w:r>
+        <w:t>id_empresa</w:t>
+      </w:r>
+      <w:proofErr w:type="spellEnd"/>
+      <w:r>
+        <w:t xml:space="preserve"> (clave foránea), </w:t>
+      </w:r>
+      <w:proofErr w:type="spellStart"/>
+      <w:r>
+        <w:t>descripcion</w:t>
+      </w:r>
+      <w:proofErr w:type="spellEnd"/>
+      <w:r>
+        <w:t xml:space="preserve">, status, </w:t>
+      </w:r>
+      <w:proofErr w:type="spellStart"/>
+      <w:r>
+        <w:t>fechaCreacion</w:t>
+      </w:r>
+      <w:proofErr w:type="spellEnd"/>
+      <w:r>
+        <w:t xml:space="preserve">. </w:t>
       </w:r>
     </w:p>
     <w:p>
@@ -17156,7 +18026,39 @@
         <w:t>Métodos:</w:t>
       </w:r>
       <w:r>
-        <w:t xml:space="preserve"> nuevo_departamento(), cambiar_estadoDepartamentos(), actualizar_departamentos(), guardar_departamentos(). Estos indican operaciones CRUD (Crear, Leer, Actualizar, Eliminar) para los departamentos</w:t>
+        <w:t xml:space="preserve"> </w:t>
+      </w:r>
+      <w:proofErr w:type="spellStart"/>
+      <w:r>
+        <w:t>nuevo_departamento</w:t>
+      </w:r>
+      <w:proofErr w:type="spellEnd"/>
+      <w:r>
+        <w:t xml:space="preserve">(), </w:t>
+      </w:r>
+      <w:proofErr w:type="spellStart"/>
+      <w:r>
+        <w:t>cambiar_estadoDepartamentos</w:t>
+      </w:r>
+      <w:proofErr w:type="spellEnd"/>
+      <w:r>
+        <w:t xml:space="preserve">(), </w:t>
+      </w:r>
+      <w:proofErr w:type="spellStart"/>
+      <w:r>
+        <w:t>actualizar_departamentos</w:t>
+      </w:r>
+      <w:proofErr w:type="spellEnd"/>
+      <w:r>
+        <w:t xml:space="preserve">(), </w:t>
+      </w:r>
+      <w:proofErr w:type="spellStart"/>
+      <w:r>
+        <w:t>guardar_departamentos</w:t>
+      </w:r>
+      <w:proofErr w:type="spellEnd"/>
+      <w:r>
+        <w:t>(). Estos indican operaciones CRUD (Crear, Leer, Actualizar, Eliminar) para los departamentos</w:t>
       </w:r>
     </w:p>
     <w:p>
@@ -17192,7 +18094,71 @@
         <w:t>Atributos:</w:t>
       </w:r>
       <w:r>
-        <w:t xml:space="preserve"> id_empresas (clave primaria), RazonSocial, nombreFantasia, rut, representanteLegal, actividadEconomica, giro, fechaCreacion, web, email, logo, pais, </w:t>
+        <w:t xml:space="preserve"> </w:t>
+      </w:r>
+      <w:proofErr w:type="spellStart"/>
+      <w:r>
+        <w:t>id_empresas</w:t>
+      </w:r>
+      <w:proofErr w:type="spellEnd"/>
+      <w:r>
+        <w:t xml:space="preserve"> (clave primaria), </w:t>
+      </w:r>
+      <w:proofErr w:type="spellStart"/>
+      <w:r>
+        <w:t>RazonSocial</w:t>
+      </w:r>
+      <w:proofErr w:type="spellEnd"/>
+      <w:r>
+        <w:t xml:space="preserve">, </w:t>
+      </w:r>
+      <w:proofErr w:type="spellStart"/>
+      <w:r>
+        <w:t>nombreFantasia</w:t>
+      </w:r>
+      <w:proofErr w:type="spellEnd"/>
+      <w:r>
+        <w:t xml:space="preserve">, </w:t>
+      </w:r>
+      <w:proofErr w:type="spellStart"/>
+      <w:r>
+        <w:t>rut</w:t>
+      </w:r>
+      <w:proofErr w:type="spellEnd"/>
+      <w:r>
+        <w:t xml:space="preserve">, </w:t>
+      </w:r>
+      <w:proofErr w:type="spellStart"/>
+      <w:r>
+        <w:t>representanteLegal</w:t>
+      </w:r>
+      <w:proofErr w:type="spellEnd"/>
+      <w:r>
+        <w:t xml:space="preserve">, </w:t>
+      </w:r>
+      <w:proofErr w:type="spellStart"/>
+      <w:r>
+        <w:t>actividadEconomica</w:t>
+      </w:r>
+      <w:proofErr w:type="spellEnd"/>
+      <w:r>
+        <w:t xml:space="preserve">, giro, </w:t>
+      </w:r>
+      <w:proofErr w:type="spellStart"/>
+      <w:r>
+        <w:t>fechaCreacion</w:t>
+      </w:r>
+      <w:proofErr w:type="spellEnd"/>
+      <w:r>
+        <w:t xml:space="preserve">, web, email, logo, </w:t>
+      </w:r>
+      <w:proofErr w:type="spellStart"/>
+      <w:r>
+        <w:t>pais</w:t>
+      </w:r>
+      <w:proofErr w:type="spellEnd"/>
+      <w:r>
+        <w:t xml:space="preserve">, </w:t>
       </w:r>
       <w:r>
         <w:t>status</w:t>
@@ -17201,10 +18167,23 @@
         <w:t>,</w:t>
       </w:r>
       <w:r>
-        <w:t xml:space="preserve"> holding_id_holdind</w:t>
-      </w:r>
-      <w:r>
-        <w:t>, FechaTermino,</w:t>
+        <w:t xml:space="preserve"> </w:t>
+      </w:r>
+      <w:proofErr w:type="spellStart"/>
+      <w:r>
+        <w:t>holding_id_holdind</w:t>
+      </w:r>
+      <w:proofErr w:type="spellEnd"/>
+      <w:r>
+        <w:t xml:space="preserve">, </w:t>
+      </w:r>
+      <w:proofErr w:type="spellStart"/>
+      <w:r>
+        <w:t>FechaTermino</w:t>
+      </w:r>
+      <w:proofErr w:type="spellEnd"/>
+      <w:r>
+        <w:t>,</w:t>
       </w:r>
       <w:r>
         <w:t xml:space="preserve"> C</w:t>
@@ -17249,10 +18228,95 @@
         <w:t>Atributos:</w:t>
       </w:r>
       <w:r>
-        <w:t xml:space="preserve"> id_turnos (clave primaria), nombreTurno, numeroDia, horario, ventanaIngreso, horaEntrada, diaEntrada, tolerancia, entradaColacion, salidaColacion, horaSalida, ventanaSalida, libre, </w:t>
-      </w:r>
-      <w:r>
-        <w:t xml:space="preserve">totalHorasDia, extra, </w:t>
+        <w:t xml:space="preserve"> </w:t>
+      </w:r>
+      <w:proofErr w:type="spellStart"/>
+      <w:r>
+        <w:t>id_turnos</w:t>
+      </w:r>
+      <w:proofErr w:type="spellEnd"/>
+      <w:r>
+        <w:t xml:space="preserve"> (clave primaria), </w:t>
+      </w:r>
+      <w:proofErr w:type="spellStart"/>
+      <w:r>
+        <w:t>nombreTurno</w:t>
+      </w:r>
+      <w:proofErr w:type="spellEnd"/>
+      <w:r>
+        <w:t xml:space="preserve">, </w:t>
+      </w:r>
+      <w:proofErr w:type="spellStart"/>
+      <w:r>
+        <w:t>numeroDia</w:t>
+      </w:r>
+      <w:proofErr w:type="spellEnd"/>
+      <w:r>
+        <w:t xml:space="preserve">, horario, </w:t>
+      </w:r>
+      <w:proofErr w:type="spellStart"/>
+      <w:r>
+        <w:t>ventanaIngreso</w:t>
+      </w:r>
+      <w:proofErr w:type="spellEnd"/>
+      <w:r>
+        <w:t xml:space="preserve">, </w:t>
+      </w:r>
+      <w:proofErr w:type="spellStart"/>
+      <w:r>
+        <w:t>horaEntrada</w:t>
+      </w:r>
+      <w:proofErr w:type="spellEnd"/>
+      <w:r>
+        <w:t xml:space="preserve">, </w:t>
+      </w:r>
+      <w:proofErr w:type="spellStart"/>
+      <w:r>
+        <w:t>diaEntrada</w:t>
+      </w:r>
+      <w:proofErr w:type="spellEnd"/>
+      <w:r>
+        <w:t xml:space="preserve">, tolerancia, </w:t>
+      </w:r>
+      <w:proofErr w:type="spellStart"/>
+      <w:r>
+        <w:t>entradaColacion</w:t>
+      </w:r>
+      <w:proofErr w:type="spellEnd"/>
+      <w:r>
+        <w:t xml:space="preserve">, </w:t>
+      </w:r>
+      <w:proofErr w:type="spellStart"/>
+      <w:r>
+        <w:t>salidaColacion</w:t>
+      </w:r>
+      <w:proofErr w:type="spellEnd"/>
+      <w:r>
+        <w:t xml:space="preserve">, </w:t>
+      </w:r>
+      <w:proofErr w:type="spellStart"/>
+      <w:r>
+        <w:t>horaSalida</w:t>
+      </w:r>
+      <w:proofErr w:type="spellEnd"/>
+      <w:r>
+        <w:t xml:space="preserve">, </w:t>
+      </w:r>
+      <w:proofErr w:type="spellStart"/>
+      <w:r>
+        <w:t>ventanaSalida</w:t>
+      </w:r>
+      <w:proofErr w:type="spellEnd"/>
+      <w:r>
+        <w:t xml:space="preserve">, libre, </w:t>
+      </w:r>
+      <w:proofErr w:type="spellStart"/>
+      <w:r>
+        <w:t>totalHorasDia</w:t>
+      </w:r>
+      <w:proofErr w:type="spellEnd"/>
+      <w:r>
+        <w:t xml:space="preserve">, extra, </w:t>
       </w:r>
       <w:r>
         <w:t>status.</w:t>
@@ -17268,16 +18332,65 @@
         <w:t>Métodos:</w:t>
       </w:r>
       <w:r>
-        <w:t xml:space="preserve"> nuevo_turno(), guardar_turno(), actualizar_turno(), cambiar_estadoTurno(), eliminar_turno()</w:t>
-      </w:r>
-      <w:r>
-        <w:t>, tablaresumen_turnos()</w:t>
+        <w:t xml:space="preserve"> </w:t>
+      </w:r>
+      <w:proofErr w:type="spellStart"/>
+      <w:r>
+        <w:t>nuevo_turno</w:t>
+      </w:r>
+      <w:proofErr w:type="spellEnd"/>
+      <w:r>
+        <w:t xml:space="preserve">(), </w:t>
+      </w:r>
+      <w:proofErr w:type="spellStart"/>
+      <w:r>
+        <w:t>guardar_turno</w:t>
+      </w:r>
+      <w:proofErr w:type="spellEnd"/>
+      <w:r>
+        <w:t xml:space="preserve">(), </w:t>
+      </w:r>
+      <w:proofErr w:type="spellStart"/>
+      <w:r>
+        <w:t>actualizar_turno</w:t>
+      </w:r>
+      <w:proofErr w:type="spellEnd"/>
+      <w:r>
+        <w:t xml:space="preserve">(), </w:t>
+      </w:r>
+      <w:proofErr w:type="spellStart"/>
+      <w:r>
+        <w:t>cambiar_estadoTurno</w:t>
+      </w:r>
+      <w:proofErr w:type="spellEnd"/>
+      <w:r>
+        <w:t xml:space="preserve">(), </w:t>
+      </w:r>
+      <w:proofErr w:type="spellStart"/>
+      <w:r>
+        <w:t>eliminar_turno</w:t>
+      </w:r>
+      <w:proofErr w:type="spellEnd"/>
+      <w:r>
+        <w:t>()</w:t>
+      </w:r>
+      <w:r>
+        <w:t xml:space="preserve">, </w:t>
+      </w:r>
+      <w:proofErr w:type="spellStart"/>
+      <w:r>
+        <w:t>tablaresumen_turnos</w:t>
+      </w:r>
+      <w:proofErr w:type="spellEnd"/>
+      <w:r>
+        <w:t>()</w:t>
       </w:r>
       <w:r>
         <w:t>.</w:t>
       </w:r>
     </w:p>
     <w:p>
+      <w:proofErr w:type="spellStart"/>
       <w:r>
         <w:rPr>
           <w:b/>
@@ -17285,6 +18398,7 @@
         </w:rPr>
         <w:t>tipo_contrato</w:t>
       </w:r>
+      <w:proofErr w:type="spellEnd"/>
       <w:r>
         <w:t>:</w:t>
       </w:r>
@@ -17310,7 +18424,31 @@
         <w:t>Atributos:</w:t>
       </w:r>
       <w:r>
-        <w:t xml:space="preserve"> id_tipocontrato (clave primaria), id_empresa (clave foránea), descripcion, status. </w:t>
+        <w:t xml:space="preserve"> </w:t>
+      </w:r>
+      <w:proofErr w:type="spellStart"/>
+      <w:r>
+        <w:t>id_tipocontrato</w:t>
+      </w:r>
+      <w:proofErr w:type="spellEnd"/>
+      <w:r>
+        <w:t xml:space="preserve"> (clave primaria), </w:t>
+      </w:r>
+      <w:proofErr w:type="spellStart"/>
+      <w:r>
+        <w:t>id_empresa</w:t>
+      </w:r>
+      <w:proofErr w:type="spellEnd"/>
+      <w:r>
+        <w:t xml:space="preserve"> (clave foránea), </w:t>
+      </w:r>
+      <w:proofErr w:type="spellStart"/>
+      <w:r>
+        <w:t>descripcion</w:t>
+      </w:r>
+      <w:proofErr w:type="spellEnd"/>
+      <w:r>
+        <w:t xml:space="preserve">, status. </w:t>
       </w:r>
     </w:p>
     <w:p>
@@ -17322,7 +18460,39 @@
         <w:t>Métodos:</w:t>
       </w:r>
       <w:r>
-        <w:t xml:space="preserve"> nuevo_tipoContrato(), guardar_tipoContrato(), actualizar_tipoContrato(), cambiar_estadoTipoContrato().</w:t>
+        <w:t xml:space="preserve"> </w:t>
+      </w:r>
+      <w:proofErr w:type="spellStart"/>
+      <w:r>
+        <w:t>nuevo_tipoContrato</w:t>
+      </w:r>
+      <w:proofErr w:type="spellEnd"/>
+      <w:r>
+        <w:t xml:space="preserve">(), </w:t>
+      </w:r>
+      <w:proofErr w:type="spellStart"/>
+      <w:r>
+        <w:t>guardar_tipoContrato</w:t>
+      </w:r>
+      <w:proofErr w:type="spellEnd"/>
+      <w:r>
+        <w:t xml:space="preserve">(), </w:t>
+      </w:r>
+      <w:proofErr w:type="spellStart"/>
+      <w:r>
+        <w:t>actualizar_tipoContrato</w:t>
+      </w:r>
+      <w:proofErr w:type="spellEnd"/>
+      <w:r>
+        <w:t xml:space="preserve">(), </w:t>
+      </w:r>
+      <w:proofErr w:type="spellStart"/>
+      <w:r>
+        <w:t>cambiar_estadoTipoContrato</w:t>
+      </w:r>
+      <w:proofErr w:type="spellEnd"/>
+      <w:r>
+        <w:t>().</w:t>
       </w:r>
     </w:p>
     <w:p>
@@ -17390,9 +18560,11 @@
         </w:rPr>
         <w:t xml:space="preserve"> </w:t>
       </w:r>
+      <w:proofErr w:type="spellStart"/>
       <w:r>
         <w:t>id_usuarios</w:t>
       </w:r>
+      <w:proofErr w:type="spellEnd"/>
       <w:r>
         <w:rPr>
           <w:rFonts w:cs="Times New Roman"/>
@@ -17402,45 +18574,171 @@
       <w:r>
         <w:t xml:space="preserve"> </w:t>
       </w:r>
-      <w:r>
-        <w:t>rut, digitoRUT</w:t>
-      </w:r>
-      <w:r>
-        <w:t>, codigoDedo, nombres, apellido1, apellido2</w:t>
-      </w:r>
-      <w:r>
-        <w:t>, tipoContrato, direccion, comuna, ciudad, país, telefono, celular</w:t>
-      </w:r>
-      <w:r>
-        <w:t>, id_ficha(foránea), email, turnoFijo, username, password, perfil, cargo,</w:t>
-      </w:r>
-      <w:r>
-        <w:t xml:space="preserve"> salt, status, sucurusal_id_sucursal (</w:t>
+      <w:proofErr w:type="spellStart"/>
+      <w:r>
+        <w:t>rut</w:t>
+      </w:r>
+      <w:proofErr w:type="spellEnd"/>
+      <w:r>
+        <w:t xml:space="preserve">, </w:t>
+      </w:r>
+      <w:proofErr w:type="spellStart"/>
+      <w:r>
+        <w:t>digitoRUT</w:t>
+      </w:r>
+      <w:proofErr w:type="spellEnd"/>
+      <w:r>
+        <w:t xml:space="preserve">, </w:t>
+      </w:r>
+      <w:proofErr w:type="spellStart"/>
+      <w:r>
+        <w:t>codigoDedo</w:t>
+      </w:r>
+      <w:proofErr w:type="spellEnd"/>
+      <w:r>
+        <w:t>, nombres, apellido1, apellido2</w:t>
+      </w:r>
+      <w:r>
+        <w:t xml:space="preserve">, </w:t>
+      </w:r>
+      <w:proofErr w:type="spellStart"/>
+      <w:r>
+        <w:t>tipoContrato</w:t>
+      </w:r>
+      <w:proofErr w:type="spellEnd"/>
+      <w:r>
+        <w:t xml:space="preserve">, </w:t>
+      </w:r>
+      <w:proofErr w:type="spellStart"/>
+      <w:r>
+        <w:t>direccion</w:t>
+      </w:r>
+      <w:proofErr w:type="spellEnd"/>
+      <w:r>
+        <w:t xml:space="preserve">, comuna, ciudad, país, </w:t>
+      </w:r>
+      <w:proofErr w:type="spellStart"/>
+      <w:r>
+        <w:t>telefono</w:t>
+      </w:r>
+      <w:proofErr w:type="spellEnd"/>
+      <w:r>
+        <w:t>, celular</w:t>
+      </w:r>
+      <w:r>
+        <w:t xml:space="preserve">, </w:t>
+      </w:r>
+      <w:proofErr w:type="spellStart"/>
+      <w:r>
+        <w:t>id_ficha</w:t>
+      </w:r>
+      <w:proofErr w:type="spellEnd"/>
+      <w:r>
+        <w:t xml:space="preserve">(foránea), email, </w:t>
+      </w:r>
+      <w:proofErr w:type="spellStart"/>
+      <w:r>
+        <w:t>turnoFijo</w:t>
+      </w:r>
+      <w:proofErr w:type="spellEnd"/>
+      <w:r>
+        <w:t xml:space="preserve">, </w:t>
+      </w:r>
+      <w:proofErr w:type="spellStart"/>
+      <w:r>
+        <w:t>username</w:t>
+      </w:r>
+      <w:proofErr w:type="spellEnd"/>
+      <w:r>
+        <w:t xml:space="preserve">, </w:t>
+      </w:r>
+      <w:proofErr w:type="spellStart"/>
+      <w:r>
+        <w:t>password</w:t>
+      </w:r>
+      <w:proofErr w:type="spellEnd"/>
+      <w:r>
+        <w:t>, perfil, cargo,</w:t>
+      </w:r>
+      <w:r>
+        <w:t xml:space="preserve"> </w:t>
+      </w:r>
+      <w:proofErr w:type="spellStart"/>
+      <w:r>
+        <w:t>salt</w:t>
+      </w:r>
+      <w:proofErr w:type="spellEnd"/>
+      <w:r>
+        <w:t xml:space="preserve">, status, </w:t>
+      </w:r>
+      <w:proofErr w:type="spellStart"/>
+      <w:r>
+        <w:t>sucurusal_id_sucursal</w:t>
+      </w:r>
+      <w:proofErr w:type="spellEnd"/>
+      <w:r>
+        <w:t xml:space="preserve"> (</w:t>
       </w:r>
       <w:r>
         <w:t xml:space="preserve">foránea), </w:t>
       </w:r>
-      <w:r>
-        <w:t xml:space="preserve">turnos_id_turnos (foránea), </w:t>
-      </w:r>
-      <w:r>
-        <w:t>departamentos_id_departamentos (foránea</w:t>
+      <w:proofErr w:type="spellStart"/>
+      <w:r>
+        <w:t>turnos_id_turnos</w:t>
+      </w:r>
+      <w:proofErr w:type="spellEnd"/>
+      <w:r>
+        <w:t xml:space="preserve"> (foránea), </w:t>
+      </w:r>
+      <w:proofErr w:type="spellStart"/>
+      <w:r>
+        <w:t>departamentos_id_departamentos</w:t>
+      </w:r>
+      <w:proofErr w:type="spellEnd"/>
+      <w:r>
+        <w:t xml:space="preserve"> (foránea</w:t>
       </w:r>
       <w:r>
         <w:t>)</w:t>
       </w:r>
       <w:r>
-        <w:t xml:space="preserve">, cc_id_cc </w:t>
+        <w:t xml:space="preserve">, </w:t>
+      </w:r>
+      <w:proofErr w:type="spellStart"/>
+      <w:r>
+        <w:t>cc_id_cc</w:t>
+      </w:r>
+      <w:proofErr w:type="spellEnd"/>
+      <w:r>
+        <w:t xml:space="preserve"> </w:t>
       </w:r>
       <w:r>
         <w:t>(foránea</w:t>
       </w:r>
       <w:r>
-        <w:t>), fechaCreacion, claveReloj</w:t>
-      </w:r>
-      <w:r>
-        <w:t>, id_empresas</w:t>
-      </w:r>
+        <w:t xml:space="preserve">), </w:t>
+      </w:r>
+      <w:proofErr w:type="spellStart"/>
+      <w:r>
+        <w:t>fechaCreacion</w:t>
+      </w:r>
+      <w:proofErr w:type="spellEnd"/>
+      <w:r>
+        <w:t xml:space="preserve">, </w:t>
+      </w:r>
+      <w:proofErr w:type="spellStart"/>
+      <w:r>
+        <w:t>claveReloj</w:t>
+      </w:r>
+      <w:proofErr w:type="spellEnd"/>
+      <w:r>
+        <w:t xml:space="preserve">, </w:t>
+      </w:r>
+      <w:proofErr w:type="spellStart"/>
+      <w:r>
+        <w:t>id_empresas</w:t>
+      </w:r>
+      <w:proofErr w:type="spellEnd"/>
       <w:r>
         <w:rPr>
           <w:rFonts w:cs="Times New Roman"/>
@@ -17457,7 +18755,63 @@
         <w:t>Métodos:</w:t>
       </w:r>
       <w:r>
-        <w:t xml:space="preserve"> nuevo_usuario(), guardar_usuario(), editar_empleado(), cambiar_estadoUsuario(), cambiar_turnoUsuario(), cambiar_sucursalUsuario(), imprimiendoUsuario().</w:t>
+        <w:t xml:space="preserve"> </w:t>
+      </w:r>
+      <w:proofErr w:type="spellStart"/>
+      <w:r>
+        <w:t>nuevo_usuario</w:t>
+      </w:r>
+      <w:proofErr w:type="spellEnd"/>
+      <w:r>
+        <w:t xml:space="preserve">(), </w:t>
+      </w:r>
+      <w:proofErr w:type="spellStart"/>
+      <w:r>
+        <w:t>guardar_usuario</w:t>
+      </w:r>
+      <w:proofErr w:type="spellEnd"/>
+      <w:r>
+        <w:t xml:space="preserve">(), </w:t>
+      </w:r>
+      <w:proofErr w:type="spellStart"/>
+      <w:r>
+        <w:t>editar_empleado</w:t>
+      </w:r>
+      <w:proofErr w:type="spellEnd"/>
+      <w:r>
+        <w:t xml:space="preserve">(), </w:t>
+      </w:r>
+      <w:proofErr w:type="spellStart"/>
+      <w:r>
+        <w:t>cambiar_estadoUsuario</w:t>
+      </w:r>
+      <w:proofErr w:type="spellEnd"/>
+      <w:r>
+        <w:t xml:space="preserve">(), </w:t>
+      </w:r>
+      <w:proofErr w:type="spellStart"/>
+      <w:r>
+        <w:t>cambiar_turnoUsuario</w:t>
+      </w:r>
+      <w:proofErr w:type="spellEnd"/>
+      <w:r>
+        <w:t xml:space="preserve">(), </w:t>
+      </w:r>
+      <w:proofErr w:type="spellStart"/>
+      <w:r>
+        <w:t>cambiar_sucursalUsuario</w:t>
+      </w:r>
+      <w:proofErr w:type="spellEnd"/>
+      <w:r>
+        <w:t xml:space="preserve">(), </w:t>
+      </w:r>
+      <w:proofErr w:type="spellStart"/>
+      <w:r>
+        <w:t>imprimiendoUsuario</w:t>
+      </w:r>
+      <w:proofErr w:type="spellEnd"/>
+      <w:r>
+        <w:t>().</w:t>
       </w:r>
     </w:p>
     <w:p>
@@ -17493,7 +18847,23 @@
         <w:t>Atributos:</w:t>
       </w:r>
       <w:r>
-        <w:t xml:space="preserve"> id_holding (clave primaria), nombre, representante, status, fechaCreacion.</w:t>
+        <w:t xml:space="preserve"> </w:t>
+      </w:r>
+      <w:proofErr w:type="spellStart"/>
+      <w:r>
+        <w:t>id_holding</w:t>
+      </w:r>
+      <w:proofErr w:type="spellEnd"/>
+      <w:r>
+        <w:t xml:space="preserve"> (clave primaria), nombre, representante, status, </w:t>
+      </w:r>
+      <w:proofErr w:type="spellStart"/>
+      <w:r>
+        <w:t>fechaCreacion</w:t>
+      </w:r>
+      <w:proofErr w:type="spellEnd"/>
+      <w:r>
+        <w:t>.</w:t>
       </w:r>
     </w:p>
     <w:p>
@@ -17530,17 +18900,64 @@
         <w:t>Atributos:</w:t>
       </w:r>
       <w:r>
-        <w:t xml:space="preserve"> id_sucursal (clave primaria), tipo, nombre, direccion, comuna, fonos, celular, fax, representante, rutRepresentante, ciudad, pais, statusSucursal, </w:t>
-      </w:r>
+        <w:t xml:space="preserve"> </w:t>
+      </w:r>
+      <w:proofErr w:type="spellStart"/>
+      <w:r>
+        <w:t>id_sucursal</w:t>
+      </w:r>
+      <w:proofErr w:type="spellEnd"/>
+      <w:r>
+        <w:t xml:space="preserve"> (clave primaria), tipo, nombre, </w:t>
+      </w:r>
+      <w:proofErr w:type="spellStart"/>
+      <w:r>
+        <w:t>direccion</w:t>
+      </w:r>
+      <w:proofErr w:type="spellEnd"/>
+      <w:r>
+        <w:t xml:space="preserve">, comuna, fonos, celular, fax, representante, </w:t>
+      </w:r>
+      <w:proofErr w:type="spellStart"/>
+      <w:r>
+        <w:t>rutRepresentante</w:t>
+      </w:r>
+      <w:proofErr w:type="spellEnd"/>
+      <w:r>
+        <w:t xml:space="preserve">, ciudad, </w:t>
+      </w:r>
+      <w:proofErr w:type="spellStart"/>
+      <w:r>
+        <w:t>pais</w:t>
+      </w:r>
+      <w:proofErr w:type="spellEnd"/>
+      <w:r>
+        <w:t xml:space="preserve">, </w:t>
+      </w:r>
+      <w:proofErr w:type="spellStart"/>
+      <w:r>
+        <w:t>statusSucursal</w:t>
+      </w:r>
+      <w:proofErr w:type="spellEnd"/>
+      <w:r>
+        <w:t xml:space="preserve">, </w:t>
+      </w:r>
+      <w:proofErr w:type="spellStart"/>
       <w:r>
         <w:t>empresas_id_empresas</w:t>
       </w:r>
+      <w:proofErr w:type="spellEnd"/>
       <w:r>
         <w:t xml:space="preserve"> (clave foránea)</w:t>
       </w:r>
       <w:r>
-        <w:t>, fechaCreacion</w:t>
-      </w:r>
+        <w:t xml:space="preserve">, </w:t>
+      </w:r>
+      <w:proofErr w:type="spellStart"/>
+      <w:r>
+        <w:t>fechaCreacion</w:t>
+      </w:r>
+      <w:proofErr w:type="spellEnd"/>
       <w:r>
         <w:t xml:space="preserve">. </w:t>
       </w:r>
@@ -17556,8 +18973,37 @@
       <w:r>
         <w:t xml:space="preserve"> </w:t>
       </w:r>
-      <w:r>
-        <w:t>guardar_sucursal(), nueva_sucursal() (nombre de método duplicado), cambiar_estadoSucursal(), actualizar_sucursal().</w:t>
+      <w:proofErr w:type="spellStart"/>
+      <w:r>
+        <w:t>guardar_sucursal</w:t>
+      </w:r>
+      <w:proofErr w:type="spellEnd"/>
+      <w:r>
+        <w:t xml:space="preserve">(), </w:t>
+      </w:r>
+      <w:proofErr w:type="spellStart"/>
+      <w:r>
+        <w:t>nueva_sucursal</w:t>
+      </w:r>
+      <w:proofErr w:type="spellEnd"/>
+      <w:r>
+        <w:t xml:space="preserve">() (nombre de método duplicado), </w:t>
+      </w:r>
+      <w:proofErr w:type="spellStart"/>
+      <w:r>
+        <w:t>cambiar_estadoSucursal</w:t>
+      </w:r>
+      <w:proofErr w:type="spellEnd"/>
+      <w:r>
+        <w:t xml:space="preserve">(), </w:t>
+      </w:r>
+      <w:proofErr w:type="spellStart"/>
+      <w:r>
+        <w:t>actualizar_sucursal</w:t>
+      </w:r>
+      <w:proofErr w:type="spellEnd"/>
+      <w:r>
+        <w:t>().</w:t>
       </w:r>
     </w:p>
     <w:p/>
@@ -17594,7 +19040,79 @@
         <w:t>Atributos:</w:t>
       </w:r>
       <w:r>
-        <w:t xml:space="preserve"> id_permisos (clave primaria), id_usuario (clave foránea), id_motivo (clave foránea), fecha_ini, hora_ini, fecha_fin, hora_fin, total_horas, observaciones, goce, status, adjunto, creado, hora_creado. </w:t>
+        <w:t xml:space="preserve"> </w:t>
+      </w:r>
+      <w:proofErr w:type="spellStart"/>
+      <w:r>
+        <w:t>id_permisos</w:t>
+      </w:r>
+      <w:proofErr w:type="spellEnd"/>
+      <w:r>
+        <w:t xml:space="preserve"> (clave primaria), </w:t>
+      </w:r>
+      <w:proofErr w:type="spellStart"/>
+      <w:r>
+        <w:t>id_usuario</w:t>
+      </w:r>
+      <w:proofErr w:type="spellEnd"/>
+      <w:r>
+        <w:t xml:space="preserve"> (clave foránea), </w:t>
+      </w:r>
+      <w:proofErr w:type="spellStart"/>
+      <w:r>
+        <w:t>id_motivo</w:t>
+      </w:r>
+      <w:proofErr w:type="spellEnd"/>
+      <w:r>
+        <w:t xml:space="preserve"> (clave foránea), </w:t>
+      </w:r>
+      <w:proofErr w:type="spellStart"/>
+      <w:r>
+        <w:t>fecha_ini</w:t>
+      </w:r>
+      <w:proofErr w:type="spellEnd"/>
+      <w:r>
+        <w:t xml:space="preserve">, </w:t>
+      </w:r>
+      <w:proofErr w:type="spellStart"/>
+      <w:r>
+        <w:t>hora_ini</w:t>
+      </w:r>
+      <w:proofErr w:type="spellEnd"/>
+      <w:r>
+        <w:t xml:space="preserve">, </w:t>
+      </w:r>
+      <w:proofErr w:type="spellStart"/>
+      <w:r>
+        <w:t>fecha_fin</w:t>
+      </w:r>
+      <w:proofErr w:type="spellEnd"/>
+      <w:r>
+        <w:t xml:space="preserve">, </w:t>
+      </w:r>
+      <w:proofErr w:type="spellStart"/>
+      <w:r>
+        <w:t>hora_fin</w:t>
+      </w:r>
+      <w:proofErr w:type="spellEnd"/>
+      <w:r>
+        <w:t xml:space="preserve">, </w:t>
+      </w:r>
+      <w:proofErr w:type="spellStart"/>
+      <w:r>
+        <w:t>total_horas</w:t>
+      </w:r>
+      <w:proofErr w:type="spellEnd"/>
+      <w:r>
+        <w:t xml:space="preserve">, observaciones, goce, status, adjunto, creado, </w:t>
+      </w:r>
+      <w:proofErr w:type="spellStart"/>
+      <w:r>
+        <w:t>hora_creado</w:t>
+      </w:r>
+      <w:proofErr w:type="spellEnd"/>
+      <w:r>
+        <w:t xml:space="preserve">. </w:t>
       </w:r>
     </w:p>
     <w:p>
@@ -17608,11 +19126,65 @@
       <w:r>
         <w:t xml:space="preserve"> </w:t>
       </w:r>
-      <w:r>
-        <w:t>nuevo_permiso(), guardar_permisos(), actualizar_permisos(), cambiar_estadoPermiso(), filtrar_permisos(), eliminar_permisos(), imprimir_permisos()</w:t>
-      </w:r>
-    </w:p>
-    <w:p>
+      <w:proofErr w:type="spellStart"/>
+      <w:r>
+        <w:t>nuevo_permiso</w:t>
+      </w:r>
+      <w:proofErr w:type="spellEnd"/>
+      <w:r>
+        <w:t xml:space="preserve">(), </w:t>
+      </w:r>
+      <w:proofErr w:type="spellStart"/>
+      <w:r>
+        <w:t>guardar_permisos</w:t>
+      </w:r>
+      <w:proofErr w:type="spellEnd"/>
+      <w:r>
+        <w:t xml:space="preserve">(), </w:t>
+      </w:r>
+      <w:proofErr w:type="spellStart"/>
+      <w:r>
+        <w:t>actualizar_permisos</w:t>
+      </w:r>
+      <w:proofErr w:type="spellEnd"/>
+      <w:r>
+        <w:t xml:space="preserve">(), </w:t>
+      </w:r>
+      <w:proofErr w:type="spellStart"/>
+      <w:r>
+        <w:t>cambiar_estadoPermiso</w:t>
+      </w:r>
+      <w:proofErr w:type="spellEnd"/>
+      <w:r>
+        <w:t xml:space="preserve">(), </w:t>
+      </w:r>
+      <w:proofErr w:type="spellStart"/>
+      <w:r>
+        <w:t>filtrar_permisos</w:t>
+      </w:r>
+      <w:proofErr w:type="spellEnd"/>
+      <w:r>
+        <w:t xml:space="preserve">(), </w:t>
+      </w:r>
+      <w:proofErr w:type="spellStart"/>
+      <w:r>
+        <w:t>eliminar_permisos</w:t>
+      </w:r>
+      <w:proofErr w:type="spellEnd"/>
+      <w:r>
+        <w:t xml:space="preserve">(), </w:t>
+      </w:r>
+      <w:proofErr w:type="spellStart"/>
+      <w:r>
+        <w:t>imprimir_permisos</w:t>
+      </w:r>
+      <w:proofErr w:type="spellEnd"/>
+      <w:r>
+        <w:t>()</w:t>
+      </w:r>
+    </w:p>
+    <w:p>
+      <w:proofErr w:type="spellStart"/>
       <w:r>
         <w:rPr>
           <w:b/>
@@ -17620,6 +19192,7 @@
         </w:rPr>
         <w:t>motivos_permisos</w:t>
       </w:r>
+      <w:proofErr w:type="spellEnd"/>
       <w:r>
         <w:t>:</w:t>
       </w:r>
@@ -17647,11 +19220,32 @@
       <w:r>
         <w:t xml:space="preserve"> </w:t>
       </w:r>
+      <w:proofErr w:type="spellStart"/>
       <w:r>
         <w:t>id_</w:t>
       </w:r>
       <w:r>
-        <w:t xml:space="preserve">motivo (clave primaria), descripcion, status, fecha_creacion. </w:t>
+        <w:t>motivo</w:t>
+      </w:r>
+      <w:proofErr w:type="spellEnd"/>
+      <w:r>
+        <w:t xml:space="preserve"> (clave primaria), </w:t>
+      </w:r>
+      <w:proofErr w:type="spellStart"/>
+      <w:r>
+        <w:t>descripcion</w:t>
+      </w:r>
+      <w:proofErr w:type="spellEnd"/>
+      <w:r>
+        <w:t xml:space="preserve">, status, </w:t>
+      </w:r>
+      <w:proofErr w:type="spellStart"/>
+      <w:r>
+        <w:t>fecha_creacion</w:t>
+      </w:r>
+      <w:proofErr w:type="spellEnd"/>
+      <w:r>
+        <w:t xml:space="preserve">. </w:t>
       </w:r>
     </w:p>
     <w:p>
@@ -17663,7 +19257,31 @@
         <w:t>Métodos:</w:t>
       </w:r>
       <w:r>
-        <w:t xml:space="preserve"> guardar_motivoPermisos(), actualizar_motivoPermisos(), cambiar_estadoMotivoPermisos()</w:t>
+        <w:t xml:space="preserve"> </w:t>
+      </w:r>
+      <w:proofErr w:type="spellStart"/>
+      <w:r>
+        <w:t>guardar_motivoPermisos</w:t>
+      </w:r>
+      <w:proofErr w:type="spellEnd"/>
+      <w:r>
+        <w:t xml:space="preserve">(), </w:t>
+      </w:r>
+      <w:proofErr w:type="spellStart"/>
+      <w:r>
+        <w:t>actualizar_motivoPermisos</w:t>
+      </w:r>
+      <w:proofErr w:type="spellEnd"/>
+      <w:r>
+        <w:t xml:space="preserve">(), </w:t>
+      </w:r>
+      <w:proofErr w:type="spellStart"/>
+      <w:r>
+        <w:t>cambiar_estadoMotivoPermisos</w:t>
+      </w:r>
+      <w:proofErr w:type="spellEnd"/>
+      <w:r>
+        <w:t>()</w:t>
       </w:r>
     </w:p>
     <w:p>
@@ -17699,7 +19317,79 @@
         <w:t>Atributos:</w:t>
       </w:r>
       <w:r>
-        <w:t xml:space="preserve"> id_vacaciones (clave primaria), anio (año), fecha_inicio, fecha_termino, dias, periodo, dia_usado, dia_pendiente, id_usuario (clave foránea), id_autoriza (clave foránea para el usuario que autoriza), </w:t>
+        <w:t xml:space="preserve"> </w:t>
+      </w:r>
+      <w:proofErr w:type="spellStart"/>
+      <w:r>
+        <w:t>id_vacaciones</w:t>
+      </w:r>
+      <w:proofErr w:type="spellEnd"/>
+      <w:r>
+        <w:t xml:space="preserve"> (clave primaria), </w:t>
+      </w:r>
+      <w:proofErr w:type="spellStart"/>
+      <w:r>
+        <w:t>anio</w:t>
+      </w:r>
+      <w:proofErr w:type="spellEnd"/>
+      <w:r>
+        <w:t xml:space="preserve"> (año), </w:t>
+      </w:r>
+      <w:proofErr w:type="spellStart"/>
+      <w:r>
+        <w:t>fecha_inicio</w:t>
+      </w:r>
+      <w:proofErr w:type="spellEnd"/>
+      <w:r>
+        <w:t xml:space="preserve">, </w:t>
+      </w:r>
+      <w:proofErr w:type="spellStart"/>
+      <w:r>
+        <w:t>fecha_termino</w:t>
+      </w:r>
+      <w:proofErr w:type="spellEnd"/>
+      <w:r>
+        <w:t xml:space="preserve">, </w:t>
+      </w:r>
+      <w:proofErr w:type="spellStart"/>
+      <w:r>
+        <w:t>dias</w:t>
+      </w:r>
+      <w:proofErr w:type="spellEnd"/>
+      <w:r>
+        <w:t xml:space="preserve">, periodo, </w:t>
+      </w:r>
+      <w:proofErr w:type="spellStart"/>
+      <w:r>
+        <w:t>dia_usado</w:t>
+      </w:r>
+      <w:proofErr w:type="spellEnd"/>
+      <w:r>
+        <w:t xml:space="preserve">, </w:t>
+      </w:r>
+      <w:proofErr w:type="spellStart"/>
+      <w:r>
+        <w:t>dia_pendiente</w:t>
+      </w:r>
+      <w:proofErr w:type="spellEnd"/>
+      <w:r>
+        <w:t xml:space="preserve">, </w:t>
+      </w:r>
+      <w:proofErr w:type="spellStart"/>
+      <w:r>
+        <w:t>id_usuario</w:t>
+      </w:r>
+      <w:proofErr w:type="spellEnd"/>
+      <w:r>
+        <w:t xml:space="preserve"> (clave foránea), </w:t>
+      </w:r>
+      <w:proofErr w:type="spellStart"/>
+      <w:r>
+        <w:t>id_autoriza</w:t>
+      </w:r>
+      <w:proofErr w:type="spellEnd"/>
+      <w:r>
+        <w:t xml:space="preserve"> (clave foránea para el usuario que autoriza), </w:t>
       </w:r>
       <w:r>
         <w:t>aprobación</w:t>
@@ -17718,37 +19408,84 @@
         <w:t>Métodos:</w:t>
       </w:r>
       <w:r>
-        <w:t xml:space="preserve"> nuevo_vacacaciones(), guardar_vacaciones(), actualizar_vacaciones(), cambiar_estadoVacaciones(), asignar_vacaciones(), imprimir_vacaciones(), eliminar_vacaciones().</w:t>
-      </w:r>
-    </w:p>
-    <w:p>
+        <w:t xml:space="preserve"> </w:t>
+      </w:r>
+      <w:proofErr w:type="spellStart"/>
+      <w:r>
+        <w:t>nuevo_vacacaciones</w:t>
+      </w:r>
+      <w:proofErr w:type="spellEnd"/>
+      <w:r>
+        <w:t xml:space="preserve">(), </w:t>
+      </w:r>
+      <w:proofErr w:type="spellStart"/>
+      <w:r>
+        <w:t>guardar_vacaciones</w:t>
+      </w:r>
+      <w:proofErr w:type="spellEnd"/>
+      <w:r>
+        <w:t xml:space="preserve">(), </w:t>
+      </w:r>
+      <w:proofErr w:type="spellStart"/>
+      <w:r>
+        <w:t>actualizar_vacaciones</w:t>
+      </w:r>
+      <w:proofErr w:type="spellEnd"/>
+      <w:r>
+        <w:t xml:space="preserve">(), </w:t>
+      </w:r>
+      <w:proofErr w:type="spellStart"/>
+      <w:r>
+        <w:t>cambiar_estadoVacaciones</w:t>
+      </w:r>
+      <w:proofErr w:type="spellEnd"/>
+      <w:r>
+        <w:t xml:space="preserve">(), </w:t>
+      </w:r>
+      <w:proofErr w:type="spellStart"/>
+      <w:r>
+        <w:t>asignar_vacaciones</w:t>
+      </w:r>
+      <w:proofErr w:type="spellEnd"/>
+      <w:r>
+        <w:t xml:space="preserve">(), </w:t>
+      </w:r>
+      <w:proofErr w:type="spellStart"/>
+      <w:r>
+        <w:t>imprimir_vacaciones</w:t>
+      </w:r>
+      <w:proofErr w:type="spellEnd"/>
+      <w:r>
+        <w:t xml:space="preserve">(), </w:t>
+      </w:r>
+      <w:proofErr w:type="spellStart"/>
+      <w:r>
+        <w:t>eliminar_vacaciones</w:t>
+      </w:r>
+      <w:proofErr w:type="spellEnd"/>
+      <w:r>
+        <w:t>().</w:t>
+      </w:r>
+    </w:p>
+    <w:p>
+      <w:proofErr w:type="spellStart"/>
       <w:r>
         <w:rPr>
           <w:b/>
           <w:bCs/>
         </w:rPr>
-        <w:t>centro_costo (Centro de Costo)</w:t>
-      </w:r>
-      <w:r>
-        <w:t>:</w:t>
-      </w:r>
-    </w:p>
-    <w:p>
+        <w:t>centro_costo</w:t>
+      </w:r>
+      <w:proofErr w:type="spellEnd"/>
       <w:r>
         <w:rPr>
           <w:b/>
           <w:bCs/>
         </w:rPr>
-        <w:t>Propósito:</w:t>
-      </w:r>
-      <w:r>
-        <w:t xml:space="preserve"> Gestiona</w:t>
-      </w:r>
-      <w:r>
-        <w:t>r</w:t>
-      </w:r>
-      <w:r>
-        <w:t xml:space="preserve"> los centros de costo para el seguimiento financiero.</w:t>
+        <w:t xml:space="preserve"> (Centro de Costo)</w:t>
+      </w:r>
+      <w:r>
+        <w:t>:</w:t>
       </w:r>
     </w:p>
     <w:p>
@@ -17757,10 +19494,16 @@
           <w:b/>
           <w:bCs/>
         </w:rPr>
-        <w:t>Atributos:</w:t>
-      </w:r>
-      <w:r>
-        <w:t xml:space="preserve"> id_centro (clave primaria), fecha_creacion, descripcion, status. </w:t>
+        <w:t>Propósito:</w:t>
+      </w:r>
+      <w:r>
+        <w:t xml:space="preserve"> Gestiona</w:t>
+      </w:r>
+      <w:r>
+        <w:t>r</w:t>
+      </w:r>
+      <w:r>
+        <w:t xml:space="preserve"> los centros de costo para el seguimiento financiero.</w:t>
       </w:r>
     </w:p>
     <w:p>
@@ -17769,10 +19512,34 @@
           <w:b/>
           <w:bCs/>
         </w:rPr>
-        <w:t>Métodos:</w:t>
-      </w:r>
-      <w:r>
-        <w:t xml:space="preserve"> nuevo_CC(), guardar_CC(), actualizar_CC(), cambiar_estadoCC()</w:t>
+        <w:t>Atributos:</w:t>
+      </w:r>
+      <w:r>
+        <w:t xml:space="preserve"> </w:t>
+      </w:r>
+      <w:proofErr w:type="spellStart"/>
+      <w:r>
+        <w:t>id_centro</w:t>
+      </w:r>
+      <w:proofErr w:type="spellEnd"/>
+      <w:r>
+        <w:t xml:space="preserve"> (clave primaria), </w:t>
+      </w:r>
+      <w:proofErr w:type="spellStart"/>
+      <w:r>
+        <w:t>fecha_creacion</w:t>
+      </w:r>
+      <w:proofErr w:type="spellEnd"/>
+      <w:r>
+        <w:t xml:space="preserve">, </w:t>
+      </w:r>
+      <w:proofErr w:type="spellStart"/>
+      <w:r>
+        <w:t>descripcion</w:t>
+      </w:r>
+      <w:proofErr w:type="spellEnd"/>
+      <w:r>
+        <w:t xml:space="preserve">, status. </w:t>
       </w:r>
     </w:p>
     <w:p>
@@ -17781,6 +19548,50 @@
           <w:b/>
           <w:bCs/>
         </w:rPr>
+        <w:t>Métodos:</w:t>
+      </w:r>
+      <w:r>
+        <w:t xml:space="preserve"> </w:t>
+      </w:r>
+      <w:proofErr w:type="spellStart"/>
+      <w:r>
+        <w:t>nuevo_CC</w:t>
+      </w:r>
+      <w:proofErr w:type="spellEnd"/>
+      <w:r>
+        <w:t xml:space="preserve">(), </w:t>
+      </w:r>
+      <w:proofErr w:type="spellStart"/>
+      <w:r>
+        <w:t>guardar_CC</w:t>
+      </w:r>
+      <w:proofErr w:type="spellEnd"/>
+      <w:r>
+        <w:t xml:space="preserve">(), </w:t>
+      </w:r>
+      <w:proofErr w:type="spellStart"/>
+      <w:r>
+        <w:t>actualizar_CC</w:t>
+      </w:r>
+      <w:proofErr w:type="spellEnd"/>
+      <w:r>
+        <w:t xml:space="preserve">(), </w:t>
+      </w:r>
+      <w:proofErr w:type="spellStart"/>
+      <w:r>
+        <w:t>cambiar_estadoCC</w:t>
+      </w:r>
+      <w:proofErr w:type="spellEnd"/>
+      <w:r>
+        <w:t>()</w:t>
+      </w:r>
+    </w:p>
+    <w:p>
+      <w:r>
+        <w:rPr>
+          <w:b/>
+          <w:bCs/>
+        </w:rPr>
         <w:t>Relación</w:t>
       </w:r>
       <w:r>
@@ -17846,9 +19657,19 @@
       </w:r>
     </w:p>
     <w:p>
-      <w:r>
-        <w:t>Tipo_contrato puede tener de 1 a mucho usuarios y usuarios pueden tener 1 tipo_contrato</w:t>
-      </w:r>
+      <w:proofErr w:type="spellStart"/>
+      <w:r>
+        <w:t>Tipo_contrato</w:t>
+      </w:r>
+      <w:proofErr w:type="spellEnd"/>
+      <w:r>
+        <w:t xml:space="preserve"> puede tener de 1 a mucho usuarios y usuarios pueden tener 1 </w:t>
+      </w:r>
+      <w:proofErr w:type="spellStart"/>
+      <w:r>
+        <w:t>tipo_contrato</w:t>
+      </w:r>
+      <w:proofErr w:type="spellEnd"/>
       <w:r>
         <w:t>, el tipo de contrato puede existir sin que exista usuario.</w:t>
       </w:r>
@@ -17892,7 +19713,11 @@
         <w:t xml:space="preserve">Empresas puede tener de 1 a </w:t>
       </w:r>
       <w:r>
-        <w:t>mucho tipo</w:t>
+        <w:t xml:space="preserve">mucho </w:t>
+      </w:r>
+      <w:proofErr w:type="spellStart"/>
+      <w:r>
+        <w:t>tipo</w:t>
       </w:r>
       <w:r>
         <w:t>_</w:t>
@@ -17901,7 +19726,19 @@
         <w:t>contrato,</w:t>
       </w:r>
       <w:r>
-        <w:t>pero a su vez tipo_contrato puede tener 1 empresa.</w:t>
+        <w:t>pero</w:t>
+      </w:r>
+      <w:proofErr w:type="spellEnd"/>
+      <w:r>
+        <w:t xml:space="preserve"> a su vez </w:t>
+      </w:r>
+      <w:proofErr w:type="spellStart"/>
+      <w:r>
+        <w:t>tipo_contrato</w:t>
+      </w:r>
+      <w:proofErr w:type="spellEnd"/>
+      <w:r>
+        <w:t xml:space="preserve"> puede tener 1 empresa.</w:t>
       </w:r>
     </w:p>
     <w:p>
@@ -17942,8 +19779,13 @@
       </w:r>
     </w:p>
     <w:p>
-      <w:r>
-        <w:t>Centro_costo puede tener de 1 a muchos usuarios, pero usuarios puede</w:t>
+      <w:proofErr w:type="spellStart"/>
+      <w:r>
+        <w:t>Centro_costo</w:t>
+      </w:r>
+      <w:proofErr w:type="spellEnd"/>
+      <w:r>
+        <w:t xml:space="preserve"> puede tener de 1 a muchos usuarios, pero usuarios puede</w:t>
       </w:r>
       <w:r>
         <w:t xml:space="preserve"> </w:t>
@@ -17991,7 +19833,15 @@
     <w:p/>
     <w:p>
       <w:r>
-        <w:t>El diagrama presentado ilustra la estructura de navegación del sistema, el cual está orientada a la gestión de turnos y administración de personal. La representación gráfica muestra una vista jerárquica de los módulos principales que conforman la interfaz del usuario, donde cada bloque azul corresponde a una interfaz del sistema, acompañada de su respectiva funcionalidad las cuales se ven representadas en bloques rosados. Desde esta interfaz principal se accede a distintos módulos, entre ellos la sección de turnos, que permite gestionar la asignación, modificación y visualización de los turnos de trabajo del personal, el módulo de ingreso de empleado, orientado al registro de nuesvos trabajadores y la edición de sus datos personales y laborales, y el apartado de tablas maestras, que centraliza la configuración básica del sistema, como los tipos de turnos, departamentos y demás parámetros estructurales y finalmente una opción de salida que permite cerrar sesión de manera manual. Esta estructura de navegación refleja una organización lógica y coherente, lo que facilita el uso del sistema por parte del usuario final, además de servir como una herramienta útil para comprender la arquitectura funcional de la aplicación</w:t>
+        <w:t xml:space="preserve">El diagrama presentado ilustra la estructura de navegación del sistema, el cual está orientada a la gestión de turnos y administración de personal. La representación gráfica muestra una vista jerárquica de los módulos principales que conforman la interfaz del usuario, donde cada bloque azul corresponde a una interfaz del sistema, acompañada de su respectiva funcionalidad las cuales se ven representadas en bloques rosados. Desde esta interfaz principal se accede a distintos módulos, entre ellos la sección de turnos, que permite gestionar la asignación, modificación y visualización de los turnos de trabajo del personal, el módulo de ingreso de empleado, orientado al registro de </w:t>
+      </w:r>
+      <w:proofErr w:type="spellStart"/>
+      <w:r>
+        <w:t>nuesvos</w:t>
+      </w:r>
+      <w:proofErr w:type="spellEnd"/>
+      <w:r>
+        <w:t xml:space="preserve"> trabajadores y la edición de sus datos personales y laborales, y el apartado de tablas maestras, que centraliza la configuración básica del sistema, como los tipos de turnos, departamentos y demás parámetros estructurales y finalmente una opción de salida que permite cerrar sesión de manera manual. Esta estructura de navegación refleja una organización lógica y coherente, lo que facilita el uso del sistema por parte del usuario final, además de servir como una herramienta útil para comprender la arquitectura funcional de la aplicación</w:t>
       </w:r>
     </w:p>
     <w:p>
@@ -18004,8 +19854,13 @@
         <w:pStyle w:val="Ttulo2"/>
       </w:pPr>
       <w:bookmarkStart w:id="194" w:name="_Toc211882633"/>
-      <w:r>
-        <w:t xml:space="preserve">Pdf </w:t>
+      <w:proofErr w:type="spellStart"/>
+      <w:r>
+        <w:t>Pdf</w:t>
+      </w:r>
+      <w:proofErr w:type="spellEnd"/>
+      <w:r>
+        <w:t xml:space="preserve"> </w:t>
       </w:r>
       <w:r>
         <w:t>Tabla de esfuerzo</w:t>
@@ -18022,9 +19877,9 @@
       <w:r>
         <w:object w:dxaOrig="1530" w:dyaOrig="995" w14:anchorId="0E4E0928">
           <v:shape id="_x0000_i1030" type="#_x0000_t75" style="width:79.55pt;height:50.25pt" o:ole="">
-            <v:imagedata r:id="rId40" o:title=""/>
+            <v:imagedata r:id="rId42" o:title=""/>
           </v:shape>
-          <o:OLEObject Type="Embed" ProgID="Package" ShapeID="_x0000_i1030" DrawAspect="Icon" ObjectID="_1822569359" r:id="rId41"/>
+          <o:OLEObject Type="Embed" ProgID="Package" ShapeID="_x0000_i1030" DrawAspect="Icon" ObjectID="_1822756722" r:id="rId43"/>
         </w:object>
       </w:r>
     </w:p>
@@ -18057,7 +19912,31 @@
         <w:t xml:space="preserve"> </w:t>
       </w:r>
       <w:r>
-        <w:t>GB de RAM, un procesador Intel Xeon E5-2603 V3 y el sistema operativo Windows Server 2012. Este servidor aloja componentes clave como Apache (servidor web), PHP (lenguaje de scripting), MySQL/mariaDB (base de datos), y frameworks front-end como Bootstrap, CSS y JavaScript. Las funcionalidades ejecutables del servidor replican y amplían las del PC Usuario, garantizando el procesamiento y almacenamiento centralizado de toda la información, incluyendo un controlador específico para MySQL y la capacidad de almacenar datos.</w:t>
+        <w:t>GB de RAM, un procesador Intel Xeon E5-2603 V3 y el sistema operativo Windows Server 2012. Este servidor aloja componentes clave como Apache (servidor web), PHP (lenguaje de scripting), MySQL/</w:t>
+      </w:r>
+      <w:proofErr w:type="spellStart"/>
+      <w:r>
+        <w:t>mariaDB</w:t>
+      </w:r>
+      <w:proofErr w:type="spellEnd"/>
+      <w:r>
+        <w:t xml:space="preserve"> (base de datos), y </w:t>
+      </w:r>
+      <w:proofErr w:type="spellStart"/>
+      <w:r>
+        <w:t>frameworks</w:t>
+      </w:r>
+      <w:proofErr w:type="spellEnd"/>
+      <w:r>
+        <w:t xml:space="preserve"> </w:t>
+      </w:r>
+      <w:proofErr w:type="spellStart"/>
+      <w:r>
+        <w:t>front-end</w:t>
+      </w:r>
+      <w:proofErr w:type="spellEnd"/>
+      <w:r>
+        <w:t xml:space="preserve"> como Bootstrap, CSS y JavaScript. Las funcionalidades ejecutables del servidor replican y amplían las del PC Usuario, garantizando el procesamiento y almacenamiento centralizado de toda la información, incluyendo un controlador específico para MySQL y la capacidad de almacenar datos.</w:t>
       </w:r>
     </w:p>
     <w:p>
@@ -18231,8 +20110,8 @@
       </w:pPr>
     </w:p>
     <w:sectPr>
-      <w:headerReference w:type="default" r:id="rId42"/>
-      <w:footerReference w:type="default" r:id="rId43"/>
+      <w:headerReference w:type="default" r:id="rId44"/>
+      <w:footerReference w:type="default" r:id="rId45"/>
       <w:pgSz w:w="12240" w:h="15840" w:code="1"/>
       <w:pgMar w:top="1418" w:right="1418" w:bottom="1418" w:left="1418" w:header="709" w:footer="851" w:gutter="0"/>
       <w:pgNumType w:start="1"/>
@@ -26322,6 +28201,12 @@
 </file>
 
 <file path=customXml/item1.xml><?xml version="1.0" encoding="utf-8"?>
+<go:gDocsCustomXmlDataStorage xmlns:go="http://customooxmlschemas.google.com/" xmlns:r="http://schemas.openxmlformats.org/officeDocument/2006/relationships" uri="GoogleDocsCustomDataVersion2">
+  <go:docsCustomData xmlns:go="http://customooxmlschemas.google.com/" roundtripDataSignature="AMtx7mgzDLvJQrn/s3t721qKHDOuEhpMiQ==">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</go:docsCustomData>
+</go:gDocsCustomXmlDataStorage>
+</file>
+
+<file path=customXml/item2.xml><?xml version="1.0" encoding="utf-8"?>
 <b:Sources xmlns:b="http://schemas.openxmlformats.org/officeDocument/2006/bibliography" xmlns="http://schemas.openxmlformats.org/officeDocument/2006/bibliography" SelectedStyle="\APASixthEditionOfficeOnline.xsl" StyleName="APA" Version="6">
   <b:Source>
     <b:Tag>Eug25</b:Tag>
@@ -26410,25 +28295,19 @@
 </b:Sources>
 </file>
 
-<file path=customXml/item2.xml><?xml version="1.0" encoding="utf-8"?>
-<go:gDocsCustomXmlDataStorage xmlns:go="http://customooxmlschemas.google.com/" xmlns:r="http://schemas.openxmlformats.org/officeDocument/2006/relationships" uri="GoogleDocsCustomDataVersion2">
-  <go:docsCustomData xmlns:go="http://customooxmlschemas.google.com/" roundtripDataSignature="AMtx7mgzDLvJQrn/s3t721qKHDOuEhpMiQ==">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</go:docsCustomData>
-</go:gDocsCustomXmlDataStorage>
-</file>
-
 <file path=customXml/itemProps1.xml><?xml version="1.0" encoding="utf-8"?>
-<ds:datastoreItem xmlns:ds="http://schemas.openxmlformats.org/officeDocument/2006/customXml" ds:itemID="{D7966003-8400-4354-952A-39E3FBC3C487}">
-  <ds:schemaRefs>
-    <ds:schemaRef ds:uri="http://schemas.openxmlformats.org/officeDocument/2006/bibliography"/>
-  </ds:schemaRefs>
-</ds:datastoreItem>
-</file>
-
-<file path=customXml/itemProps2.xml><?xml version="1.0" encoding="utf-8"?>
 <ds:datastoreItem xmlns:ds="http://schemas.openxmlformats.org/officeDocument/2006/customXml" ds:itemID="{11111111-1234-1234-1234-123412341234}">
   <ds:schemaRefs>
     <ds:schemaRef ds:uri="http://customooxmlschemas.google.com/"/>
     <ds:schemaRef ds:uri="http://schemas.openxmlformats.org/officeDocument/2006/relationships"/>
   </ds:schemaRefs>
 </ds:datastoreItem>
+</file>
+
+<file path=customXml/itemProps2.xml><?xml version="1.0" encoding="utf-8"?>
+<ds:datastoreItem xmlns:ds="http://schemas.openxmlformats.org/officeDocument/2006/customXml" ds:itemID="{D7966003-8400-4354-952A-39E3FBC3C487}">
+  <ds:schemaRefs>
+    <ds:schemaRef ds:uri="http://schemas.openxmlformats.org/officeDocument/2006/bibliography"/>
+  </ds:schemaRefs>
+</ds:datastoreItem>
 </file>
</xml_diff>

<commit_message>
up graficos burn up y down
</commit_message>
<xml_diff>
--- a/INCREMENTO3/Documentos/Tercer incremento Scrum++.docx
+++ b/INCREMENTO3/Documentos/Tercer incremento Scrum++.docx
@@ -15435,6 +15435,9 @@
         <w:t>Fuente: Elaborado por el estudiante de acuerdo con el proyecto</w:t>
       </w:r>
       <w:r>
+        <w:rPr>
+          <w:noProof/>
+        </w:rPr>
         <w:drawing>
           <wp:inline distT="0" distB="0" distL="0" distR="0" wp14:anchorId="123E1067" wp14:editId="2C936914">
             <wp:extent cx="5971540" cy="5589905"/>
@@ -15624,6 +15627,9 @@
         <w:t>Fuente: Elaborado por el estudiante de acuerdo con el proyecto</w:t>
       </w:r>
       <w:r>
+        <w:rPr>
+          <w:noProof/>
+        </w:rPr>
         <w:drawing>
           <wp:inline distT="0" distB="0" distL="0" distR="0" wp14:anchorId="24EAD238" wp14:editId="5163E100">
             <wp:extent cx="5971540" cy="5561965"/>
@@ -15818,6 +15824,9 @@
         <w:t>Fuente: Elaborado por el estudiante de acuerdo con el proyecto</w:t>
       </w:r>
       <w:r>
+        <w:rPr>
+          <w:noProof/>
+        </w:rPr>
         <w:drawing>
           <wp:inline distT="0" distB="0" distL="0" distR="0" wp14:anchorId="231882C7" wp14:editId="44EDBE0D">
             <wp:extent cx="5971540" cy="5244465"/>
@@ -16001,6 +16010,9 @@
         <w:t>Fuente: Elaborado por el estudiante de acuerdo con el proyecto</w:t>
       </w:r>
       <w:r>
+        <w:rPr>
+          <w:noProof/>
+        </w:rPr>
         <w:drawing>
           <wp:inline distT="0" distB="0" distL="0" distR="0" wp14:anchorId="21D5E4C0" wp14:editId="09823447">
             <wp:extent cx="5971540" cy="5032375"/>
@@ -16306,8 +16318,49 @@
     </w:p>
     <w:p>
       <w:pPr>
-        <w:ind w:firstLine="0"/>
-      </w:pPr>
+        <w:pStyle w:val="Sinespaciado"/>
+      </w:pPr>
+      <w:r>
+        <w:rPr>
+          <w:noProof/>
+        </w:rPr>
+        <w:lastRenderedPageBreak/>
+        <w:drawing>
+          <wp:inline distT="0" distB="0" distL="0" distR="0" wp14:anchorId="79AFBB3D" wp14:editId="6564FACE">
+            <wp:extent cx="6159261" cy="1433711"/>
+            <wp:effectExtent l="0" t="0" r="0" b="0"/>
+            <wp:docPr id="1746214186" name="Imagen 1" descr="Aplicación&#10;&#10;El contenido generado por IA puede ser incorrecto."/>
+            <wp:cNvGraphicFramePr>
+              <a:graphicFrameLocks xmlns:a="http://schemas.openxmlformats.org/drawingml/2006/main" noChangeAspect="1"/>
+            </wp:cNvGraphicFramePr>
+            <a:graphic xmlns:a="http://schemas.openxmlformats.org/drawingml/2006/main">
+              <a:graphicData uri="http://schemas.openxmlformats.org/drawingml/2006/picture">
+                <pic:pic xmlns:pic="http://schemas.openxmlformats.org/drawingml/2006/picture">
+                  <pic:nvPicPr>
+                    <pic:cNvPr id="1746214186" name="Imagen 1" descr="Aplicación&#10;&#10;El contenido generado por IA puede ser incorrecto."/>
+                    <pic:cNvPicPr/>
+                  </pic:nvPicPr>
+                  <pic:blipFill>
+                    <a:blip r:embed="rId35"/>
+                    <a:stretch>
+                      <a:fillRect/>
+                    </a:stretch>
+                  </pic:blipFill>
+                  <pic:spPr>
+                    <a:xfrm>
+                      <a:off x="0" y="0"/>
+                      <a:ext cx="6170009" cy="1436213"/>
+                    </a:xfrm>
+                    <a:prstGeom prst="rect">
+                      <a:avLst/>
+                    </a:prstGeom>
+                  </pic:spPr>
+                </pic:pic>
+              </a:graphicData>
+            </a:graphic>
+          </wp:inline>
+        </w:drawing>
+      </w:r>
     </w:p>
     <w:p>
       <w:pPr>
@@ -16418,7 +16471,33 @@
         <w:t>que d</w:t>
       </w:r>
       <w:r>
-        <w:t>emuestra más explícitamente como la cantidad de horas (Línea Naranja) van disminuyendo, así mismo como las tareas programadas (Línea Azul) van disminuyendo con relación al tiempo invertido</w:t>
+        <w:t xml:space="preserve">emuestra más explícitamente como la cantidad de </w:t>
+      </w:r>
+      <w:proofErr w:type="gramStart"/>
+      <w:r>
+        <w:t xml:space="preserve">horas </w:t>
+      </w:r>
+      <w:r>
+        <w:t xml:space="preserve"> estimadas</w:t>
+      </w:r>
+      <w:proofErr w:type="gramEnd"/>
+      <w:r>
+        <w:t xml:space="preserve"> </w:t>
+      </w:r>
+      <w:r>
+        <w:t xml:space="preserve">(Línea Naranja) van disminuyendo, así mismo como las </w:t>
+      </w:r>
+      <w:r>
+        <w:t>horas</w:t>
+      </w:r>
+      <w:r>
+        <w:t xml:space="preserve"> </w:t>
+      </w:r>
+      <w:r>
+        <w:t>reales</w:t>
+      </w:r>
+      <w:r>
+        <w:t xml:space="preserve"> (Línea Azul) van disminuyendo con relación al tiempo invertido</w:t>
       </w:r>
       <w:r>
         <w:t>.</w:t>
@@ -16483,14 +16562,57 @@
     <w:p>
       <w:pPr>
         <w:pStyle w:val="Sinespaciado"/>
+      </w:pPr>
+      <w:r>
         <w:rPr>
           <w:noProof/>
         </w:rPr>
-      </w:pPr>
+        <w:lastRenderedPageBreak/>
+        <w:drawing>
+          <wp:inline distT="0" distB="0" distL="0" distR="0" wp14:anchorId="2914BA5C" wp14:editId="5D166225">
+            <wp:extent cx="5971540" cy="3151505"/>
+            <wp:effectExtent l="0" t="0" r="0" b="0"/>
+            <wp:docPr id="998075411" name="Imagen 1" descr="Gráfico, Gráfico de líneas&#10;&#10;El contenido generado por IA puede ser incorrecto."/>
+            <wp:cNvGraphicFramePr>
+              <a:graphicFrameLocks xmlns:a="http://schemas.openxmlformats.org/drawingml/2006/main" noChangeAspect="1"/>
+            </wp:cNvGraphicFramePr>
+            <a:graphic xmlns:a="http://schemas.openxmlformats.org/drawingml/2006/main">
+              <a:graphicData uri="http://schemas.openxmlformats.org/drawingml/2006/picture">
+                <pic:pic xmlns:pic="http://schemas.openxmlformats.org/drawingml/2006/picture">
+                  <pic:nvPicPr>
+                    <pic:cNvPr id="998075411" name="Imagen 1" descr="Gráfico, Gráfico de líneas&#10;&#10;El contenido generado por IA puede ser incorrecto."/>
+                    <pic:cNvPicPr/>
+                  </pic:nvPicPr>
+                  <pic:blipFill>
+                    <a:blip r:embed="rId36"/>
+                    <a:stretch>
+                      <a:fillRect/>
+                    </a:stretch>
+                  </pic:blipFill>
+                  <pic:spPr>
+                    <a:xfrm>
+                      <a:off x="0" y="0"/>
+                      <a:ext cx="5971540" cy="3151505"/>
+                    </a:xfrm>
+                    <a:prstGeom prst="rect">
+                      <a:avLst/>
+                    </a:prstGeom>
+                  </pic:spPr>
+                </pic:pic>
+              </a:graphicData>
+            </a:graphic>
+          </wp:inline>
+        </w:drawing>
+      </w:r>
     </w:p>
     <w:p>
       <w:pPr>
         <w:pStyle w:val="Sinespaciado"/>
+      </w:pPr>
+    </w:p>
+    <w:p>
+      <w:pPr>
+        <w:pStyle w:val="Sinespaciado"/>
         <w:rPr>
           <w:noProof/>
         </w:rPr>
@@ -16507,6 +16629,14 @@
     <w:p>
       <w:pPr>
         <w:pStyle w:val="Sinespaciado"/>
+        <w:rPr>
+          <w:noProof/>
+        </w:rPr>
+      </w:pPr>
+    </w:p>
+    <w:p>
+      <w:pPr>
+        <w:pStyle w:val="Sinespaciado"/>
       </w:pPr>
     </w:p>
     <w:p>
@@ -16521,7 +16651,6 @@
       </w:pPr>
       <w:bookmarkStart w:id="163" w:name="_Toc211882620"/>
       <w:r>
-        <w:lastRenderedPageBreak/>
         <w:t xml:space="preserve">Burn </w:t>
       </w:r>
       <w:r>
@@ -16574,6 +16703,7 @@
       <w:bookmarkStart w:id="167" w:name="_Toc201199747"/>
       <w:bookmarkStart w:id="168" w:name="_Toc211609267"/>
       <w:r>
+        <w:lastRenderedPageBreak/>
         <w:t xml:space="preserve">Figura </w:t>
       </w:r>
       <w:fldSimple w:instr=" STYLEREF 1 \s ">
@@ -16621,13 +16751,51 @@
     </w:p>
     <w:p>
       <w:pPr>
-        <w:spacing w:after="0" w:line="240" w:lineRule="auto"/>
-        <w:ind w:firstLine="0"/>
-        <w:jc w:val="left"/>
+        <w:pStyle w:val="Sinespaciado"/>
         <w:rPr>
           <w:rFonts w:eastAsia="Times New Roman" w:cs="Times New Roman"/>
         </w:rPr>
       </w:pPr>
+      <w:r>
+        <w:rPr>
+          <w:noProof/>
+        </w:rPr>
+        <w:drawing>
+          <wp:inline distT="0" distB="0" distL="0" distR="0" wp14:anchorId="0A5365BC" wp14:editId="755A02D9">
+            <wp:extent cx="5971540" cy="3509010"/>
+            <wp:effectExtent l="0" t="0" r="0" b="0"/>
+            <wp:docPr id="1896129665" name="Imagen 1" descr="Gráfico, Gráfico de líneas&#10;&#10;El contenido generado por IA puede ser incorrecto."/>
+            <wp:cNvGraphicFramePr>
+              <a:graphicFrameLocks xmlns:a="http://schemas.openxmlformats.org/drawingml/2006/main" noChangeAspect="1"/>
+            </wp:cNvGraphicFramePr>
+            <a:graphic xmlns:a="http://schemas.openxmlformats.org/drawingml/2006/main">
+              <a:graphicData uri="http://schemas.openxmlformats.org/drawingml/2006/picture">
+                <pic:pic xmlns:pic="http://schemas.openxmlformats.org/drawingml/2006/picture">
+                  <pic:nvPicPr>
+                    <pic:cNvPr id="1896129665" name="Imagen 1" descr="Gráfico, Gráfico de líneas&#10;&#10;El contenido generado por IA puede ser incorrecto."/>
+                    <pic:cNvPicPr/>
+                  </pic:nvPicPr>
+                  <pic:blipFill>
+                    <a:blip r:embed="rId37"/>
+                    <a:stretch>
+                      <a:fillRect/>
+                    </a:stretch>
+                  </pic:blipFill>
+                  <pic:spPr>
+                    <a:xfrm>
+                      <a:off x="0" y="0"/>
+                      <a:ext cx="5971540" cy="3509010"/>
+                    </a:xfrm>
+                    <a:prstGeom prst="rect">
+                      <a:avLst/>
+                    </a:prstGeom>
+                  </pic:spPr>
+                </pic:pic>
+              </a:graphicData>
+            </a:graphic>
+          </wp:inline>
+        </w:drawing>
+      </w:r>
     </w:p>
     <w:p>
       <w:pPr>
@@ -16724,6 +16892,7 @@
       <w:bookmarkStart w:id="173" w:name="_Toc201199748"/>
       <w:bookmarkStart w:id="174" w:name="_Toc211609268"/>
       <w:r>
+        <w:lastRenderedPageBreak/>
         <w:t xml:space="preserve">Figura </w:t>
       </w:r>
       <w:fldSimple w:instr=" STYLEREF 1 \s ">
@@ -16753,6 +16922,51 @@
       <w:bookmarkEnd w:id="172"/>
       <w:bookmarkEnd w:id="173"/>
       <w:bookmarkEnd w:id="174"/>
+    </w:p>
+    <w:p>
+      <w:pPr>
+        <w:pStyle w:val="Sinespaciado"/>
+      </w:pPr>
+      <w:r>
+        <w:rPr>
+          <w:noProof/>
+        </w:rPr>
+        <w:drawing>
+          <wp:inline distT="0" distB="0" distL="0" distR="0" wp14:anchorId="40129326" wp14:editId="1D3DC68C">
+            <wp:extent cx="5971540" cy="4400550"/>
+            <wp:effectExtent l="0" t="0" r="0" b="0"/>
+            <wp:docPr id="106462471" name="Imagen 1" descr="Gráfico, Gráfico de barras&#10;&#10;El contenido generado por IA puede ser incorrecto."/>
+            <wp:cNvGraphicFramePr>
+              <a:graphicFrameLocks xmlns:a="http://schemas.openxmlformats.org/drawingml/2006/main" noChangeAspect="1"/>
+            </wp:cNvGraphicFramePr>
+            <a:graphic xmlns:a="http://schemas.openxmlformats.org/drawingml/2006/main">
+              <a:graphicData uri="http://schemas.openxmlformats.org/drawingml/2006/picture">
+                <pic:pic xmlns:pic="http://schemas.openxmlformats.org/drawingml/2006/picture">
+                  <pic:nvPicPr>
+                    <pic:cNvPr id="106462471" name="Imagen 1" descr="Gráfico, Gráfico de barras&#10;&#10;El contenido generado por IA puede ser incorrecto."/>
+                    <pic:cNvPicPr/>
+                  </pic:nvPicPr>
+                  <pic:blipFill>
+                    <a:blip r:embed="rId38"/>
+                    <a:stretch>
+                      <a:fillRect/>
+                    </a:stretch>
+                  </pic:blipFill>
+                  <pic:spPr>
+                    <a:xfrm>
+                      <a:off x="0" y="0"/>
+                      <a:ext cx="5971540" cy="4400550"/>
+                    </a:xfrm>
+                    <a:prstGeom prst="rect">
+                      <a:avLst/>
+                    </a:prstGeom>
+                  </pic:spPr>
+                </pic:pic>
+              </a:graphicData>
+            </a:graphic>
+          </wp:inline>
+        </w:drawing>
+      </w:r>
     </w:p>
     <w:p/>
     <w:p>
@@ -16896,7 +17110,7 @@
                     <pic:cNvPicPr/>
                   </pic:nvPicPr>
                   <pic:blipFill>
-                    <a:blip r:embed="rId35"/>
+                    <a:blip r:embed="rId39"/>
                     <a:stretch>
                       <a:fillRect/>
                     </a:stretch>
@@ -17104,18 +17318,18 @@
             <v:path o:extrusionok="f" gradientshapeok="t" o:connecttype="rect"/>
             <o:lock v:ext="edit" aspectratio="t"/>
           </v:shapetype>
-          <v:shape id="_x0000_i1025" type="#_x0000_t75" style="width:79.5pt;height:50.5pt" o:ole="">
-            <v:imagedata r:id="rId36" o:title=""/>
+          <v:shape id="_x0000_i1025" type="#_x0000_t75" style="width:79.45pt;height:50.25pt" o:ole="">
+            <v:imagedata r:id="rId40" o:title=""/>
           </v:shape>
-          <o:OLEObject Type="Embed" ProgID="Package" ShapeID="_x0000_i1025" DrawAspect="Icon" ObjectID="_1822924644" r:id="rId37"/>
+          <o:OLEObject Type="Embed" ProgID="Package" ShapeID="_x0000_i1025" DrawAspect="Icon" ObjectID="_1823013234" r:id="rId41"/>
         </w:object>
       </w:r>
       <w:r>
         <w:object w:dxaOrig="1530" w:dyaOrig="995" w14:anchorId="7318620E">
-          <v:shape id="_x0000_i1026" type="#_x0000_t75" style="width:79.5pt;height:50.5pt" o:ole="">
-            <v:imagedata r:id="rId38" o:title=""/>
+          <v:shape id="_x0000_i1026" type="#_x0000_t75" style="width:79.45pt;height:50.25pt" o:ole="">
+            <v:imagedata r:id="rId42" o:title=""/>
           </v:shape>
-          <o:OLEObject Type="Embed" ProgID="Package" ShapeID="_x0000_i1026" DrawAspect="Icon" ObjectID="_1822924645" r:id="rId39"/>
+          <o:OLEObject Type="Embed" ProgID="Package" ShapeID="_x0000_i1026" DrawAspect="Icon" ObjectID="_1823013235" r:id="rId43"/>
         </w:object>
       </w:r>
     </w:p>
@@ -17142,53 +17356,53 @@
     <w:p>
       <w:r>
         <w:object w:dxaOrig="1530" w:dyaOrig="995" w14:anchorId="0F22C1AE">
-          <v:shape id="_x0000_i1027" type="#_x0000_t75" style="width:79.5pt;height:50.5pt" o:ole="">
-            <v:imagedata r:id="rId40" o:title=""/>
-          </v:shape>
-          <o:OLEObject Type="Embed" ProgID="Package" ShapeID="_x0000_i1027" DrawAspect="Icon" ObjectID="_1822924646" r:id="rId41"/>
-        </w:object>
-      </w:r>
-    </w:p>
-    <w:p>
-      <w:pPr>
-        <w:pStyle w:val="Ttulo2"/>
-      </w:pPr>
-      <w:bookmarkStart w:id="190" w:name="_Toc211882629"/>
-      <w:r>
-        <w:t>Pdf vista componentes</w:t>
-      </w:r>
-      <w:bookmarkEnd w:id="190"/>
-    </w:p>
-    <w:p>
-      <w:r>
-        <w:object w:dxaOrig="1530" w:dyaOrig="995" w14:anchorId="3BF7DF28">
-          <v:shape id="_x0000_i1028" type="#_x0000_t75" style="width:79.5pt;height:50.5pt" o:ole="">
-            <v:imagedata r:id="rId42" o:title=""/>
-          </v:shape>
-          <o:OLEObject Type="Embed" ProgID="Package" ShapeID="_x0000_i1028" DrawAspect="Icon" ObjectID="_1822924647" r:id="rId43"/>
-        </w:object>
-      </w:r>
-    </w:p>
-    <w:p>
-      <w:pPr>
-        <w:pStyle w:val="Ttulo2"/>
-      </w:pPr>
-      <w:bookmarkStart w:id="191" w:name="_Toc211882630"/>
-      <w:r>
-        <w:t xml:space="preserve">Pdf vista </w:t>
-      </w:r>
-      <w:r>
-        <w:t>despliegue</w:t>
-      </w:r>
-      <w:bookmarkEnd w:id="191"/>
-    </w:p>
-    <w:p>
-      <w:r>
-        <w:object w:dxaOrig="1530" w:dyaOrig="995" w14:anchorId="4B2FF5B7">
-          <v:shape id="_x0000_i1029" type="#_x0000_t75" style="width:79.5pt;height:50.5pt" o:ole="">
+          <v:shape id="_x0000_i1027" type="#_x0000_t75" style="width:79.45pt;height:50.25pt" o:ole="">
             <v:imagedata r:id="rId44" o:title=""/>
           </v:shape>
-          <o:OLEObject Type="Embed" ProgID="Package" ShapeID="_x0000_i1029" DrawAspect="Icon" ObjectID="_1822924648" r:id="rId45"/>
+          <o:OLEObject Type="Embed" ProgID="Package" ShapeID="_x0000_i1027" DrawAspect="Icon" ObjectID="_1823013236" r:id="rId45"/>
+        </w:object>
+      </w:r>
+    </w:p>
+    <w:p>
+      <w:pPr>
+        <w:pStyle w:val="Ttulo2"/>
+      </w:pPr>
+      <w:bookmarkStart w:id="190" w:name="_Toc211882629"/>
+      <w:r>
+        <w:t>Pdf vista componentes</w:t>
+      </w:r>
+      <w:bookmarkEnd w:id="190"/>
+    </w:p>
+    <w:p>
+      <w:r>
+        <w:object w:dxaOrig="1530" w:dyaOrig="995" w14:anchorId="3BF7DF28">
+          <v:shape id="_x0000_i1028" type="#_x0000_t75" style="width:79.45pt;height:50.25pt" o:ole="">
+            <v:imagedata r:id="rId46" o:title=""/>
+          </v:shape>
+          <o:OLEObject Type="Embed" ProgID="Package" ShapeID="_x0000_i1028" DrawAspect="Icon" ObjectID="_1823013237" r:id="rId47"/>
+        </w:object>
+      </w:r>
+    </w:p>
+    <w:p>
+      <w:pPr>
+        <w:pStyle w:val="Ttulo2"/>
+      </w:pPr>
+      <w:bookmarkStart w:id="191" w:name="_Toc211882630"/>
+      <w:r>
+        <w:t xml:space="preserve">Pdf vista </w:t>
+      </w:r>
+      <w:r>
+        <w:t>despliegue</w:t>
+      </w:r>
+      <w:bookmarkEnd w:id="191"/>
+    </w:p>
+    <w:p>
+      <w:r>
+        <w:object w:dxaOrig="1530" w:dyaOrig="995" w14:anchorId="4B2FF5B7">
+          <v:shape id="_x0000_i1029" type="#_x0000_t75" style="width:79.45pt;height:50.25pt" o:ole="">
+            <v:imagedata r:id="rId48" o:title=""/>
+          </v:shape>
+          <o:OLEObject Type="Embed" ProgID="Package" ShapeID="_x0000_i1029" DrawAspect="Icon" ObjectID="_1823013238" r:id="rId49"/>
         </w:object>
       </w:r>
     </w:p>
@@ -18261,10 +18475,10 @@
       </w:pPr>
       <w:r>
         <w:object w:dxaOrig="1530" w:dyaOrig="995" w14:anchorId="0E4E0928">
-          <v:shape id="_x0000_i1030" type="#_x0000_t75" style="width:79.5pt;height:50.5pt" o:ole="">
-            <v:imagedata r:id="rId46" o:title=""/>
+          <v:shape id="_x0000_i1030" type="#_x0000_t75" style="width:79.45pt;height:50.25pt" o:ole="">
+            <v:imagedata r:id="rId50" o:title=""/>
           </v:shape>
-          <o:OLEObject Type="Embed" ProgID="Package" ShapeID="_x0000_i1030" DrawAspect="Icon" ObjectID="_1822924649" r:id="rId47"/>
+          <o:OLEObject Type="Embed" ProgID="Package" ShapeID="_x0000_i1030" DrawAspect="Icon" ObjectID="_1823013239" r:id="rId51"/>
         </w:object>
       </w:r>
     </w:p>
@@ -18471,8 +18685,8 @@
       </w:pPr>
     </w:p>
     <w:sectPr>
-      <w:headerReference w:type="default" r:id="rId48"/>
-      <w:footerReference w:type="default" r:id="rId49"/>
+      <w:headerReference w:type="default" r:id="rId52"/>
+      <w:footerReference w:type="default" r:id="rId53"/>
       <w:pgSz w:w="12240" w:h="15840" w:code="1"/>
       <w:pgMar w:top="1418" w:right="1418" w:bottom="1418" w:left="1418" w:header="709" w:footer="851" w:gutter="0"/>
       <w:pgNumType w:start="1"/>
@@ -26562,6 +26776,12 @@
 </file>
 
 <file path=customXml/item1.xml><?xml version="1.0" encoding="utf-8"?>
+<go:gDocsCustomXmlDataStorage xmlns:go="http://customooxmlschemas.google.com/" xmlns:r="http://schemas.openxmlformats.org/officeDocument/2006/relationships" uri="GoogleDocsCustomDataVersion2">
+  <go:docsCustomData xmlns:go="http://customooxmlschemas.google.com/" roundtripDataSignature="AMtx7mgzDLvJQrn/s3t721qKHDOuEhpMiQ==">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</go:docsCustomData>
+</go:gDocsCustomXmlDataStorage>
+</file>
+
+<file path=customXml/item2.xml><?xml version="1.0" encoding="utf-8"?>
 <b:Sources xmlns:b="http://schemas.openxmlformats.org/officeDocument/2006/bibliography" xmlns="http://schemas.openxmlformats.org/officeDocument/2006/bibliography" SelectedStyle="\APASixthEditionOfficeOnline.xsl" StyleName="APA" Version="6">
   <b:Source>
     <b:Tag>Eug25</b:Tag>
@@ -26650,25 +26870,19 @@
 </b:Sources>
 </file>
 
-<file path=customXml/item2.xml><?xml version="1.0" encoding="utf-8"?>
-<go:gDocsCustomXmlDataStorage xmlns:go="http://customooxmlschemas.google.com/" xmlns:r="http://schemas.openxmlformats.org/officeDocument/2006/relationships" uri="GoogleDocsCustomDataVersion2">
-  <go:docsCustomData xmlns:go="http://customooxmlschemas.google.com/" roundtripDataSignature="AMtx7mgzDLvJQrn/s3t721qKHDOuEhpMiQ==">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</go:docsCustomData>
-</go:gDocsCustomXmlDataStorage>
-</file>
-
 <file path=customXml/itemProps1.xml><?xml version="1.0" encoding="utf-8"?>
-<ds:datastoreItem xmlns:ds="http://schemas.openxmlformats.org/officeDocument/2006/customXml" ds:itemID="{D7966003-8400-4354-952A-39E3FBC3C487}">
-  <ds:schemaRefs>
-    <ds:schemaRef ds:uri="http://schemas.openxmlformats.org/officeDocument/2006/bibliography"/>
-  </ds:schemaRefs>
-</ds:datastoreItem>
-</file>
-
-<file path=customXml/itemProps2.xml><?xml version="1.0" encoding="utf-8"?>
 <ds:datastoreItem xmlns:ds="http://schemas.openxmlformats.org/officeDocument/2006/customXml" ds:itemID="{11111111-1234-1234-1234-123412341234}">
   <ds:schemaRefs>
     <ds:schemaRef ds:uri="http://customooxmlschemas.google.com/"/>
     <ds:schemaRef ds:uri="http://schemas.openxmlformats.org/officeDocument/2006/relationships"/>
   </ds:schemaRefs>
 </ds:datastoreItem>
+</file>
+
+<file path=customXml/itemProps2.xml><?xml version="1.0" encoding="utf-8"?>
+<ds:datastoreItem xmlns:ds="http://schemas.openxmlformats.org/officeDocument/2006/customXml" ds:itemID="{D7966003-8400-4354-952A-39E3FBC3C487}">
+  <ds:schemaRefs>
+    <ds:schemaRef ds:uri="http://schemas.openxmlformats.org/officeDocument/2006/bibliography"/>
+  </ds:schemaRefs>
+</ds:datastoreItem>
 </file>
</xml_diff>

<commit_message>
Update Tercer incremento Scrum++.docx
</commit_message>
<xml_diff>
--- a/INCREMENTO3/Documentos/Tercer incremento Scrum++.docx
+++ b/INCREMENTO3/Documentos/Tercer incremento Scrum++.docx
@@ -9272,51 +9272,25 @@
         <w:lastRenderedPageBreak/>
         <w:t xml:space="preserve">Figura </w:t>
       </w:r>
-      <w:r>
-        <w:fldChar w:fldCharType="begin"/>
-      </w:r>
-      <w:r>
-        <w:instrText xml:space="preserve"> STYLEREF 1 \s </w:instrText>
-      </w:r>
-      <w:r>
-        <w:fldChar w:fldCharType="separate"/>
-      </w:r>
-      <w:r>
-        <w:rPr>
-          <w:noProof/>
-        </w:rPr>
-        <w:t>2</w:t>
-      </w:r>
-      <w:r>
-        <w:rPr>
-          <w:noProof/>
-        </w:rPr>
-        <w:fldChar w:fldCharType="end"/>
-      </w:r>
+      <w:fldSimple w:instr=" STYLEREF 1 \s ">
+        <w:r>
+          <w:rPr>
+            <w:noProof/>
+          </w:rPr>
+          <w:t>2</w:t>
+        </w:r>
+      </w:fldSimple>
       <w:r>
         <w:t>.</w:t>
       </w:r>
-      <w:r>
-        <w:fldChar w:fldCharType="begin"/>
-      </w:r>
-      <w:r>
-        <w:instrText xml:space="preserve"> SEQ Figura \* ARABIC \s 1 </w:instrText>
-      </w:r>
-      <w:r>
-        <w:fldChar w:fldCharType="separate"/>
-      </w:r>
-      <w:r>
-        <w:rPr>
-          <w:noProof/>
-        </w:rPr>
-        <w:t>1</w:t>
-      </w:r>
-      <w:r>
-        <w:rPr>
-          <w:noProof/>
-        </w:rPr>
-        <w:fldChar w:fldCharType="end"/>
-      </w:r>
+      <w:fldSimple w:instr=" SEQ Figura \* ARABIC \s 1 ">
+        <w:r>
+          <w:rPr>
+            <w:noProof/>
+          </w:rPr>
+          <w:t>1</w:t>
+        </w:r>
+      </w:fldSimple>
       <w:r>
         <w:t xml:space="preserve"> gr</w:t>
       </w:r>
@@ -9470,51 +9444,25 @@
         <w:lastRenderedPageBreak/>
         <w:t xml:space="preserve">Figura </w:t>
       </w:r>
-      <w:r>
-        <w:fldChar w:fldCharType="begin"/>
-      </w:r>
-      <w:r>
-        <w:instrText xml:space="preserve"> STYLEREF 1 \s </w:instrText>
-      </w:r>
-      <w:r>
-        <w:fldChar w:fldCharType="separate"/>
-      </w:r>
-      <w:r>
-        <w:rPr>
-          <w:noProof/>
-        </w:rPr>
-        <w:t>2</w:t>
-      </w:r>
-      <w:r>
-        <w:rPr>
-          <w:noProof/>
-        </w:rPr>
-        <w:fldChar w:fldCharType="end"/>
-      </w:r>
+      <w:fldSimple w:instr=" STYLEREF 1 \s ">
+        <w:r>
+          <w:rPr>
+            <w:noProof/>
+          </w:rPr>
+          <w:t>2</w:t>
+        </w:r>
+      </w:fldSimple>
       <w:r>
         <w:t>.</w:t>
       </w:r>
-      <w:r>
-        <w:fldChar w:fldCharType="begin"/>
-      </w:r>
-      <w:r>
-        <w:instrText xml:space="preserve"> SEQ Figura \* ARABIC \s 1 </w:instrText>
-      </w:r>
-      <w:r>
-        <w:fldChar w:fldCharType="separate"/>
-      </w:r>
-      <w:r>
-        <w:rPr>
-          <w:noProof/>
-        </w:rPr>
-        <w:t>2</w:t>
-      </w:r>
-      <w:r>
-        <w:rPr>
-          <w:noProof/>
-        </w:rPr>
-        <w:fldChar w:fldCharType="end"/>
-      </w:r>
+      <w:fldSimple w:instr=" SEQ Figura \* ARABIC \s 1 ">
+        <w:r>
+          <w:rPr>
+            <w:noProof/>
+          </w:rPr>
+          <w:t>2</w:t>
+        </w:r>
+      </w:fldSimple>
       <w:r>
         <w:t xml:space="preserve"> gráfico circular de porcentaje parcial</w:t>
       </w:r>
@@ -9697,51 +9645,25 @@
       <w:r>
         <w:t xml:space="preserve">Figura </w:t>
       </w:r>
-      <w:r>
-        <w:fldChar w:fldCharType="begin"/>
-      </w:r>
-      <w:r>
-        <w:instrText xml:space="preserve"> STYLEREF 1 \s </w:instrText>
-      </w:r>
-      <w:r>
-        <w:fldChar w:fldCharType="separate"/>
-      </w:r>
-      <w:r>
-        <w:rPr>
-          <w:noProof/>
-        </w:rPr>
-        <w:t>2</w:t>
-      </w:r>
-      <w:r>
-        <w:rPr>
-          <w:noProof/>
-        </w:rPr>
-        <w:fldChar w:fldCharType="end"/>
-      </w:r>
+      <w:fldSimple w:instr=" STYLEREF 1 \s ">
+        <w:r>
+          <w:rPr>
+            <w:noProof/>
+          </w:rPr>
+          <w:t>2</w:t>
+        </w:r>
+      </w:fldSimple>
       <w:r>
         <w:t>.</w:t>
       </w:r>
-      <w:r>
-        <w:fldChar w:fldCharType="begin"/>
-      </w:r>
-      <w:r>
-        <w:instrText xml:space="preserve"> SEQ Figura \* ARABIC \s 1 </w:instrText>
-      </w:r>
-      <w:r>
-        <w:fldChar w:fldCharType="separate"/>
-      </w:r>
-      <w:r>
-        <w:rPr>
-          <w:noProof/>
-        </w:rPr>
-        <w:t>3</w:t>
-      </w:r>
-      <w:r>
-        <w:rPr>
-          <w:noProof/>
-        </w:rPr>
-        <w:fldChar w:fldCharType="end"/>
-      </w:r>
+      <w:fldSimple w:instr=" SEQ Figura \* ARABIC \s 1 ">
+        <w:r>
+          <w:rPr>
+            <w:noProof/>
+          </w:rPr>
+          <w:t>3</w:t>
+        </w:r>
+      </w:fldSimple>
       <w:r>
         <w:t xml:space="preserve"> </w:t>
       </w:r>
@@ -9903,51 +9825,25 @@
       <w:r>
         <w:t xml:space="preserve">Tabla </w:t>
       </w:r>
-      <w:r>
-        <w:fldChar w:fldCharType="begin"/>
-      </w:r>
-      <w:r>
-        <w:instrText xml:space="preserve"> STYLEREF 1 \s </w:instrText>
-      </w:r>
-      <w:r>
-        <w:fldChar w:fldCharType="separate"/>
-      </w:r>
-      <w:r>
-        <w:rPr>
-          <w:noProof/>
-        </w:rPr>
-        <w:t>3</w:t>
-      </w:r>
-      <w:r>
-        <w:rPr>
-          <w:noProof/>
-        </w:rPr>
-        <w:fldChar w:fldCharType="end"/>
-      </w:r>
+      <w:fldSimple w:instr=" STYLEREF 1 \s ">
+        <w:r>
+          <w:rPr>
+            <w:noProof/>
+          </w:rPr>
+          <w:t>3</w:t>
+        </w:r>
+      </w:fldSimple>
       <w:r>
         <w:t>.</w:t>
       </w:r>
-      <w:r>
-        <w:fldChar w:fldCharType="begin"/>
-      </w:r>
-      <w:r>
-        <w:instrText xml:space="preserve"> SEQ Tabla \* ARABIC \s 1 </w:instrText>
-      </w:r>
-      <w:r>
-        <w:fldChar w:fldCharType="separate"/>
-      </w:r>
-      <w:r>
-        <w:rPr>
-          <w:noProof/>
-        </w:rPr>
-        <w:t>1</w:t>
-      </w:r>
-      <w:r>
-        <w:rPr>
-          <w:noProof/>
-        </w:rPr>
-        <w:fldChar w:fldCharType="end"/>
-      </w:r>
+      <w:fldSimple w:instr=" SEQ Tabla \* ARABIC \s 1 ">
+        <w:r>
+          <w:rPr>
+            <w:noProof/>
+          </w:rPr>
+          <w:t>1</w:t>
+        </w:r>
+      </w:fldSimple>
       <w:r>
         <w:t xml:space="preserve"> </w:t>
       </w:r>
@@ -10183,7 +10079,19 @@
               <w:rPr>
                 <w:rFonts w:cs="Times New Roman"/>
               </w:rPr>
-              <w:t>Imprimando informe de asistencia</w:t>
+              <w:t>Imprim</w:t>
+            </w:r>
+            <w:r>
+              <w:rPr>
+                <w:rFonts w:cs="Times New Roman"/>
+              </w:rPr>
+              <w:t>ie</w:t>
+            </w:r>
+            <w:r>
+              <w:rPr>
+                <w:rFonts w:cs="Times New Roman"/>
+              </w:rPr>
+              <w:t>ndo informe de asistencia</w:t>
             </w:r>
           </w:p>
         </w:tc>
@@ -10867,51 +10775,25 @@
       <w:r>
         <w:t xml:space="preserve">Tabla </w:t>
       </w:r>
-      <w:r>
-        <w:fldChar w:fldCharType="begin"/>
-      </w:r>
-      <w:r>
-        <w:instrText xml:space="preserve"> STYLEREF 1 \s </w:instrText>
-      </w:r>
-      <w:r>
-        <w:fldChar w:fldCharType="separate"/>
-      </w:r>
-      <w:r>
-        <w:rPr>
-          <w:noProof/>
-        </w:rPr>
-        <w:t>4</w:t>
-      </w:r>
-      <w:r>
-        <w:rPr>
-          <w:noProof/>
-        </w:rPr>
-        <w:fldChar w:fldCharType="end"/>
-      </w:r>
+      <w:fldSimple w:instr=" STYLEREF 1 \s ">
+        <w:r>
+          <w:rPr>
+            <w:noProof/>
+          </w:rPr>
+          <w:t>4</w:t>
+        </w:r>
+      </w:fldSimple>
       <w:r>
         <w:t>.</w:t>
       </w:r>
-      <w:r>
-        <w:fldChar w:fldCharType="begin"/>
-      </w:r>
-      <w:r>
-        <w:instrText xml:space="preserve"> SEQ Tabla \* ARABIC \s 1 </w:instrText>
-      </w:r>
-      <w:r>
-        <w:fldChar w:fldCharType="separate"/>
-      </w:r>
-      <w:r>
-        <w:rPr>
-          <w:noProof/>
-        </w:rPr>
-        <w:t>1</w:t>
-      </w:r>
-      <w:r>
-        <w:rPr>
-          <w:noProof/>
-        </w:rPr>
-        <w:fldChar w:fldCharType="end"/>
-      </w:r>
+      <w:fldSimple w:instr=" SEQ Tabla \* ARABIC \s 1 ">
+        <w:r>
+          <w:rPr>
+            <w:noProof/>
+          </w:rPr>
+          <w:t>1</w:t>
+        </w:r>
+      </w:fldSimple>
       <w:r>
         <w:t xml:space="preserve"> Sprint backlog</w:t>
       </w:r>
@@ -11604,51 +11486,25 @@
       <w:r>
         <w:t xml:space="preserve">Figura </w:t>
       </w:r>
-      <w:r>
-        <w:fldChar w:fldCharType="begin"/>
-      </w:r>
-      <w:r>
-        <w:instrText xml:space="preserve"> STYLEREF 1 \s </w:instrText>
-      </w:r>
-      <w:r>
-        <w:fldChar w:fldCharType="separate"/>
-      </w:r>
-      <w:r>
-        <w:rPr>
-          <w:noProof/>
-        </w:rPr>
-        <w:t>5</w:t>
-      </w:r>
-      <w:r>
-        <w:rPr>
-          <w:noProof/>
-        </w:rPr>
-        <w:fldChar w:fldCharType="end"/>
-      </w:r>
+      <w:fldSimple w:instr=" STYLEREF 1 \s ">
+        <w:r>
+          <w:rPr>
+            <w:noProof/>
+          </w:rPr>
+          <w:t>5</w:t>
+        </w:r>
+      </w:fldSimple>
       <w:r>
         <w:t>.</w:t>
       </w:r>
-      <w:r>
-        <w:fldChar w:fldCharType="begin"/>
-      </w:r>
-      <w:r>
-        <w:instrText xml:space="preserve"> SEQ Figura \* ARABIC \s 1 </w:instrText>
-      </w:r>
-      <w:r>
-        <w:fldChar w:fldCharType="separate"/>
-      </w:r>
-      <w:r>
-        <w:rPr>
-          <w:noProof/>
-        </w:rPr>
-        <w:t>1</w:t>
-      </w:r>
-      <w:r>
-        <w:rPr>
-          <w:noProof/>
-        </w:rPr>
-        <w:fldChar w:fldCharType="end"/>
-      </w:r>
+      <w:fldSimple w:instr=" SEQ Figura \* ARABIC \s 1 ">
+        <w:r>
+          <w:rPr>
+            <w:noProof/>
+          </w:rPr>
+          <w:t>1</w:t>
+        </w:r>
+      </w:fldSimple>
       <w:r>
         <w:t xml:space="preserve"> Diagrama de clases UML del sistema Biométrico web</w:t>
       </w:r>
@@ -11795,51 +11651,25 @@
       <w:r>
         <w:t xml:space="preserve">Figura </w:t>
       </w:r>
-      <w:r>
-        <w:fldChar w:fldCharType="begin"/>
-      </w:r>
-      <w:r>
-        <w:instrText xml:space="preserve"> STYLEREF 1 \s </w:instrText>
-      </w:r>
-      <w:r>
-        <w:fldChar w:fldCharType="separate"/>
-      </w:r>
-      <w:r>
-        <w:rPr>
-          <w:noProof/>
-        </w:rPr>
-        <w:t>5</w:t>
-      </w:r>
-      <w:r>
-        <w:rPr>
-          <w:noProof/>
-        </w:rPr>
-        <w:fldChar w:fldCharType="end"/>
-      </w:r>
+      <w:fldSimple w:instr=" STYLEREF 1 \s ">
+        <w:r>
+          <w:rPr>
+            <w:noProof/>
+          </w:rPr>
+          <w:t>5</w:t>
+        </w:r>
+      </w:fldSimple>
       <w:r>
         <w:t>.</w:t>
       </w:r>
-      <w:r>
-        <w:fldChar w:fldCharType="begin"/>
-      </w:r>
-      <w:r>
-        <w:instrText xml:space="preserve"> SEQ Figura \* ARABIC \s 1 </w:instrText>
-      </w:r>
-      <w:r>
-        <w:fldChar w:fldCharType="separate"/>
-      </w:r>
-      <w:r>
-        <w:rPr>
-          <w:noProof/>
-        </w:rPr>
-        <w:t>2</w:t>
-      </w:r>
-      <w:r>
-        <w:rPr>
-          <w:noProof/>
-        </w:rPr>
-        <w:fldChar w:fldCharType="end"/>
-      </w:r>
+      <w:fldSimple w:instr=" SEQ Figura \* ARABIC \s 1 ">
+        <w:r>
+          <w:rPr>
+            <w:noProof/>
+          </w:rPr>
+          <w:t>2</w:t>
+        </w:r>
+      </w:fldSimple>
       <w:r>
         <w:t xml:space="preserve"> Diagrama modelo de datos de sistema web EUGCOM</w:t>
       </w:r>
@@ -11992,51 +11822,25 @@
       <w:r>
         <w:t xml:space="preserve">Figura </w:t>
       </w:r>
-      <w:r>
-        <w:fldChar w:fldCharType="begin"/>
-      </w:r>
-      <w:r>
-        <w:instrText xml:space="preserve"> STYLEREF 1 \s </w:instrText>
-      </w:r>
-      <w:r>
-        <w:fldChar w:fldCharType="separate"/>
-      </w:r>
-      <w:r>
-        <w:rPr>
-          <w:noProof/>
-        </w:rPr>
-        <w:t>5</w:t>
-      </w:r>
-      <w:r>
-        <w:rPr>
-          <w:noProof/>
-        </w:rPr>
-        <w:fldChar w:fldCharType="end"/>
-      </w:r>
+      <w:fldSimple w:instr=" STYLEREF 1 \s ">
+        <w:r>
+          <w:rPr>
+            <w:noProof/>
+          </w:rPr>
+          <w:t>5</w:t>
+        </w:r>
+      </w:fldSimple>
       <w:r>
         <w:t>.</w:t>
       </w:r>
-      <w:r>
-        <w:fldChar w:fldCharType="begin"/>
-      </w:r>
-      <w:r>
-        <w:instrText xml:space="preserve"> SEQ Figura \* ARABIC \s 1 </w:instrText>
-      </w:r>
-      <w:r>
-        <w:fldChar w:fldCharType="separate"/>
-      </w:r>
-      <w:r>
-        <w:rPr>
-          <w:noProof/>
-        </w:rPr>
-        <w:t>3</w:t>
-      </w:r>
-      <w:r>
-        <w:rPr>
-          <w:noProof/>
-        </w:rPr>
-        <w:fldChar w:fldCharType="end"/>
-      </w:r>
+      <w:fldSimple w:instr=" SEQ Figura \* ARABIC \s 1 ">
+        <w:r>
+          <w:rPr>
+            <w:noProof/>
+          </w:rPr>
+          <w:t>3</w:t>
+        </w:r>
+      </w:fldSimple>
       <w:r>
         <w:t xml:space="preserve"> Caso de uso </w:t>
       </w:r>
@@ -12136,51 +11940,25 @@
       <w:r>
         <w:t xml:space="preserve">Figura </w:t>
       </w:r>
-      <w:r>
-        <w:fldChar w:fldCharType="begin"/>
-      </w:r>
-      <w:r>
-        <w:instrText xml:space="preserve"> STYLEREF 1 \s </w:instrText>
-      </w:r>
-      <w:r>
-        <w:fldChar w:fldCharType="separate"/>
-      </w:r>
-      <w:r>
-        <w:rPr>
-          <w:noProof/>
-        </w:rPr>
-        <w:t>5</w:t>
-      </w:r>
-      <w:r>
-        <w:rPr>
-          <w:noProof/>
-        </w:rPr>
-        <w:fldChar w:fldCharType="end"/>
-      </w:r>
+      <w:fldSimple w:instr=" STYLEREF 1 \s ">
+        <w:r>
+          <w:rPr>
+            <w:noProof/>
+          </w:rPr>
+          <w:t>5</w:t>
+        </w:r>
+      </w:fldSimple>
       <w:r>
         <w:t>.</w:t>
       </w:r>
-      <w:r>
-        <w:fldChar w:fldCharType="begin"/>
-      </w:r>
-      <w:r>
-        <w:instrText xml:space="preserve"> SEQ Figura \* ARABIC \s 1 </w:instrText>
-      </w:r>
-      <w:r>
-        <w:fldChar w:fldCharType="separate"/>
-      </w:r>
-      <w:r>
-        <w:rPr>
-          <w:noProof/>
-        </w:rPr>
-        <w:t>4</w:t>
-      </w:r>
-      <w:r>
-        <w:rPr>
-          <w:noProof/>
-        </w:rPr>
-        <w:fldChar w:fldCharType="end"/>
-      </w:r>
+      <w:fldSimple w:instr=" SEQ Figura \* ARABIC \s 1 ">
+        <w:r>
+          <w:rPr>
+            <w:noProof/>
+          </w:rPr>
+          <w:t>4</w:t>
+        </w:r>
+      </w:fldSimple>
       <w:r>
         <w:t xml:space="preserve"> </w:t>
       </w:r>
@@ -12281,51 +12059,25 @@
       <w:r>
         <w:t xml:space="preserve">Figura </w:t>
       </w:r>
-      <w:r>
-        <w:fldChar w:fldCharType="begin"/>
-      </w:r>
-      <w:r>
-        <w:instrText xml:space="preserve"> STYLEREF 1 \s </w:instrText>
-      </w:r>
-      <w:r>
-        <w:fldChar w:fldCharType="separate"/>
-      </w:r>
-      <w:r>
-        <w:rPr>
-          <w:noProof/>
-        </w:rPr>
-        <w:t>5</w:t>
-      </w:r>
-      <w:r>
-        <w:rPr>
-          <w:noProof/>
-        </w:rPr>
-        <w:fldChar w:fldCharType="end"/>
-      </w:r>
+      <w:fldSimple w:instr=" STYLEREF 1 \s ">
+        <w:r>
+          <w:rPr>
+            <w:noProof/>
+          </w:rPr>
+          <w:t>5</w:t>
+        </w:r>
+      </w:fldSimple>
       <w:r>
         <w:t>.</w:t>
       </w:r>
-      <w:r>
-        <w:fldChar w:fldCharType="begin"/>
-      </w:r>
-      <w:r>
-        <w:instrText xml:space="preserve"> SEQ Figura \* ARABIC \s 1 </w:instrText>
-      </w:r>
-      <w:r>
-        <w:fldChar w:fldCharType="separate"/>
-      </w:r>
-      <w:r>
-        <w:rPr>
-          <w:noProof/>
-        </w:rPr>
-        <w:t>5</w:t>
-      </w:r>
-      <w:r>
-        <w:rPr>
-          <w:noProof/>
-        </w:rPr>
-        <w:fldChar w:fldCharType="end"/>
-      </w:r>
+      <w:fldSimple w:instr=" SEQ Figura \* ARABIC \s 1 ">
+        <w:r>
+          <w:rPr>
+            <w:noProof/>
+          </w:rPr>
+          <w:t>5</w:t>
+        </w:r>
+      </w:fldSimple>
       <w:r>
         <w:t xml:space="preserve"> </w:t>
       </w:r>
@@ -12421,51 +12173,25 @@
       <w:r>
         <w:t xml:space="preserve">Figura </w:t>
       </w:r>
-      <w:r>
-        <w:fldChar w:fldCharType="begin"/>
-      </w:r>
-      <w:r>
-        <w:instrText xml:space="preserve"> STYLEREF 1 \s </w:instrText>
-      </w:r>
-      <w:r>
-        <w:fldChar w:fldCharType="separate"/>
-      </w:r>
-      <w:r>
-        <w:rPr>
-          <w:noProof/>
-        </w:rPr>
-        <w:t>5</w:t>
-      </w:r>
-      <w:r>
-        <w:rPr>
-          <w:noProof/>
-        </w:rPr>
-        <w:fldChar w:fldCharType="end"/>
-      </w:r>
+      <w:fldSimple w:instr=" STYLEREF 1 \s ">
+        <w:r>
+          <w:rPr>
+            <w:noProof/>
+          </w:rPr>
+          <w:t>5</w:t>
+        </w:r>
+      </w:fldSimple>
       <w:r>
         <w:t>.</w:t>
       </w:r>
-      <w:r>
-        <w:fldChar w:fldCharType="begin"/>
-      </w:r>
-      <w:r>
-        <w:instrText xml:space="preserve"> SEQ Figura \* ARABIC \s 1 </w:instrText>
-      </w:r>
-      <w:r>
-        <w:fldChar w:fldCharType="separate"/>
-      </w:r>
-      <w:r>
-        <w:rPr>
-          <w:noProof/>
-        </w:rPr>
-        <w:t>6</w:t>
-      </w:r>
-      <w:r>
-        <w:rPr>
-          <w:noProof/>
-        </w:rPr>
-        <w:fldChar w:fldCharType="end"/>
-      </w:r>
+      <w:fldSimple w:instr=" SEQ Figura \* ARABIC \s 1 ">
+        <w:r>
+          <w:rPr>
+            <w:noProof/>
+          </w:rPr>
+          <w:t>6</w:t>
+        </w:r>
+      </w:fldSimple>
       <w:r>
         <w:t xml:space="preserve"> </w:t>
       </w:r>
@@ -12746,51 +12472,25 @@
       <w:r>
         <w:t xml:space="preserve">Figura </w:t>
       </w:r>
-      <w:r>
-        <w:fldChar w:fldCharType="begin"/>
-      </w:r>
-      <w:r>
-        <w:instrText xml:space="preserve"> STYLEREF 1 \s </w:instrText>
-      </w:r>
-      <w:r>
-        <w:fldChar w:fldCharType="separate"/>
-      </w:r>
-      <w:r>
-        <w:rPr>
-          <w:noProof/>
-        </w:rPr>
-        <w:t>5</w:t>
-      </w:r>
-      <w:r>
-        <w:rPr>
-          <w:noProof/>
-        </w:rPr>
-        <w:fldChar w:fldCharType="end"/>
-      </w:r>
+      <w:fldSimple w:instr=" STYLEREF 1 \s ">
+        <w:r>
+          <w:rPr>
+            <w:noProof/>
+          </w:rPr>
+          <w:t>5</w:t>
+        </w:r>
+      </w:fldSimple>
       <w:r>
         <w:t>.</w:t>
       </w:r>
-      <w:r>
-        <w:fldChar w:fldCharType="begin"/>
-      </w:r>
-      <w:r>
-        <w:instrText xml:space="preserve"> SEQ Figura \* ARABIC \s 1 </w:instrText>
-      </w:r>
-      <w:r>
-        <w:fldChar w:fldCharType="separate"/>
-      </w:r>
-      <w:r>
-        <w:rPr>
-          <w:noProof/>
-        </w:rPr>
-        <w:t>7</w:t>
-      </w:r>
-      <w:r>
-        <w:rPr>
-          <w:noProof/>
-        </w:rPr>
-        <w:fldChar w:fldCharType="end"/>
-      </w:r>
+      <w:fldSimple w:instr=" SEQ Figura \* ARABIC \s 1 ">
+        <w:r>
+          <w:rPr>
+            <w:noProof/>
+          </w:rPr>
+          <w:t>7</w:t>
+        </w:r>
+      </w:fldSimple>
       <w:r>
         <w:t xml:space="preserve"> </w:t>
       </w:r>
@@ -12957,51 +12657,25 @@
         <w:lastRenderedPageBreak/>
         <w:t xml:space="preserve">Figura </w:t>
       </w:r>
-      <w:r>
-        <w:fldChar w:fldCharType="begin"/>
-      </w:r>
-      <w:r>
-        <w:instrText xml:space="preserve"> STYLEREF 1 \s </w:instrText>
-      </w:r>
-      <w:r>
-        <w:fldChar w:fldCharType="separate"/>
-      </w:r>
-      <w:r>
-        <w:rPr>
-          <w:noProof/>
-        </w:rPr>
-        <w:t>5</w:t>
-      </w:r>
-      <w:r>
-        <w:rPr>
-          <w:noProof/>
-        </w:rPr>
-        <w:fldChar w:fldCharType="end"/>
-      </w:r>
+      <w:fldSimple w:instr=" STYLEREF 1 \s ">
+        <w:r>
+          <w:rPr>
+            <w:noProof/>
+          </w:rPr>
+          <w:t>5</w:t>
+        </w:r>
+      </w:fldSimple>
       <w:r>
         <w:t>.</w:t>
       </w:r>
-      <w:r>
-        <w:fldChar w:fldCharType="begin"/>
-      </w:r>
-      <w:r>
-        <w:instrText xml:space="preserve"> SEQ Figura \* ARABIC \s 1 </w:instrText>
-      </w:r>
-      <w:r>
-        <w:fldChar w:fldCharType="separate"/>
-      </w:r>
-      <w:r>
-        <w:rPr>
-          <w:noProof/>
-        </w:rPr>
-        <w:t>8</w:t>
-      </w:r>
-      <w:r>
-        <w:rPr>
-          <w:noProof/>
-        </w:rPr>
-        <w:fldChar w:fldCharType="end"/>
-      </w:r>
+      <w:fldSimple w:instr=" SEQ Figura \* ARABIC \s 1 ">
+        <w:r>
+          <w:rPr>
+            <w:noProof/>
+          </w:rPr>
+          <w:t>8</w:t>
+        </w:r>
+      </w:fldSimple>
       <w:r>
         <w:t xml:space="preserve"> Diagrama de despliegue de EugCOM</w:t>
       </w:r>
@@ -13834,51 +13508,25 @@
       <w:r>
         <w:t xml:space="preserve">Tabla </w:t>
       </w:r>
-      <w:r>
-        <w:fldChar w:fldCharType="begin"/>
-      </w:r>
-      <w:r>
-        <w:instrText xml:space="preserve"> STYLEREF 1 \s </w:instrText>
-      </w:r>
-      <w:r>
-        <w:fldChar w:fldCharType="separate"/>
-      </w:r>
-      <w:r>
-        <w:rPr>
-          <w:noProof/>
-        </w:rPr>
-        <w:t>6</w:t>
-      </w:r>
-      <w:r>
-        <w:rPr>
-          <w:noProof/>
-        </w:rPr>
-        <w:fldChar w:fldCharType="end"/>
-      </w:r>
+      <w:fldSimple w:instr=" STYLEREF 1 \s ">
+        <w:r>
+          <w:rPr>
+            <w:noProof/>
+          </w:rPr>
+          <w:t>6</w:t>
+        </w:r>
+      </w:fldSimple>
       <w:r>
         <w:t>.</w:t>
       </w:r>
-      <w:r>
-        <w:fldChar w:fldCharType="begin"/>
-      </w:r>
-      <w:r>
-        <w:instrText xml:space="preserve"> SEQ Tabla \* ARABIC \s 1 </w:instrText>
-      </w:r>
-      <w:r>
-        <w:fldChar w:fldCharType="separate"/>
-      </w:r>
-      <w:r>
-        <w:rPr>
-          <w:noProof/>
-        </w:rPr>
-        <w:t>1</w:t>
-      </w:r>
-      <w:r>
-        <w:rPr>
-          <w:noProof/>
-        </w:rPr>
-        <w:fldChar w:fldCharType="end"/>
-      </w:r>
+      <w:fldSimple w:instr=" SEQ Tabla \* ARABIC \s 1 ">
+        <w:r>
+          <w:rPr>
+            <w:noProof/>
+          </w:rPr>
+          <w:t>1</w:t>
+        </w:r>
+      </w:fldSimple>
       <w:r>
         <w:t xml:space="preserve"> solución de errores comunes</w:t>
       </w:r>
@@ -14210,51 +13858,25 @@
       <w:r>
         <w:t xml:space="preserve">Figura </w:t>
       </w:r>
-      <w:r>
-        <w:fldChar w:fldCharType="begin"/>
-      </w:r>
-      <w:r>
-        <w:instrText xml:space="preserve"> STYLEREF 1 \s </w:instrText>
-      </w:r>
-      <w:r>
-        <w:fldChar w:fldCharType="separate"/>
-      </w:r>
-      <w:r>
-        <w:rPr>
-          <w:noProof/>
-        </w:rPr>
-        <w:t>6</w:t>
-      </w:r>
-      <w:r>
-        <w:rPr>
-          <w:noProof/>
-        </w:rPr>
-        <w:fldChar w:fldCharType="end"/>
-      </w:r>
+      <w:fldSimple w:instr=" STYLEREF 1 \s ">
+        <w:r>
+          <w:rPr>
+            <w:noProof/>
+          </w:rPr>
+          <w:t>6</w:t>
+        </w:r>
+      </w:fldSimple>
       <w:r>
         <w:t>.</w:t>
       </w:r>
-      <w:r>
-        <w:fldChar w:fldCharType="begin"/>
-      </w:r>
-      <w:r>
-        <w:instrText xml:space="preserve"> SEQ Figura \* ARABIC \s 1 </w:instrText>
-      </w:r>
-      <w:r>
-        <w:fldChar w:fldCharType="separate"/>
-      </w:r>
-      <w:r>
-        <w:rPr>
-          <w:noProof/>
-        </w:rPr>
-        <w:t>1</w:t>
-      </w:r>
-      <w:r>
-        <w:rPr>
-          <w:noProof/>
-        </w:rPr>
-        <w:fldChar w:fldCharType="end"/>
-      </w:r>
+      <w:fldSimple w:instr=" SEQ Figura \* ARABIC \s 1 ">
+        <w:r>
+          <w:rPr>
+            <w:noProof/>
+          </w:rPr>
+          <w:t>1</w:t>
+        </w:r>
+      </w:fldSimple>
       <w:r>
         <w:t xml:space="preserve"> </w:t>
       </w:r>
@@ -14376,51 +13998,25 @@
       <w:r>
         <w:t xml:space="preserve">Figura </w:t>
       </w:r>
-      <w:r>
-        <w:fldChar w:fldCharType="begin"/>
-      </w:r>
-      <w:r>
-        <w:instrText xml:space="preserve"> STYLEREF 1 \s </w:instrText>
-      </w:r>
-      <w:r>
-        <w:fldChar w:fldCharType="separate"/>
-      </w:r>
-      <w:r>
-        <w:rPr>
-          <w:noProof/>
-        </w:rPr>
-        <w:t>6</w:t>
-      </w:r>
-      <w:r>
-        <w:rPr>
-          <w:noProof/>
-        </w:rPr>
-        <w:fldChar w:fldCharType="end"/>
-      </w:r>
+      <w:fldSimple w:instr=" STYLEREF 1 \s ">
+        <w:r>
+          <w:rPr>
+            <w:noProof/>
+          </w:rPr>
+          <w:t>6</w:t>
+        </w:r>
+      </w:fldSimple>
       <w:r>
         <w:t>.</w:t>
       </w:r>
-      <w:r>
-        <w:fldChar w:fldCharType="begin"/>
-      </w:r>
-      <w:r>
-        <w:instrText xml:space="preserve"> SEQ Figura \* ARABIC \s 1 </w:instrText>
-      </w:r>
-      <w:r>
-        <w:fldChar w:fldCharType="separate"/>
-      </w:r>
-      <w:r>
-        <w:rPr>
-          <w:noProof/>
-        </w:rPr>
-        <w:t>2</w:t>
-      </w:r>
-      <w:r>
-        <w:rPr>
-          <w:noProof/>
-        </w:rPr>
-        <w:fldChar w:fldCharType="end"/>
-      </w:r>
+      <w:fldSimple w:instr=" SEQ Figura \* ARABIC \s 1 ">
+        <w:r>
+          <w:rPr>
+            <w:noProof/>
+          </w:rPr>
+          <w:t>2</w:t>
+        </w:r>
+      </w:fldSimple>
       <w:r>
         <w:t xml:space="preserve"> “Vista navegación menú desplegable externa”</w:t>
       </w:r>
@@ -14567,51 +14163,25 @@
       <w:r>
         <w:t xml:space="preserve">Tabla </w:t>
       </w:r>
-      <w:r>
-        <w:fldChar w:fldCharType="begin"/>
-      </w:r>
-      <w:r>
-        <w:instrText xml:space="preserve"> STYLEREF 1 \s </w:instrText>
-      </w:r>
-      <w:r>
-        <w:fldChar w:fldCharType="separate"/>
-      </w:r>
-      <w:r>
-        <w:rPr>
-          <w:noProof/>
-        </w:rPr>
-        <w:t>7</w:t>
-      </w:r>
-      <w:r>
-        <w:rPr>
-          <w:noProof/>
-        </w:rPr>
-        <w:fldChar w:fldCharType="end"/>
-      </w:r>
+      <w:fldSimple w:instr=" STYLEREF 1 \s ">
+        <w:r>
+          <w:rPr>
+            <w:noProof/>
+          </w:rPr>
+          <w:t>7</w:t>
+        </w:r>
+      </w:fldSimple>
       <w:r>
         <w:t>.</w:t>
       </w:r>
-      <w:r>
-        <w:fldChar w:fldCharType="begin"/>
-      </w:r>
-      <w:r>
-        <w:instrText xml:space="preserve"> SEQ Tabla \* ARABIC \s 1 </w:instrText>
-      </w:r>
-      <w:r>
-        <w:fldChar w:fldCharType="separate"/>
-      </w:r>
-      <w:r>
-        <w:rPr>
-          <w:noProof/>
-        </w:rPr>
-        <w:t>1</w:t>
-      </w:r>
-      <w:r>
-        <w:rPr>
-          <w:noProof/>
-        </w:rPr>
-        <w:fldChar w:fldCharType="end"/>
-      </w:r>
+      <w:fldSimple w:instr=" SEQ Tabla \* ARABIC \s 1 ">
+        <w:r>
+          <w:rPr>
+            <w:noProof/>
+          </w:rPr>
+          <w:t>1</w:t>
+        </w:r>
+      </w:fldSimple>
       <w:r>
         <w:t xml:space="preserve"> </w:t>
       </w:r>
@@ -14892,13 +14462,7 @@
         <w:t>Exportar a CSV</w:t>
       </w:r>
       <w:r>
-        <w:t xml:space="preserve">). Luego, se probó la selección de marcas en la tabla: al marcar una fila, esta quedó visualmente destacada, confirmando la elección del usuario para su futura impresión. Finalmente, al presionar Imprimir Selección, el sistema abrió el diálogo de impresión del navegador mostrando la vista previa y permitiendo elegir destino (impresora o PDF), con lo que la información filtrada y seleccionada se imprimió correctamente. Los resultados obtenidos coinciden con los resultados esperados para los tres casos de prueba (carga, selección </w:t>
-      </w:r>
-      <w:r>
-        <w:t>e</w:t>
-      </w:r>
-      <w:r>
-        <w:t xml:space="preserve"> impresión). Figura 7.1: captura de pantalla de las pruebas 1-2-3 del caso de uso N°5.6.</w:t>
+        <w:t>). Luego, se probó la selección de marcas en la tabla: al marcar una fila, esta quedó visualmente destacada, confirmando la elección del usuario para su futura impresión. Finalmente, al presionar Imprimir Selección, el sistema abrió el diálogo de impresión del navegador mostrando la vista previa y permitiendo elegir destino (impresora o PDF), con lo que la información filtrada y seleccionada se imprimió correctamente. Los resultados obtenidos coinciden con los resultados esperados para los tres casos de prueba (carga, selección e impresión). Figura 7.1: captura de pantalla de las pruebas 1-2-3 del caso de uso N°5.6.</w:t>
       </w:r>
     </w:p>
     <w:p/>
@@ -14916,27 +14480,14 @@
       <w:r>
         <w:t xml:space="preserve">Figura </w:t>
       </w:r>
-      <w:r>
-        <w:fldChar w:fldCharType="begin"/>
-      </w:r>
-      <w:r>
-        <w:instrText xml:space="preserve"> STYLEREF 1 \s </w:instrText>
-      </w:r>
-      <w:r>
-        <w:fldChar w:fldCharType="separate"/>
-      </w:r>
-      <w:r>
-        <w:rPr>
-          <w:noProof/>
-        </w:rPr>
-        <w:t>7</w:t>
-      </w:r>
-      <w:r>
-        <w:rPr>
-          <w:noProof/>
-        </w:rPr>
-        <w:fldChar w:fldCharType="end"/>
-      </w:r>
+      <w:fldSimple w:instr=" STYLEREF 1 \s ">
+        <w:r>
+          <w:rPr>
+            <w:noProof/>
+          </w:rPr>
+          <w:t>7</w:t>
+        </w:r>
+      </w:fldSimple>
       <w:r>
         <w:t>.1 “Captura de pantalla de prueba 1-2-3 caso de uso N°5.6”</w:t>
       </w:r>
@@ -15097,51 +14648,25 @@
       <w:r>
         <w:t xml:space="preserve">Tabla </w:t>
       </w:r>
-      <w:r>
-        <w:fldChar w:fldCharType="begin"/>
-      </w:r>
-      <w:r>
-        <w:instrText xml:space="preserve"> STYLEREF 1 \s </w:instrText>
-      </w:r>
-      <w:r>
-        <w:fldChar w:fldCharType="separate"/>
-      </w:r>
-      <w:r>
-        <w:rPr>
-          <w:noProof/>
-        </w:rPr>
-        <w:t>7</w:t>
-      </w:r>
-      <w:r>
-        <w:rPr>
-          <w:noProof/>
-        </w:rPr>
-        <w:fldChar w:fldCharType="end"/>
-      </w:r>
+      <w:fldSimple w:instr=" STYLEREF 1 \s ">
+        <w:r>
+          <w:rPr>
+            <w:noProof/>
+          </w:rPr>
+          <w:t>7</w:t>
+        </w:r>
+      </w:fldSimple>
       <w:r>
         <w:t>.</w:t>
       </w:r>
-      <w:r>
-        <w:fldChar w:fldCharType="begin"/>
-      </w:r>
-      <w:r>
-        <w:instrText xml:space="preserve"> SEQ Tabla \* ARABIC \s 1 </w:instrText>
-      </w:r>
-      <w:r>
-        <w:fldChar w:fldCharType="separate"/>
-      </w:r>
-      <w:r>
-        <w:rPr>
-          <w:noProof/>
-        </w:rPr>
-        <w:t>2</w:t>
-      </w:r>
-      <w:r>
-        <w:rPr>
-          <w:noProof/>
-        </w:rPr>
-        <w:fldChar w:fldCharType="end"/>
-      </w:r>
+      <w:fldSimple w:instr=" SEQ Tabla \* ARABIC \s 1 ">
+        <w:r>
+          <w:rPr>
+            <w:noProof/>
+          </w:rPr>
+          <w:t>2</w:t>
+        </w:r>
+      </w:fldSimple>
       <w:r>
         <w:t xml:space="preserve"> </w:t>
       </w:r>
@@ -15254,13 +14779,7 @@
         </w:numPr>
       </w:pPr>
       <w:r>
-        <w:t xml:space="preserve">Verificar </w:t>
-      </w:r>
-      <w:r>
-        <w:t>la existencia del botón “Informe Diario” en informe de asistencia</w:t>
-      </w:r>
-      <w:r>
-        <w:t xml:space="preserve"> </w:t>
+        <w:t xml:space="preserve">Verificar la existencia del botón “Informe Diario” en informe de asistencia </w:t>
       </w:r>
     </w:p>
     <w:p/>
@@ -15273,10 +14792,7 @@
         </w:numPr>
       </w:pPr>
       <w:r>
-        <w:t xml:space="preserve">Verificar la correcta </w:t>
-      </w:r>
-      <w:r>
-        <w:t>carga del informe diario con los campos correspondientes</w:t>
+        <w:t>Verificar la correcta carga del informe diario con los campos correspondientes</w:t>
       </w:r>
     </w:p>
     <w:p>
@@ -15333,25 +14849,7 @@
         </w:numPr>
       </w:pPr>
       <w:r>
-        <w:t xml:space="preserve">Al presionar el botón para </w:t>
-      </w:r>
-      <w:r>
-        <w:t>informe diario</w:t>
-      </w:r>
-      <w:r>
-        <w:t xml:space="preserve"> permite </w:t>
-      </w:r>
-      <w:r>
-        <w:t>mostrar</w:t>
-      </w:r>
-      <w:r>
-        <w:t xml:space="preserve"> de manera correcta la información necesaria y filtrada</w:t>
-      </w:r>
-      <w:r>
-        <w:t xml:space="preserve"> según el día correspondiente</w:t>
-      </w:r>
-      <w:r>
-        <w:t>.</w:t>
+        <w:t>Al presionar el botón para informe diario permite mostrar de manera correcta la información necesaria y filtrada según el día correspondiente.</w:t>
       </w:r>
     </w:p>
     <w:p>
@@ -15391,10 +14889,7 @@
         </w:numPr>
       </w:pPr>
       <w:r>
-        <w:t>E</w:t>
-      </w:r>
-      <w:r>
-        <w:t>l botón Informe Diario existe y es posible interactuar con el de manera correcta</w:t>
+        <w:t>El botón Informe Diario existe y es posible interactuar con el de manera correcta</w:t>
       </w:r>
     </w:p>
     <w:p>
@@ -15412,19 +14907,7 @@
       </w:pPr>
       <w:r>
         <w:lastRenderedPageBreak/>
-        <w:t xml:space="preserve">El botón permite </w:t>
-      </w:r>
-      <w:r>
-        <w:t xml:space="preserve">informe diario al ser presionado carga </w:t>
-      </w:r>
-      <w:r>
-        <w:t xml:space="preserve">de manera correcta </w:t>
-      </w:r>
-      <w:r>
-        <w:t>el informe diario dependiendo el día</w:t>
-      </w:r>
-      <w:r>
-        <w:t>.</w:t>
+        <w:t>El botón permite informe diario al ser presionado carga de manera correcta el informe diario dependiendo el día.</w:t>
       </w:r>
     </w:p>
     <w:p>
@@ -15451,35 +14934,16 @@
       <w:r>
         <w:t xml:space="preserve">Figura </w:t>
       </w:r>
-      <w:r>
-        <w:fldChar w:fldCharType="begin"/>
-      </w:r>
-      <w:r>
-        <w:instrText xml:space="preserve"> STYLEREF 1 \s </w:instrText>
-      </w:r>
-      <w:r>
-        <w:fldChar w:fldCharType="separate"/>
-      </w:r>
-      <w:r>
-        <w:rPr>
-          <w:noProof/>
-        </w:rPr>
-        <w:t>7</w:t>
-      </w:r>
-      <w:r>
-        <w:rPr>
-          <w:noProof/>
-        </w:rPr>
-        <w:fldChar w:fldCharType="end"/>
-      </w:r>
-      <w:r>
-        <w:t>.</w:t>
-      </w:r>
-      <w:r>
-        <w:t>2</w:t>
-      </w:r>
-      <w:r>
-        <w:t xml:space="preserve"> “Captura de pantalla de prueba 1-2-3 caso de uso N°5.6”</w:t>
+      <w:fldSimple w:instr=" STYLEREF 1 \s ">
+        <w:r>
+          <w:rPr>
+            <w:noProof/>
+          </w:rPr>
+          <w:t>7</w:t>
+        </w:r>
+      </w:fldSimple>
+      <w:r>
+        <w:t>.2 “Captura de pantalla de prueba 1-2-3 caso de uso N°5.6”</w:t>
       </w:r>
       <w:bookmarkEnd w:id="202"/>
       <w:bookmarkEnd w:id="203"/>
@@ -15598,51 +15062,25 @@
       <w:r>
         <w:t xml:space="preserve">Tabla </w:t>
       </w:r>
-      <w:r>
-        <w:fldChar w:fldCharType="begin"/>
-      </w:r>
-      <w:r>
-        <w:instrText xml:space="preserve"> STYLEREF 1 \s </w:instrText>
-      </w:r>
-      <w:r>
-        <w:fldChar w:fldCharType="separate"/>
-      </w:r>
-      <w:r>
-        <w:rPr>
-          <w:noProof/>
-        </w:rPr>
-        <w:t>7</w:t>
-      </w:r>
-      <w:r>
-        <w:rPr>
-          <w:noProof/>
-        </w:rPr>
-        <w:fldChar w:fldCharType="end"/>
-      </w:r>
+      <w:fldSimple w:instr=" STYLEREF 1 \s ">
+        <w:r>
+          <w:rPr>
+            <w:noProof/>
+          </w:rPr>
+          <w:t>7</w:t>
+        </w:r>
+      </w:fldSimple>
       <w:r>
         <w:t>.</w:t>
       </w:r>
-      <w:r>
-        <w:fldChar w:fldCharType="begin"/>
-      </w:r>
-      <w:r>
-        <w:instrText xml:space="preserve"> SEQ Tabla \* ARABIC \s 1 </w:instrText>
-      </w:r>
-      <w:r>
-        <w:fldChar w:fldCharType="separate"/>
-      </w:r>
-      <w:r>
-        <w:rPr>
-          <w:noProof/>
-        </w:rPr>
-        <w:t>3</w:t>
-      </w:r>
-      <w:r>
-        <w:rPr>
-          <w:noProof/>
-        </w:rPr>
-        <w:fldChar w:fldCharType="end"/>
-      </w:r>
+      <w:fldSimple w:instr=" SEQ Tabla \* ARABIC \s 1 ">
+        <w:r>
+          <w:rPr>
+            <w:noProof/>
+          </w:rPr>
+          <w:t>3</w:t>
+        </w:r>
+      </w:fldSimple>
       <w:r>
         <w:t xml:space="preserve"> </w:t>
       </w:r>
@@ -15740,10 +15178,7 @@
       </w:pPr>
       <w:r>
         <w:lastRenderedPageBreak/>
-        <w:t xml:space="preserve">Verificar la correcta carga de todas las opciones de la pestaña </w:t>
-      </w:r>
-      <w:r>
-        <w:t>permisos</w:t>
+        <w:t>Verificar la correcta carga de todas las opciones de la pestaña permisos</w:t>
       </w:r>
     </w:p>
     <w:p>
@@ -15760,19 +15195,7 @@
         </w:numPr>
       </w:pPr>
       <w:r>
-        <w:t>Verificar la existencia del botón “</w:t>
-      </w:r>
-      <w:r>
-        <w:t>Imprimir</w:t>
-      </w:r>
-      <w:r>
-        <w:t>”</w:t>
-      </w:r>
-      <w:r>
-        <w:t xml:space="preserve"> y casillas de selección de permisos </w:t>
-      </w:r>
-      <w:r>
-        <w:t xml:space="preserve"> </w:t>
+        <w:t xml:space="preserve">Verificar la existencia del botón “Imprimir” y casillas de selección de permisos  </w:t>
       </w:r>
     </w:p>
     <w:p>
@@ -15789,10 +15212,7 @@
         </w:numPr>
       </w:pPr>
       <w:r>
-        <w:t xml:space="preserve">Verificar la </w:t>
-      </w:r>
-      <w:r>
-        <w:t>correcta conversión y posible impresión de permiso/s seleccionado</w:t>
+        <w:t>Verificar la correcta conversión y posible impresión de permiso/s seleccionado</w:t>
       </w:r>
     </w:p>
     <w:p>
@@ -15815,13 +15235,7 @@
         </w:numPr>
       </w:pPr>
       <w:r>
-        <w:t>El enlace o pestaña “</w:t>
-      </w:r>
-      <w:r>
-        <w:t>Permisos</w:t>
-      </w:r>
-      <w:r>
-        <w:t>” carga correctamente con todas las opciones correspondientes</w:t>
+        <w:t>El enlace o pestaña “Permisos” carga correctamente con todas las opciones correspondientes</w:t>
       </w:r>
     </w:p>
     <w:p>
@@ -15967,41 +15381,16 @@
       <w:r>
         <w:t xml:space="preserve">Figura </w:t>
       </w:r>
-      <w:r>
-        <w:fldChar w:fldCharType="begin"/>
-      </w:r>
-      <w:r>
-        <w:instrText xml:space="preserve"> STYLEREF 1 \s </w:instrText>
-      </w:r>
-      <w:r>
-        <w:fldChar w:fldCharType="separate"/>
-      </w:r>
-      <w:r>
-        <w:rPr>
-          <w:noProof/>
-        </w:rPr>
-        <w:t>7</w:t>
-      </w:r>
-      <w:r>
-        <w:rPr>
-          <w:noProof/>
-        </w:rPr>
-        <w:fldChar w:fldCharType="end"/>
-      </w:r>
-      <w:r>
-        <w:t>.</w:t>
-      </w:r>
-      <w:r>
-        <w:t>3</w:t>
-      </w:r>
-      <w:r>
-        <w:t xml:space="preserve"> “Captura de pantalla de prueba 1-2-3 caso de uso N°</w:t>
-      </w:r>
-      <w:r>
-        <w:t>6.7</w:t>
-      </w:r>
-      <w:r>
-        <w:t>”</w:t>
+      <w:fldSimple w:instr=" STYLEREF 1 \s ">
+        <w:r>
+          <w:rPr>
+            <w:noProof/>
+          </w:rPr>
+          <w:t>7</w:t>
+        </w:r>
+      </w:fldSimple>
+      <w:r>
+        <w:t>.3 “Captura de pantalla de prueba 1-2-3 caso de uso N°6.7”</w:t>
       </w:r>
       <w:bookmarkEnd w:id="207"/>
       <w:bookmarkEnd w:id="208"/>
@@ -16118,51 +15507,25 @@
       <w:r>
         <w:t xml:space="preserve">Tabla </w:t>
       </w:r>
-      <w:r>
-        <w:fldChar w:fldCharType="begin"/>
-      </w:r>
-      <w:r>
-        <w:instrText xml:space="preserve"> STYLEREF 1 \s </w:instrText>
-      </w:r>
-      <w:r>
-        <w:fldChar w:fldCharType="separate"/>
-      </w:r>
-      <w:r>
-        <w:rPr>
-          <w:noProof/>
-        </w:rPr>
-        <w:t>7</w:t>
-      </w:r>
-      <w:r>
-        <w:rPr>
-          <w:noProof/>
-        </w:rPr>
-        <w:fldChar w:fldCharType="end"/>
-      </w:r>
+      <w:fldSimple w:instr=" STYLEREF 1 \s ">
+        <w:r>
+          <w:rPr>
+            <w:noProof/>
+          </w:rPr>
+          <w:t>7</w:t>
+        </w:r>
+      </w:fldSimple>
       <w:r>
         <w:t>.</w:t>
       </w:r>
-      <w:r>
-        <w:fldChar w:fldCharType="begin"/>
-      </w:r>
-      <w:r>
-        <w:instrText xml:space="preserve"> SEQ Tabla \* ARABIC \s 1 </w:instrText>
-      </w:r>
-      <w:r>
-        <w:fldChar w:fldCharType="separate"/>
-      </w:r>
-      <w:r>
-        <w:rPr>
-          <w:noProof/>
-        </w:rPr>
-        <w:t>4</w:t>
-      </w:r>
-      <w:r>
-        <w:rPr>
-          <w:noProof/>
-        </w:rPr>
-        <w:fldChar w:fldCharType="end"/>
-      </w:r>
+      <w:fldSimple w:instr=" SEQ Tabla \* ARABIC \s 1 ">
+        <w:r>
+          <w:rPr>
+            <w:noProof/>
+          </w:rPr>
+          <w:t>4</w:t>
+        </w:r>
+      </w:fldSimple>
       <w:r>
         <w:t xml:space="preserve"> </w:t>
       </w:r>
@@ -16277,13 +15640,7 @@
         </w:numPr>
       </w:pPr>
       <w:r>
-        <w:t>Verificar la existencia del botón “</w:t>
-      </w:r>
-      <w:r>
-        <w:t>eliminar</w:t>
-      </w:r>
-      <w:r>
-        <w:t xml:space="preserve">” y casillas de selección de permisos  </w:t>
+        <w:t xml:space="preserve">Verificar la existencia del botón “eliminar” y casillas de selección de permisos  </w:t>
       </w:r>
     </w:p>
     <w:p>
@@ -16300,19 +15657,7 @@
         </w:numPr>
       </w:pPr>
       <w:r>
-        <w:t xml:space="preserve">Verificar la correcta </w:t>
-      </w:r>
-      <w:r>
-        <w:t xml:space="preserve">eliminación </w:t>
-      </w:r>
-      <w:r>
-        <w:t>de</w:t>
-      </w:r>
-      <w:r>
-        <w:t>l</w:t>
-      </w:r>
-      <w:r>
-        <w:t xml:space="preserve"> permiso/s seleccionado</w:t>
+        <w:t>Verificar la correcta eliminación del permiso/s seleccionado</w:t>
       </w:r>
     </w:p>
     <w:p>
@@ -16352,13 +15697,7 @@
         </w:numPr>
       </w:pPr>
       <w:r>
-        <w:t xml:space="preserve">El botón </w:t>
-      </w:r>
-      <w:r>
-        <w:t>para eliminar el permiso este presente en acciones</w:t>
-      </w:r>
-      <w:r>
-        <w:t xml:space="preserve"> </w:t>
+        <w:t xml:space="preserve">El botón para eliminar el permiso este presente en acciones </w:t>
       </w:r>
     </w:p>
     <w:p>
@@ -16375,13 +15714,7 @@
         </w:numPr>
       </w:pPr>
       <w:r>
-        <w:t>Al seleccionar un permiso o permisos el sistema</w:t>
-      </w:r>
-      <w:r>
-        <w:t xml:space="preserve"> permite eliminarlo de manera correcta del sistema</w:t>
-      </w:r>
-      <w:r>
-        <w:t>.</w:t>
+        <w:t>Al seleccionar un permiso o permisos el sistema permite eliminarlo de manera correcta del sistema.</w:t>
       </w:r>
     </w:p>
     <w:p>
@@ -16421,10 +15754,7 @@
         </w:numPr>
       </w:pPr>
       <w:r>
-        <w:t xml:space="preserve">El botón </w:t>
-      </w:r>
-      <w:r>
-        <w:t>para eliminar un permiso carga y está presente de manera correcta para la posible eliminación de este.</w:t>
+        <w:t>El botón para eliminar un permiso carga y está presente de manera correcta para la posible eliminación de este.</w:t>
       </w:r>
     </w:p>
     <w:p>
@@ -16441,10 +15771,7 @@
         </w:numPr>
       </w:pPr>
       <w:r>
-        <w:t>Al seleccionar un permiso este permite eliminarlo preguntando si está seguro de este, donde es eliminado de manera correcta del sistema</w:t>
-      </w:r>
-      <w:r>
-        <w:t>.</w:t>
+        <w:t>Al seleccionar un permiso este permite eliminarlo preguntando si está seguro de este, donde es eliminado de manera correcta del sistema.</w:t>
       </w:r>
     </w:p>
     <w:p>
@@ -16496,41 +15823,16 @@
       <w:r>
         <w:t xml:space="preserve">Figura </w:t>
       </w:r>
-      <w:r>
-        <w:fldChar w:fldCharType="begin"/>
-      </w:r>
-      <w:r>
-        <w:instrText xml:space="preserve"> STYLEREF 1 \s </w:instrText>
-      </w:r>
-      <w:r>
-        <w:fldChar w:fldCharType="separate"/>
-      </w:r>
-      <w:r>
-        <w:rPr>
-          <w:noProof/>
-        </w:rPr>
-        <w:t>7</w:t>
-      </w:r>
-      <w:r>
-        <w:rPr>
-          <w:noProof/>
-        </w:rPr>
-        <w:fldChar w:fldCharType="end"/>
-      </w:r>
-      <w:r>
-        <w:t>.</w:t>
-      </w:r>
-      <w:r>
-        <w:t>4</w:t>
-      </w:r>
-      <w:r>
-        <w:t xml:space="preserve"> “Captura de pantalla de prueba 1-2-3 caso de uso N°6.</w:t>
-      </w:r>
-      <w:r>
-        <w:t>8</w:t>
-      </w:r>
-      <w:r>
-        <w:t>”</w:t>
+      <w:fldSimple w:instr=" STYLEREF 1 \s ">
+        <w:r>
+          <w:rPr>
+            <w:noProof/>
+          </w:rPr>
+          <w:t>7</w:t>
+        </w:r>
+      </w:fldSimple>
+      <w:r>
+        <w:t>.4 “Captura de pantalla de prueba 1-2-3 caso de uso N°6.8”</w:t>
       </w:r>
       <w:bookmarkEnd w:id="212"/>
       <w:bookmarkEnd w:id="213"/>
@@ -16694,51 +15996,25 @@
       <w:r>
         <w:t xml:space="preserve">Tabla </w:t>
       </w:r>
-      <w:r>
-        <w:fldChar w:fldCharType="begin"/>
-      </w:r>
-      <w:r>
-        <w:instrText xml:space="preserve"> STYLEREF 1 \s </w:instrText>
-      </w:r>
-      <w:r>
-        <w:fldChar w:fldCharType="separate"/>
-      </w:r>
-      <w:r>
-        <w:rPr>
-          <w:noProof/>
-        </w:rPr>
-        <w:t>8</w:t>
-      </w:r>
-      <w:r>
-        <w:rPr>
-          <w:noProof/>
-        </w:rPr>
-        <w:fldChar w:fldCharType="end"/>
-      </w:r>
+      <w:fldSimple w:instr=" STYLEREF 1 \s ">
+        <w:r>
+          <w:rPr>
+            <w:noProof/>
+          </w:rPr>
+          <w:t>8</w:t>
+        </w:r>
+      </w:fldSimple>
       <w:r>
         <w:t>.</w:t>
       </w:r>
-      <w:r>
-        <w:fldChar w:fldCharType="begin"/>
-      </w:r>
-      <w:r>
-        <w:instrText xml:space="preserve"> SEQ Tabla \* ARABIC \s 1 </w:instrText>
-      </w:r>
-      <w:r>
-        <w:fldChar w:fldCharType="separate"/>
-      </w:r>
-      <w:r>
-        <w:rPr>
-          <w:noProof/>
-        </w:rPr>
-        <w:t>1</w:t>
-      </w:r>
-      <w:r>
-        <w:rPr>
-          <w:noProof/>
-        </w:rPr>
-        <w:fldChar w:fldCharType="end"/>
-      </w:r>
+      <w:fldSimple w:instr=" SEQ Tabla \* ARABIC \s 1 ">
+        <w:r>
+          <w:rPr>
+            <w:noProof/>
+          </w:rPr>
+          <w:t>1</w:t>
+        </w:r>
+      </w:fldSimple>
       <w:r>
         <w:t xml:space="preserve"> Sprint Backlog Review</w:t>
       </w:r>
@@ -16871,51 +16147,25 @@
       <w:r>
         <w:t xml:space="preserve">Tabla </w:t>
       </w:r>
-      <w:r>
-        <w:fldChar w:fldCharType="begin"/>
-      </w:r>
-      <w:r>
-        <w:instrText xml:space="preserve"> STYLEREF 1 \s </w:instrText>
-      </w:r>
-      <w:r>
-        <w:fldChar w:fldCharType="separate"/>
-      </w:r>
-      <w:r>
-        <w:rPr>
-          <w:noProof/>
-        </w:rPr>
-        <w:t>8</w:t>
-      </w:r>
-      <w:r>
-        <w:rPr>
-          <w:noProof/>
-        </w:rPr>
-        <w:fldChar w:fldCharType="end"/>
-      </w:r>
+      <w:fldSimple w:instr=" STYLEREF 1 \s ">
+        <w:r>
+          <w:rPr>
+            <w:noProof/>
+          </w:rPr>
+          <w:t>8</w:t>
+        </w:r>
+      </w:fldSimple>
       <w:r>
         <w:t>.</w:t>
       </w:r>
-      <w:r>
-        <w:fldChar w:fldCharType="begin"/>
-      </w:r>
-      <w:r>
-        <w:instrText xml:space="preserve"> SEQ Tabla \* ARABIC \s 1 </w:instrText>
-      </w:r>
-      <w:r>
-        <w:fldChar w:fldCharType="separate"/>
-      </w:r>
-      <w:r>
-        <w:rPr>
-          <w:noProof/>
-        </w:rPr>
-        <w:t>2</w:t>
-      </w:r>
-      <w:r>
-        <w:rPr>
-          <w:noProof/>
-        </w:rPr>
-        <w:fldChar w:fldCharType="end"/>
-      </w:r>
+      <w:fldSimple w:instr=" SEQ Tabla \* ARABIC \s 1 ">
+        <w:r>
+          <w:rPr>
+            <w:noProof/>
+          </w:rPr>
+          <w:t>2</w:t>
+        </w:r>
+      </w:fldSimple>
       <w:r>
         <w:t xml:space="preserve"> Tabla de esfuerzo</w:t>
       </w:r>
@@ -17121,51 +16371,25 @@
       <w:r>
         <w:t xml:space="preserve">Figura </w:t>
       </w:r>
-      <w:r>
-        <w:fldChar w:fldCharType="begin"/>
-      </w:r>
-      <w:r>
-        <w:instrText xml:space="preserve"> STYLEREF 1 \s </w:instrText>
-      </w:r>
-      <w:r>
-        <w:fldChar w:fldCharType="separate"/>
-      </w:r>
-      <w:r>
-        <w:rPr>
-          <w:noProof/>
-        </w:rPr>
-        <w:t>8</w:t>
-      </w:r>
-      <w:r>
-        <w:rPr>
-          <w:noProof/>
-        </w:rPr>
-        <w:fldChar w:fldCharType="end"/>
-      </w:r>
+      <w:fldSimple w:instr=" STYLEREF 1 \s ">
+        <w:r>
+          <w:rPr>
+            <w:noProof/>
+          </w:rPr>
+          <w:t>8</w:t>
+        </w:r>
+      </w:fldSimple>
       <w:r>
         <w:t>.</w:t>
       </w:r>
-      <w:r>
-        <w:fldChar w:fldCharType="begin"/>
-      </w:r>
-      <w:r>
-        <w:instrText xml:space="preserve"> SEQ Figura \* ARABIC \s 1 </w:instrText>
-      </w:r>
-      <w:r>
-        <w:fldChar w:fldCharType="separate"/>
-      </w:r>
-      <w:r>
-        <w:rPr>
-          <w:noProof/>
-        </w:rPr>
-        <w:t>1</w:t>
-      </w:r>
-      <w:r>
-        <w:rPr>
-          <w:noProof/>
-        </w:rPr>
-        <w:fldChar w:fldCharType="end"/>
-      </w:r>
+      <w:fldSimple w:instr=" SEQ Figura \* ARABIC \s 1 ">
+        <w:r>
+          <w:rPr>
+            <w:noProof/>
+          </w:rPr>
+          <w:t>1</w:t>
+        </w:r>
+      </w:fldSimple>
       <w:r>
         <w:t xml:space="preserve"> Gr</w:t>
       </w:r>
@@ -17341,51 +16565,25 @@
         <w:lastRenderedPageBreak/>
         <w:t xml:space="preserve">Figura </w:t>
       </w:r>
-      <w:r>
-        <w:fldChar w:fldCharType="begin"/>
-      </w:r>
-      <w:r>
-        <w:instrText xml:space="preserve"> STYLEREF 1 \s </w:instrText>
-      </w:r>
-      <w:r>
-        <w:fldChar w:fldCharType="separate"/>
-      </w:r>
-      <w:r>
-        <w:rPr>
-          <w:noProof/>
-        </w:rPr>
-        <w:t>8</w:t>
-      </w:r>
-      <w:r>
-        <w:rPr>
-          <w:noProof/>
-        </w:rPr>
-        <w:fldChar w:fldCharType="end"/>
-      </w:r>
+      <w:fldSimple w:instr=" STYLEREF 1 \s ">
+        <w:r>
+          <w:rPr>
+            <w:noProof/>
+          </w:rPr>
+          <w:t>8</w:t>
+        </w:r>
+      </w:fldSimple>
       <w:r>
         <w:t>.</w:t>
       </w:r>
-      <w:r>
-        <w:fldChar w:fldCharType="begin"/>
-      </w:r>
-      <w:r>
-        <w:instrText xml:space="preserve"> SEQ Figura \* ARABIC \s 1 </w:instrText>
-      </w:r>
-      <w:r>
-        <w:fldChar w:fldCharType="separate"/>
-      </w:r>
-      <w:r>
-        <w:rPr>
-          <w:noProof/>
-        </w:rPr>
-        <w:t>2</w:t>
-      </w:r>
-      <w:r>
-        <w:rPr>
-          <w:noProof/>
-        </w:rPr>
-        <w:fldChar w:fldCharType="end"/>
-      </w:r>
+      <w:fldSimple w:instr=" SEQ Figura \* ARABIC \s 1 ">
+        <w:r>
+          <w:rPr>
+            <w:noProof/>
+          </w:rPr>
+          <w:t>2</w:t>
+        </w:r>
+      </w:fldSimple>
       <w:r>
         <w:t xml:space="preserve"> </w:t>
       </w:r>
@@ -17560,51 +16758,25 @@
         <w:lastRenderedPageBreak/>
         <w:t xml:space="preserve">Figura </w:t>
       </w:r>
-      <w:r>
-        <w:fldChar w:fldCharType="begin"/>
-      </w:r>
-      <w:r>
-        <w:instrText xml:space="preserve"> STYLEREF 1 \s </w:instrText>
-      </w:r>
-      <w:r>
-        <w:fldChar w:fldCharType="separate"/>
-      </w:r>
-      <w:r>
-        <w:rPr>
-          <w:noProof/>
-        </w:rPr>
-        <w:t>8</w:t>
-      </w:r>
-      <w:r>
-        <w:rPr>
-          <w:noProof/>
-        </w:rPr>
-        <w:fldChar w:fldCharType="end"/>
-      </w:r>
+      <w:fldSimple w:instr=" STYLEREF 1 \s ">
+        <w:r>
+          <w:rPr>
+            <w:noProof/>
+          </w:rPr>
+          <w:t>8</w:t>
+        </w:r>
+      </w:fldSimple>
       <w:r>
         <w:t>.</w:t>
       </w:r>
-      <w:r>
-        <w:fldChar w:fldCharType="begin"/>
-      </w:r>
-      <w:r>
-        <w:instrText xml:space="preserve"> SEQ Figura \* ARABIC \s 1 </w:instrText>
-      </w:r>
-      <w:r>
-        <w:fldChar w:fldCharType="separate"/>
-      </w:r>
-      <w:r>
-        <w:rPr>
-          <w:noProof/>
-        </w:rPr>
-        <w:t>3</w:t>
-      </w:r>
-      <w:r>
-        <w:rPr>
-          <w:noProof/>
-        </w:rPr>
-        <w:fldChar w:fldCharType="end"/>
-      </w:r>
+      <w:fldSimple w:instr=" SEQ Figura \* ARABIC \s 1 ">
+        <w:r>
+          <w:rPr>
+            <w:noProof/>
+          </w:rPr>
+          <w:t>3</w:t>
+        </w:r>
+      </w:fldSimple>
       <w:r>
         <w:t xml:space="preserve"> Velocidad del equipo</w:t>
       </w:r>
@@ -17754,51 +16926,25 @@
         <w:lastRenderedPageBreak/>
         <w:t xml:space="preserve">Tabla </w:t>
       </w:r>
-      <w:r>
-        <w:fldChar w:fldCharType="begin"/>
-      </w:r>
-      <w:r>
-        <w:instrText xml:space="preserve"> STYLEREF 1 \s </w:instrText>
-      </w:r>
-      <w:r>
-        <w:fldChar w:fldCharType="separate"/>
-      </w:r>
-      <w:r>
-        <w:rPr>
-          <w:noProof/>
-        </w:rPr>
-        <w:t>8</w:t>
-      </w:r>
-      <w:r>
-        <w:rPr>
-          <w:noProof/>
-        </w:rPr>
-        <w:fldChar w:fldCharType="end"/>
-      </w:r>
+      <w:fldSimple w:instr=" STYLEREF 1 \s ">
+        <w:r>
+          <w:rPr>
+            <w:noProof/>
+          </w:rPr>
+          <w:t>8</w:t>
+        </w:r>
+      </w:fldSimple>
       <w:r>
         <w:t>.</w:t>
       </w:r>
-      <w:r>
-        <w:fldChar w:fldCharType="begin"/>
-      </w:r>
-      <w:r>
-        <w:instrText xml:space="preserve"> SEQ Tabla \* ARABIC \s 1 </w:instrText>
-      </w:r>
-      <w:r>
-        <w:fldChar w:fldCharType="separate"/>
-      </w:r>
-      <w:r>
-        <w:rPr>
-          <w:noProof/>
-        </w:rPr>
-        <w:t>3</w:t>
-      </w:r>
-      <w:r>
-        <w:rPr>
-          <w:noProof/>
-        </w:rPr>
-        <w:fldChar w:fldCharType="end"/>
-      </w:r>
+      <w:fldSimple w:instr=" SEQ Tabla \* ARABIC \s 1 ">
+        <w:r>
+          <w:rPr>
+            <w:noProof/>
+          </w:rPr>
+          <w:t>3</w:t>
+        </w:r>
+      </w:fldSimple>
       <w:r>
         <w:t xml:space="preserve"> “Plan de mejora”</w:t>
       </w:r>
@@ -17815,6 +16961,9 @@
         <w:pStyle w:val="Sinespaciado"/>
       </w:pPr>
       <w:r>
+        <w:rPr>
+          <w:noProof/>
+        </w:rPr>
         <w:drawing>
           <wp:inline distT="0" distB="0" distL="0" distR="0" wp14:anchorId="60E70D59" wp14:editId="348FE184">
             <wp:extent cx="5971540" cy="2983230"/>
@@ -18046,7 +17195,7 @@
           <v:shape id="_x0000_i1025" type="#_x0000_t75" style="width:79.5pt;height:50.1pt" o:ole="">
             <v:imagedata r:id="rId40" o:title=""/>
           </v:shape>
-          <o:OLEObject Type="Embed" ProgID="Package" ShapeID="_x0000_i1025" DrawAspect="Icon" ObjectID="_1823152799" r:id="rId41"/>
+          <o:OLEObject Type="Embed" ProgID="Package" ShapeID="_x0000_i1025" DrawAspect="Icon" ObjectID="_1823176001" r:id="rId41"/>
         </w:object>
       </w:r>
       <w:r>
@@ -18054,7 +17203,7 @@
           <v:shape id="_x0000_i1026" type="#_x0000_t75" style="width:79.5pt;height:50.1pt" o:ole="">
             <v:imagedata r:id="rId42" o:title=""/>
           </v:shape>
-          <o:OLEObject Type="Embed" ProgID="Package" ShapeID="_x0000_i1026" DrawAspect="Icon" ObjectID="_1823152800" r:id="rId43"/>
+          <o:OLEObject Type="Embed" ProgID="Package" ShapeID="_x0000_i1026" DrawAspect="Icon" ObjectID="_1823176002" r:id="rId43"/>
         </w:object>
       </w:r>
     </w:p>
@@ -18084,7 +17233,7 @@
           <v:shape id="_x0000_i1027" type="#_x0000_t75" style="width:79.5pt;height:50.1pt" o:ole="">
             <v:imagedata r:id="rId44" o:title=""/>
           </v:shape>
-          <o:OLEObject Type="Embed" ProgID="Package" ShapeID="_x0000_i1027" DrawAspect="Icon" ObjectID="_1823152801" r:id="rId45"/>
+          <o:OLEObject Type="Embed" ProgID="Package" ShapeID="_x0000_i1027" DrawAspect="Icon" ObjectID="_1823176003" r:id="rId45"/>
         </w:object>
       </w:r>
     </w:p>
@@ -18104,7 +17253,7 @@
           <v:shape id="_x0000_i1028" type="#_x0000_t75" style="width:79.5pt;height:50.1pt" o:ole="">
             <v:imagedata r:id="rId46" o:title=""/>
           </v:shape>
-          <o:OLEObject Type="Embed" ProgID="Package" ShapeID="_x0000_i1028" DrawAspect="Icon" ObjectID="_1823152802" r:id="rId47"/>
+          <o:OLEObject Type="Embed" ProgID="Package" ShapeID="_x0000_i1028" DrawAspect="Icon" ObjectID="_1823176004" r:id="rId47"/>
         </w:object>
       </w:r>
     </w:p>
@@ -18127,7 +17276,7 @@
           <v:shape id="_x0000_i1029" type="#_x0000_t75" style="width:79.5pt;height:50.1pt" o:ole="">
             <v:imagedata r:id="rId48" o:title=""/>
           </v:shape>
-          <o:OLEObject Type="Embed" ProgID="Package" ShapeID="_x0000_i1029" DrawAspect="Icon" ObjectID="_1823152803" r:id="rId49"/>
+          <o:OLEObject Type="Embed" ProgID="Package" ShapeID="_x0000_i1029" DrawAspect="Icon" ObjectID="_1823176005" r:id="rId49"/>
         </w:object>
       </w:r>
     </w:p>
@@ -19203,7 +18352,7 @@
           <v:shape id="_x0000_i1030" type="#_x0000_t75" style="width:79.5pt;height:50.1pt" o:ole="">
             <v:imagedata r:id="rId50" o:title=""/>
           </v:shape>
-          <o:OLEObject Type="Embed" ProgID="Package" ShapeID="_x0000_i1030" DrawAspect="Icon" ObjectID="_1823152804" r:id="rId51"/>
+          <o:OLEObject Type="Embed" ProgID="Package" ShapeID="_x0000_i1030" DrawAspect="Icon" ObjectID="_1823176006" r:id="rId51"/>
         </w:object>
       </w:r>
     </w:p>
@@ -27801,6 +26950,7 @@
   <w:style w:type="character" w:default="1" w:styleId="Fuentedeprrafopredeter">
     <w:name w:val="Default Paragraph Font"/>
     <w:uiPriority w:val="1"/>
+    <w:semiHidden/>
     <w:unhideWhenUsed/>
   </w:style>
   <w:style w:type="table" w:default="1" w:styleId="Tablanormal">
@@ -28838,12 +27988,6 @@
 </file>
 
 <file path=customXml/item1.xml><?xml version="1.0" encoding="utf-8"?>
-<go:gDocsCustomXmlDataStorage xmlns:go="http://customooxmlschemas.google.com/" xmlns:r="http://schemas.openxmlformats.org/officeDocument/2006/relationships" uri="GoogleDocsCustomDataVersion2">
-  <go:docsCustomData xmlns:go="http://customooxmlschemas.google.com/" roundtripDataSignature="AMtx7mgzDLvJQrn/s3t721qKHDOuEhpMiQ==">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</go:docsCustomData>
-</go:gDocsCustomXmlDataStorage>
-</file>
-
-<file path=customXml/item2.xml><?xml version="1.0" encoding="utf-8"?>
 <b:Sources xmlns:b="http://schemas.openxmlformats.org/officeDocument/2006/bibliography" xmlns="http://schemas.openxmlformats.org/officeDocument/2006/bibliography" SelectedStyle="\APASixthEditionOfficeOnline.xsl" StyleName="APA" Version="6">
   <b:Source>
     <b:Tag>Eug25</b:Tag>
@@ -28932,19 +28076,25 @@
 </b:Sources>
 </file>
 
+<file path=customXml/item2.xml><?xml version="1.0" encoding="utf-8"?>
+<go:gDocsCustomXmlDataStorage xmlns:go="http://customooxmlschemas.google.com/" xmlns:r="http://schemas.openxmlformats.org/officeDocument/2006/relationships" uri="GoogleDocsCustomDataVersion2">
+  <go:docsCustomData xmlns:go="http://customooxmlschemas.google.com/" roundtripDataSignature="AMtx7mgzDLvJQrn/s3t721qKHDOuEhpMiQ==">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</go:docsCustomData>
+</go:gDocsCustomXmlDataStorage>
+</file>
+
 <file path=customXml/itemProps1.xml><?xml version="1.0" encoding="utf-8"?>
+<ds:datastoreItem xmlns:ds="http://schemas.openxmlformats.org/officeDocument/2006/customXml" ds:itemID="{D7966003-8400-4354-952A-39E3FBC3C487}">
+  <ds:schemaRefs>
+    <ds:schemaRef ds:uri="http://schemas.openxmlformats.org/officeDocument/2006/bibliography"/>
+  </ds:schemaRefs>
+</ds:datastoreItem>
+</file>
+
+<file path=customXml/itemProps2.xml><?xml version="1.0" encoding="utf-8"?>
 <ds:datastoreItem xmlns:ds="http://schemas.openxmlformats.org/officeDocument/2006/customXml" ds:itemID="{11111111-1234-1234-1234-123412341234}">
   <ds:schemaRefs>
     <ds:schemaRef ds:uri="http://customooxmlschemas.google.com/"/>
     <ds:schemaRef ds:uri="http://schemas.openxmlformats.org/officeDocument/2006/relationships"/>
   </ds:schemaRefs>
 </ds:datastoreItem>
-</file>
-
-<file path=customXml/itemProps2.xml><?xml version="1.0" encoding="utf-8"?>
-<ds:datastoreItem xmlns:ds="http://schemas.openxmlformats.org/officeDocument/2006/customXml" ds:itemID="{D7966003-8400-4354-952A-39E3FBC3C487}">
-  <ds:schemaRefs>
-    <ds:schemaRef ds:uri="http://schemas.openxmlformats.org/officeDocument/2006/bibliography"/>
-  </ds:schemaRefs>
-</ds:datastoreItem>
 </file>
</xml_diff>